<commit_message>
thesis: chapter 2 restructured to 3 sections with explicit links to practice tasks; introduction expanded to 9 tasks; sources list expanded to 63 (40+ books per methodology)
Co-authored-by: clouderefresh-arch <clouderefresh-arch@users.noreply.github.com>
</commit_message>
<xml_diff>
--- a/build/diplom_fast_engineering.docx
+++ b/build/diplom_fast_engineering.docx
@@ -838,7 +838,7 @@
           <w:rFonts w:ascii="Times New Roman" w:hAnsi="Times New Roman" w:cs="Times New Roman" w:eastAsia="Times New Roman"/>
           <w:sz w:val="28"/>
         </w:rPr>
-        <w:t>Глава 2. Анализ организации рекламно-информационной работы ООО „Фаст Инжиниринг“</w:t>
+        <w:t>Глава 2. Анализ организации рекламно-информационной работы ООО „Фаст Инжиниринг“ (выполняется на материалах производственной практики (преддипломной)).</w:t>
       </w:r>
     </w:p>
     <w:p>
@@ -866,7 +866,7 @@
           <w:rFonts w:ascii="Times New Roman" w:hAnsi="Times New Roman" w:cs="Times New Roman" w:eastAsia="Times New Roman"/>
           <w:sz w:val="28"/>
         </w:rPr>
-        <w:t>2.2. Анализ существующей системы рекламно-информационной работы предприятия.</w:t>
+        <w:t>2.2. Анализ организации экономической, маркетинговой и коммерческой деятельности ООО „Фаст Инжиниринг“.</w:t>
       </w:r>
     </w:p>
     <w:p>
@@ -880,7 +880,7 @@
           <w:rFonts w:ascii="Times New Roman" w:hAnsi="Times New Roman" w:cs="Times New Roman" w:eastAsia="Times New Roman"/>
           <w:sz w:val="28"/>
         </w:rPr>
-        <w:t>2.3. Оценка эффективности действующей рекламно-информационной работы и выявление проблем.</w:t>
+        <w:t>2.3. Оценка эффективности рекламно-информационной работы ООО „Фаст Инжиниринг“ и выявление проблем.</w:t>
       </w:r>
     </w:p>
     <w:p>
@@ -2447,7 +2447,7 @@
           <w:rFonts w:ascii="Times New Roman" w:hAnsi="Times New Roman" w:cs="Times New Roman" w:eastAsia="Times New Roman"/>
           <w:sz w:val="28"/>
         </w:rPr>
-        <w:t>ГЛАВА 1. ТЕОРЕТИЧЕСКИЕ ОСНОВЫ РЕКЛАМНО-ИНФОРМАЦИОННОЙ РАБОТЫ КОММЕРЧЕСКОЙ ОРГАНИЗАЦИИ И ОЦЕНКИ ЕЁ ЭФФЕКТИВНОСТИ</w:t>
+        <w:t>1. ТЕОРЕТИЧЕСКИЕ ОСНОВЫ РЕКЛАМНО-ИНФОРМАЦИОННОЙ РАБОТЫ КОММЕРЧЕСКОЙ ОРГАНИЗАЦИИ И ОЦЕНКИ ЕЁ ЭФФЕКТИВНОСТИ</w:t>
       </w:r>
     </w:p>
     <w:p>
@@ -2503,7 +2503,7 @@
           <w:rFonts w:ascii="Times New Roman" w:hAnsi="Times New Roman" w:cs="Times New Roman" w:eastAsia="Times New Roman"/>
           <w:sz w:val="28"/>
         </w:rPr>
-        <w:t>ГЛАВА 2. АНАЛИЗ ОРГАНИЗАЦИИ РЕКЛАМНО-ИНФОРМАЦИОННОЙ РАБОТЫ ООО «ФАСТ ИНЖИНИРИНГ»</w:t>
+        <w:t>2. АНАЛИЗ ОРГАНИЗАЦИИ РЕКЛАМНО-ИНФОРМАЦИОННОЙ РАБОТЫ ООО «ФАСТ ИНЖИНИРИНГ»</w:t>
       </w:r>
     </w:p>
     <w:p>
@@ -2531,7 +2531,7 @@
           <w:rFonts w:ascii="Times New Roman" w:hAnsi="Times New Roman" w:cs="Times New Roman" w:eastAsia="Times New Roman"/>
           <w:sz w:val="28"/>
         </w:rPr>
-        <w:t>2.2. Анализ существующей системы рекламно-информационной работы предприятия</w:t>
+        <w:t>2.2. Анализ организации экономической, маркетинговой и коммерческой деятельности ООО «Фаст Инжиниринг»</w:t>
       </w:r>
     </w:p>
     <w:p>
@@ -2545,7 +2545,7 @@
           <w:rFonts w:ascii="Times New Roman" w:hAnsi="Times New Roman" w:cs="Times New Roman" w:eastAsia="Times New Roman"/>
           <w:sz w:val="28"/>
         </w:rPr>
-        <w:t>2.3. Оценка эффективности действующей рекламно-информационной работы и выявление проблем</w:t>
+        <w:t>2.3. Оценка эффективности рекламно-информационной работы ООО «Фаст Инжиниринг» и выявление проблем</w:t>
       </w:r>
     </w:p>
     <w:p>
@@ -2559,7 +2559,7 @@
           <w:rFonts w:ascii="Times New Roman" w:hAnsi="Times New Roman" w:cs="Times New Roman" w:eastAsia="Times New Roman"/>
           <w:sz w:val="28"/>
         </w:rPr>
-        <w:t>ГЛАВА 3. СОВЕРШЕНСТВОВАНИЕ РЕКЛАМНО-ИНФОРМАЦИОННОЙ РАБОТЫ ООО «ФАСТ ИНЖИНИРИНГ» И ОЦЕНКА ЕЁ ЭФФЕКТИВНОСТИ</w:t>
+        <w:t>3. СОВЕРШЕНСТВОВАНИЕ РЕКЛАМНО-ИНФОРМАЦИОННОЙ РАБОТЫ ООО «ФАСТ ИНЖИНИРИНГ» И ОЦЕНКА ЕЁ ЭФФЕКТИВНОСТИ</w:t>
       </w:r>
     </w:p>
     <w:p>
@@ -2757,7 +2757,7 @@
           <w:rFonts w:ascii="Times New Roman" w:hAnsi="Times New Roman" w:cs="Times New Roman" w:eastAsia="Times New Roman"/>
           <w:sz w:val="28"/>
         </w:rPr>
-        <w:t>Для достижения поставленной цели в работе решаются следующие задачи:</w:t>
+        <w:t>Для достижения поставленной цели в работе, в соответствии со структурой её основной части, решаются следующие задачи:</w:t>
       </w:r>
     </w:p>
     <w:p>
@@ -2771,7 +2771,7 @@
           <w:rFonts w:ascii="Times New Roman" w:hAnsi="Times New Roman" w:cs="Times New Roman" w:eastAsia="Times New Roman"/>
           <w:sz w:val="28"/>
         </w:rPr>
-        <w:t>1) изучить сущность, цели и задачи рекламно-информационной работы коммерческой организации и определить её место в системе коммерческой деятельности предприятия;</w:t>
+        <w:t>1) раскрыть сущность, цели и задачи рекламно-информационной работы коммерческой организации и определить её место в системе коммерческой деятельности предприятия;</w:t>
       </w:r>
     </w:p>
     <w:p>
@@ -2827,7 +2827,7 @@
           <w:rFonts w:ascii="Times New Roman" w:hAnsi="Times New Roman" w:cs="Times New Roman" w:eastAsia="Times New Roman"/>
           <w:sz w:val="28"/>
         </w:rPr>
-        <w:t>5) проанализировать действующую систему рекламно-информационной работы предприятия и выявить её сильные и слабые стороны;</w:t>
+        <w:t>5) проанализировать организацию экономической, маркетинговой и коммерческой деятельности предприятия и его действующую систему рекламно-информационной работы;</w:t>
       </w:r>
     </w:p>
     <w:p>
@@ -2841,7 +2841,7 @@
           <w:rFonts w:ascii="Times New Roman" w:hAnsi="Times New Roman" w:cs="Times New Roman" w:eastAsia="Times New Roman"/>
           <w:sz w:val="28"/>
         </w:rPr>
-        <w:t>6) выполнить оценку эффективности существующей рекламно-информационной работы ООО «Фаст Инжиниринг» и определить ключевые проблемы;</w:t>
+        <w:t>6) выполнить оценку экономической и коммуникативной эффективности действующей рекламно-информационной работы ООО «Фаст Инжиниринг» и сформулировать перечень её ключевых проблем;</w:t>
       </w:r>
     </w:p>
     <w:p>
@@ -2855,7 +2855,35 @@
           <w:rFonts w:ascii="Times New Roman" w:hAnsi="Times New Roman" w:cs="Times New Roman" w:eastAsia="Times New Roman"/>
           <w:sz w:val="28"/>
         </w:rPr>
-        <w:t>7) разработать комплекс мероприятий по совершенствованию рекламно-информационной работы предприятия и оценить их ожидаемую экономическую и коммуникативную эффективность.</w:t>
+        <w:t>7) определить направления совершенствования рекламно-информационной работы предприятия с учётом ограничений микро-масштаба и специфики B2B-сегмента;</w:t>
+      </w:r>
+    </w:p>
+    <w:p>
+      <w:pPr>
+        <w:spacing w:line="360" w:lineRule="auto" w:before="0" w:after="0"/>
+        <w:ind w:firstLine="0" w:left="709"/>
+        <w:jc w:val="both"/>
+      </w:pPr>
+      <w:r>
+        <w:rPr>
+          <w:rFonts w:ascii="Times New Roman" w:hAnsi="Times New Roman" w:cs="Times New Roman" w:eastAsia="Times New Roman"/>
+          <w:sz w:val="28"/>
+        </w:rPr>
+        <w:t>8) разработать план рекламно-информационных мероприятий ООО «Фаст Инжиниринг» на 2026 год;</w:t>
+      </w:r>
+    </w:p>
+    <w:p>
+      <w:pPr>
+        <w:spacing w:line="360" w:lineRule="auto" w:before="0" w:after="0"/>
+        <w:ind w:firstLine="0" w:left="709"/>
+        <w:jc w:val="both"/>
+      </w:pPr>
+      <w:r>
+        <w:rPr>
+          <w:rFonts w:ascii="Times New Roman" w:hAnsi="Times New Roman" w:cs="Times New Roman" w:eastAsia="Times New Roman"/>
+          <w:sz w:val="28"/>
+        </w:rPr>
+        <w:t>9) выполнить расчёт ожидаемой экономической и коммуникативной эффективности предложенных мероприятий и оценить их устойчивость к изменению ключевых параметров.</w:t>
       </w:r>
     </w:p>
     <w:p>
@@ -2869,6 +2897,20 @@
           <w:rFonts w:ascii="Times New Roman" w:hAnsi="Times New Roman" w:cs="Times New Roman" w:eastAsia="Times New Roman"/>
           <w:sz w:val="28"/>
         </w:rPr>
+        <w:t>Эмпирической основой для решения задач 4–6 настоящей дипломной работы послужили материалы, собранные автором в ходе производственной практики (преддипломной), пройденной в ООО «Фаст Инжиниринг» в период с 20 апреля по 16 мая 2026 г. (общий объём 144 часа). Содержание задач индивидуального задания на практику и параграфов второй главы дипломной работы согласовано таким образом, что данные, собранные в ходе выполнения каждой из пяти задач практики, последовательно использованы при подготовке параграфов 2.1–2.3 настоящей работы.</w:t>
+      </w:r>
+    </w:p>
+    <w:p>
+      <w:pPr>
+        <w:spacing w:line="360" w:lineRule="auto" w:before="0" w:after="0"/>
+        <w:ind w:firstLine="709"/>
+        <w:jc w:val="both"/>
+      </w:pPr>
+      <w:r>
+        <w:rPr>
+          <w:rFonts w:ascii="Times New Roman" w:hAnsi="Times New Roman" w:cs="Times New Roman" w:eastAsia="Times New Roman"/>
+          <w:sz w:val="28"/>
+        </w:rPr>
         <w:t>Объектом исследования является ООО «Фаст Инжиниринг» — коммерческая организация г. Москвы, специализирующаяся на разработке, производстве и поставке высокоэффективного промышленного оборудования (насосов, теплообменников, каталитических реакторов, компрессоров, рекуператоров) для нефтегазовой, химической, энергетической и смежных отраслей.</w:t>
       </w:r>
     </w:p>
@@ -3009,7 +3051,7 @@
           <w:rFonts w:ascii="Times New Roman" w:hAnsi="Times New Roman" w:cs="Times New Roman" w:eastAsia="Times New Roman"/>
           <w:sz w:val="28"/>
         </w:rPr>
-        <w:t>Во второй главе представлена организационно-экономическая характеристика ООО «Фаст Инжиниринг», проанализирована действующая система рекламно-информационной работы предприятия и выполнена оценка её эффективности.</w:t>
+        <w:t>Во второй главе на материалах производственной практики (преддипломной) представлена организационно-экономическая характеристика ООО «Фаст Инжиниринг», проанализирована организация экономической, маркетинговой и коммерческой деятельности предприятия с акцентом на действующую систему рекламно-информационной работы и выполнена оценка её эффективности с формулировкой перечня выявленных проблем; в выводах по второй главе зафиксировано соответствие параграфов главы задачам индивидуального задания на практику.</w:t>
       </w:r>
     </w:p>
     <w:p>
@@ -5514,6 +5556,20 @@
     <w:p>
       <w:pPr>
         <w:spacing w:line="360" w:lineRule="auto" w:before="0" w:after="0"/>
+        <w:ind w:firstLine="0"/>
+        <w:jc w:val="both"/>
+      </w:pPr>
+      <w:r>
+        <w:rPr>
+          <w:rFonts w:ascii="Times New Roman" w:hAnsi="Times New Roman" w:cs="Times New Roman" w:eastAsia="Times New Roman"/>
+          <w:sz w:val="28"/>
+        </w:rPr>
+        <w:t>Основанием для подготовки настоящей главы послужили материалы, собранные автором в ходе производственной практики (преддипломной), пройденной в ООО «Фаст Инжиниринг» в период с 20 апреля по 16 мая 2026 г. Соответствие задач индивидуального задания на практику параграфам настоящей главы зафиксировано в начале каждого параграфа и в обобщающем виде приведено в выводах по второй главе.</w:t>
+      </w:r>
+    </w:p>
+    <w:p>
+      <w:pPr>
+        <w:spacing w:line="360" w:lineRule="auto" w:before="0" w:after="0"/>
         <w:ind w:firstLine="709"/>
         <w:jc w:val="both"/>
       </w:pPr>
@@ -5537,7 +5593,7 @@
           <w:rFonts w:ascii="Times New Roman" w:hAnsi="Times New Roman" w:cs="Times New Roman" w:eastAsia="Times New Roman"/>
           <w:sz w:val="28"/>
         </w:rPr>
-        <w:t>Объектом исследования настоящей дипломной работы выступает Общество с ограниченной ответственностью «Фаст Инжиниринг» (далее — ООО «Фаст Инжиниринг», Общество) — российская инжиниринговая организация, специализирующаяся на разработке, изготовлении и внедрении высокоэффективного промышленного оборудования и технологий нового поколения для нефтегазовой, химической, нефтехимической, нефтеперерабатывающей, энергетической, металлургической и смежных отраслей промышленности, а также для транспорта и решения задач экологического характера.</w:t>
+        <w:t>Содержание настоящего параграфа основано на материалах, собранных в ходе выполнения задачи 1 индивидуального задания на производственную практику (преддипломную) — описать организационно-экономическую характеристику предприятия (период 20.04.2026 – 21.04.2026), а также материалов задачи 4 — исследовать и описать формирование ассортимента, оценку качества и маркировку продукции (период 04.05.2026 – 07.05.2026), в части, относящейся к ассортиментному портфелю предприятия как объекту последующей рекламно-информационной работы.</w:t>
       </w:r>
     </w:p>
     <w:p>
@@ -5551,7 +5607,21 @@
           <w:rFonts w:ascii="Times New Roman" w:hAnsi="Times New Roman" w:cs="Times New Roman" w:eastAsia="Times New Roman"/>
           <w:sz w:val="28"/>
         </w:rPr>
-        <w:t>Основные регистрационные сведения о предприятии, по данным Единого государственного реестра юридических лиц, представлены в таблице 2.1.</w:t>
+        <w:t>Объектом исследования выступает Общество с ограниченной ответственностью «Фаст Инжиниринг» (далее — ООО «Фаст Инжиниринг», Общество) — российская инжиниринговая организация, специализирующаяся на разработке, изготовлении и внедрении высокоэффективного промышленного оборудования и технологических решений нового поколения для нефтегазовой, химической, нефтехимической, нефтеперерабатывающей, энергетической, металлургической и смежных отраслей промышленности, а также для транспорта и решения задач экологического характера.</w:t>
+      </w:r>
+    </w:p>
+    <w:p>
+      <w:pPr>
+        <w:spacing w:line="360" w:lineRule="auto" w:before="0" w:after="0"/>
+        <w:ind w:firstLine="709"/>
+        <w:jc w:val="both"/>
+      </w:pPr>
+      <w:r>
+        <w:rPr>
+          <w:rFonts w:ascii="Times New Roman" w:hAnsi="Times New Roman" w:cs="Times New Roman" w:eastAsia="Times New Roman"/>
+          <w:sz w:val="28"/>
+        </w:rPr>
+        <w:t>Основные регистрационные сведения о предприятии, по данным Единого государственного реестра юридических лиц и иных открытых государственных реестров, представлены в таблице 2.1.</w:t>
       </w:r>
     </w:p>
     <w:p>
@@ -6139,7 +6209,7 @@
           <w:rFonts w:ascii="Times New Roman" w:hAnsi="Times New Roman" w:cs="Times New Roman" w:eastAsia="Times New Roman"/>
           <w:sz w:val="28"/>
         </w:rPr>
-        <w:t>ООО «Фаст Инжиниринг» зарегистрировано в Едином государственном реестре юридических лиц 15 января 2001 г. По организационно-правовой форме предприятие является обществом с ограниченной ответственностью, по форме собственности — частной. По данным открытых реестров, размер уставного капитала Общества составляет 250 000 руб.; Общество отнесено к категории микропредприятий и включено в Единый реестр субъектов малого и среднего предпринимательства. Среднесписочная численность работников по данным открытых источников не превышает 10 человек, что является типичным для проектно-инжиниринговых организаций, ориентированных на интеллектуально ёмкую разработку, а не на массовое производство.</w:t>
+        <w:t>ООО «Фаст Инжиниринг» зарегистрировано 15 января 2001 г. По организационно-правовой форме предприятие является обществом с ограниченной ответственностью, по форме собственности — частной. Размер уставного капитала Общества составляет 250 000 руб.; Общество отнесено к категории микропредприятий и включено в Единый реестр субъектов малого и среднего предпринимательства. Среднесписочная численность работников по данным открытых источников не превышает 10 человек, что характерно для проектно-инжиниринговых организаций, ориентированных на интеллектуально ёмкую разработку, а не на массовое производство.</w:t>
       </w:r>
     </w:p>
     <w:p>
@@ -6153,7 +6223,7 @@
           <w:rFonts w:ascii="Times New Roman" w:hAnsi="Times New Roman" w:cs="Times New Roman" w:eastAsia="Times New Roman"/>
           <w:sz w:val="28"/>
         </w:rPr>
-        <w:t>Миссия и стратегические ориентиры предприятия, как они отражены на корпоративном сайте и в публичных материалах руководителя, формулируются следующим образом: разработка, изготовление и внедрение в промышленность инновационных энергосберегающих и экологически чистых технологий и оборудования, превосходящих по технико-экономическим показателям лучшие отечественные и зарубежные аналоги. Принципиальной особенностью предприятия является то, что в основе всех ключевых разработок лежат собственные изобретения, защищённые патентами Российской Федерации.</w:t>
+        <w:t>Миссия и стратегические ориентиры предприятия, как они отражены на корпоративном сайте и в публичных материалах руководителя, заключаются в разработке, изготовлении и внедрении в промышленность инновационных энергосберегающих и экологически чистых технологий и оборудования, превосходящих по технико-экономическим показателям лучшие отечественные и зарубежные аналоги. Принципиальной особенностью предприятия является то, что в основе всех ключевых разработок лежат собственные изобретения, защищённые патентами Российской Федерации.</w:t>
       </w:r>
     </w:p>
     <w:p>
@@ -6167,385 +6237,7 @@
           <w:rFonts w:ascii="Times New Roman" w:hAnsi="Times New Roman" w:cs="Times New Roman" w:eastAsia="Times New Roman"/>
           <w:sz w:val="28"/>
         </w:rPr>
-        <w:t>Продуктовый портфель ООО «Фаст Инжиниринг» включает несколько групп оборудования:</w:t>
-      </w:r>
-    </w:p>
-    <w:p>
-      <w:pPr>
-        <w:spacing w:line="360" w:lineRule="auto" w:before="0" w:after="0"/>
-        <w:ind w:firstLine="0" w:left="709"/>
-        <w:jc w:val="both"/>
-      </w:pPr>
-      <w:r>
-        <w:rPr>
-          <w:rFonts w:ascii="Times New Roman" w:hAnsi="Times New Roman" w:cs="Times New Roman" w:eastAsia="Times New Roman"/>
-          <w:sz w:val="28"/>
-        </w:rPr>
-        <w:t>1) насосное оборудование — насос Астановского принципиально новой конструкции, предназначенный для перемещения жидкостей в нефтяной, химической, нефтехимической, нефтеперерабатывающей промышленности, энергетике, на транспорте;</w:t>
-      </w:r>
-    </w:p>
-    <w:p>
-      <w:pPr>
-        <w:spacing w:line="360" w:lineRule="auto" w:before="0" w:after="0"/>
-        <w:ind w:firstLine="0" w:left="709"/>
-        <w:jc w:val="both"/>
-      </w:pPr>
-      <w:r>
-        <w:rPr>
-          <w:rFonts w:ascii="Times New Roman" w:hAnsi="Times New Roman" w:cs="Times New Roman" w:eastAsia="Times New Roman"/>
-          <w:sz w:val="28"/>
-        </w:rPr>
-        <w:t>2) теплообменное оборудование — теплообменный аппарат радиально-спирального типа, лишённый ряда ограничений традиционных кожухотрубных, пластинчатых и витых теплообменников;</w:t>
-      </w:r>
-    </w:p>
-    <w:p>
-      <w:pPr>
-        <w:spacing w:line="360" w:lineRule="auto" w:before="0" w:after="0"/>
-        <w:ind w:firstLine="0" w:left="709"/>
-        <w:jc w:val="both"/>
-      </w:pPr>
-      <w:r>
-        <w:rPr>
-          <w:rFonts w:ascii="Times New Roman" w:hAnsi="Times New Roman" w:cs="Times New Roman" w:eastAsia="Times New Roman"/>
-          <w:sz w:val="28"/>
-        </w:rPr>
-        <w:t>3) массообменное оборудование — массообменный аппарат для абсорбционных процессов и улавливания компонентов из отходящих газов;</w:t>
-      </w:r>
-    </w:p>
-    <w:p>
-      <w:pPr>
-        <w:spacing w:line="360" w:lineRule="auto" w:before="0" w:after="0"/>
-        <w:ind w:firstLine="0" w:left="709"/>
-        <w:jc w:val="both"/>
-      </w:pPr>
-      <w:r>
-        <w:rPr>
-          <w:rFonts w:ascii="Times New Roman" w:hAnsi="Times New Roman" w:cs="Times New Roman" w:eastAsia="Times New Roman"/>
-          <w:sz w:val="28"/>
-        </w:rPr>
-        <w:t>4) каталитические реакторы радиально-спирального типа для процессов гетерогенного катализа в химической, нефтехимической и металлургической промышленности, а также для решения экологических задач;</w:t>
-      </w:r>
-    </w:p>
-    <w:p>
-      <w:pPr>
-        <w:spacing w:line="360" w:lineRule="auto" w:before="0" w:after="0"/>
-        <w:ind w:firstLine="0" w:left="709"/>
-        <w:jc w:val="both"/>
-      </w:pPr>
-      <w:r>
-        <w:rPr>
-          <w:rFonts w:ascii="Times New Roman" w:hAnsi="Times New Roman" w:cs="Times New Roman" w:eastAsia="Times New Roman"/>
-          <w:sz w:val="28"/>
-        </w:rPr>
-        <w:t>5) компрессорное оборудование — компрессор Астановского для сжатия воздуха и иных газов на транспорте и в промышленности;</w:t>
-      </w:r>
-    </w:p>
-    <w:p>
-      <w:pPr>
-        <w:spacing w:line="360" w:lineRule="auto" w:before="0" w:after="0"/>
-        <w:ind w:firstLine="0" w:left="709"/>
-        <w:jc w:val="both"/>
-      </w:pPr>
-      <w:r>
-        <w:rPr>
-          <w:rFonts w:ascii="Times New Roman" w:hAnsi="Times New Roman" w:cs="Times New Roman" w:eastAsia="Times New Roman"/>
-          <w:sz w:val="28"/>
-        </w:rPr>
-        <w:t>6) рекуператоры тепла для утилизации низкопотенциального тепла, сбрасываемого в окружающую среду с отходящими дымовыми газами;</w:t>
-      </w:r>
-    </w:p>
-    <w:p>
-      <w:pPr>
-        <w:spacing w:line="360" w:lineRule="auto" w:before="0" w:after="0"/>
-        <w:ind w:firstLine="0" w:left="709"/>
-        <w:jc w:val="both"/>
-      </w:pPr>
-      <w:r>
-        <w:rPr>
-          <w:rFonts w:ascii="Times New Roman" w:hAnsi="Times New Roman" w:cs="Times New Roman" w:eastAsia="Times New Roman"/>
-          <w:sz w:val="28"/>
-        </w:rPr>
-        <w:t>7) беспламенные горелки для экологически чистого сжигания топлива;</w:t>
-      </w:r>
-    </w:p>
-    <w:p>
-      <w:pPr>
-        <w:spacing w:line="360" w:lineRule="auto" w:before="0" w:after="0"/>
-        <w:ind w:firstLine="0" w:left="709"/>
-        <w:jc w:val="both"/>
-      </w:pPr>
-      <w:r>
-        <w:rPr>
-          <w:rFonts w:ascii="Times New Roman" w:hAnsi="Times New Roman" w:cs="Times New Roman" w:eastAsia="Times New Roman"/>
-          <w:sz w:val="28"/>
-        </w:rPr>
-        <w:t>8) блоки аккумуляторов водорода в рамках водородной энергетики;</w:t>
-      </w:r>
-    </w:p>
-    <w:p>
-      <w:pPr>
-        <w:spacing w:line="360" w:lineRule="auto" w:before="0" w:after="0"/>
-        <w:ind w:firstLine="0" w:left="709"/>
-        <w:jc w:val="both"/>
-      </w:pPr>
-      <w:r>
-        <w:rPr>
-          <w:rFonts w:ascii="Times New Roman" w:hAnsi="Times New Roman" w:cs="Times New Roman" w:eastAsia="Times New Roman"/>
-          <w:sz w:val="28"/>
-        </w:rPr>
-        <w:t>9) фильтры непрерывного действия для очистки воды и жидких сред.</w:t>
-      </w:r>
-    </w:p>
-    <w:p>
-      <w:pPr>
-        <w:spacing w:line="360" w:lineRule="auto" w:before="0" w:after="0"/>
-        <w:ind w:firstLine="709"/>
-        <w:jc w:val="both"/>
-      </w:pPr>
-      <w:r>
-        <w:rPr>
-          <w:rFonts w:ascii="Times New Roman" w:hAnsi="Times New Roman" w:cs="Times New Roman" w:eastAsia="Times New Roman"/>
-          <w:sz w:val="28"/>
-        </w:rPr>
-        <w:t>Помимо собственно оборудования, предприятие предлагает рынку технологические решения: высокоэффективное получение синтез-газа из углеводородного сырья; энергосберегающее экологически чистое производство водорода; технологии получения метанола из природного газа; получение синтетических жидких углеводородов из природного или попутного нефтяного газа; газификация твёрдых топлив (угля, торфа, древесины, бытовых, промышленных и сельскохозяйственных отходов); термическое обезвреживание сточных вод, в том числе для районов Арктики и Крайнего Севера; энергосберегающая технология производства аммиака; очистка газовых выбросов от вредных компонентов, в том числе каталитическая очистка от CO и NOx; подготовка сырой нефти к транспорту; подготовка топливного газа для газопоршневых двигателей и газотурбинных установок; регенерация водометанольного раствора; извлечение CO₂ из отходящих газов с последующей утилизацией.</w:t>
-      </w:r>
-    </w:p>
-    <w:p>
-      <w:pPr>
-        <w:spacing w:line="360" w:lineRule="auto" w:before="0" w:after="0"/>
-        <w:ind w:firstLine="709"/>
-        <w:jc w:val="both"/>
-      </w:pPr>
-      <w:r>
-        <w:rPr>
-          <w:rFonts w:ascii="Times New Roman" w:hAnsi="Times New Roman" w:cs="Times New Roman" w:eastAsia="Times New Roman"/>
-          <w:sz w:val="28"/>
-        </w:rPr>
-        <w:t>Таким образом, ООО «Фаст Инжиниринг» позиционируется на рынке как поставщик инновационных инжиниринговых решений «под ключ», объединяющих авторские конструкции оборудования и комплексные технологические разработки. Это формирует уникальное предложение, но одновременно значительно сужает целевую аудиторию: заказчиками потенциально могут выступать только крупные и средние промышленные предприятия нефтегазового, химического, металлургического и энергетического сектора, а также государственные и научно-производственные структуры.</w:t>
-      </w:r>
-    </w:p>
-    <w:p>
-      <w:pPr>
-        <w:spacing w:line="360" w:lineRule="auto" w:before="0" w:after="0"/>
-        <w:ind w:firstLine="709"/>
-        <w:jc w:val="both"/>
-      </w:pPr>
-      <w:r>
-        <w:rPr>
-          <w:rFonts w:ascii="Times New Roman" w:hAnsi="Times New Roman" w:cs="Times New Roman" w:eastAsia="Times New Roman"/>
-          <w:sz w:val="28"/>
-        </w:rPr>
-        <w:t>Отраслевое позиционирование в B2B-сегменте промышленного оборудования характеризуется длительным циклом сделки (от нескольких месяцев до нескольких лет с учётом стадий технико-экономического обоснования, проектирования, согласования, изготовления, монтажа и пусконаладки), высокой средней стоимостью контракта, значимостью референций (опыта успешного внедрения на действующих производствах), технической сложности продукции и важности патентной защиты решений.</w:t>
-      </w:r>
-    </w:p>
-    <w:p>
-      <w:pPr>
-        <w:spacing w:line="360" w:lineRule="auto" w:before="0" w:after="0"/>
-        <w:ind w:firstLine="709"/>
-        <w:jc w:val="both"/>
-      </w:pPr>
-      <w:r>
-        <w:rPr>
-          <w:rFonts w:ascii="Times New Roman" w:hAnsi="Times New Roman" w:cs="Times New Roman" w:eastAsia="Times New Roman"/>
-          <w:sz w:val="28"/>
-        </w:rPr>
-        <w:t>Организационная структура предприятия как микропредприятия — линейно-функциональная, с минимальной формализацией. Руководство Обществом осуществляется единоличным исполнительным органом — президентом Общества, в подчинении которого находятся ключевые функциональные направления: научно-конструкторская работа (разработка изобретений и проектирование оборудования), производственно-технологическое сопровождение (контроль изготовления и пусконаладки на площадках заказчика), коммерческая работа (привлечение клиентов, ведение переговоров, заключение и сопровождение договоров), экономико-административная работа (бухгалтерия, кадровое и юридическое сопровождение). Маркетинговая и рекламно-информационная функция в Обществе в настоящее время не выделена в самостоятельное подразделение и распределена между руководителем и коммерческим персоналом, что характерно для организаций аналогичного масштаба.</w:t>
-      </w:r>
-    </w:p>
-    <w:p>
-      <w:pPr>
-        <w:spacing w:line="360" w:lineRule="auto" w:before="0" w:after="0"/>
-        <w:ind w:firstLine="709"/>
-        <w:jc w:val="both"/>
-      </w:pPr>
-      <w:r>
-        <w:rPr>
-          <w:rFonts w:ascii="Times New Roman" w:hAnsi="Times New Roman" w:cs="Times New Roman" w:eastAsia="Times New Roman"/>
-          <w:sz w:val="28"/>
-        </w:rPr>
-        <w:t>В качестве ключевых конкурентных преимуществ предприятия следует отметить:</w:t>
-      </w:r>
-    </w:p>
-    <w:p>
-      <w:pPr>
-        <w:spacing w:line="360" w:lineRule="auto" w:before="0" w:after="0"/>
-        <w:ind w:firstLine="0" w:left="709"/>
-        <w:jc w:val="both"/>
-      </w:pPr>
-      <w:r>
-        <w:rPr>
-          <w:rFonts w:ascii="Times New Roman" w:hAnsi="Times New Roman" w:cs="Times New Roman" w:eastAsia="Times New Roman"/>
-          <w:sz w:val="28"/>
-        </w:rPr>
-        <w:t>• собственные патенты Российской Федерации на конструкции оборудования и технологические решения;</w:t>
-      </w:r>
-    </w:p>
-    <w:p>
-      <w:pPr>
-        <w:spacing w:line="360" w:lineRule="auto" w:before="0" w:after="0"/>
-        <w:ind w:firstLine="0" w:left="709"/>
-        <w:jc w:val="both"/>
-      </w:pPr>
-      <w:r>
-        <w:rPr>
-          <w:rFonts w:ascii="Times New Roman" w:hAnsi="Times New Roman" w:cs="Times New Roman" w:eastAsia="Times New Roman"/>
-          <w:sz w:val="28"/>
-        </w:rPr>
-        <w:t>• экономия энергоресурсов и снижение эксплуатационных затрат на действующих производствах заказчика;</w:t>
-      </w:r>
-    </w:p>
-    <w:p>
-      <w:pPr>
-        <w:spacing w:line="360" w:lineRule="auto" w:before="0" w:after="0"/>
-        <w:ind w:firstLine="0" w:left="709"/>
-        <w:jc w:val="both"/>
-      </w:pPr>
-      <w:r>
-        <w:rPr>
-          <w:rFonts w:ascii="Times New Roman" w:hAnsi="Times New Roman" w:cs="Times New Roman" w:eastAsia="Times New Roman"/>
-          <w:sz w:val="28"/>
-        </w:rPr>
-        <w:t>• экологическая безопасность предлагаемых решений;</w:t>
-      </w:r>
-    </w:p>
-    <w:p>
-      <w:pPr>
-        <w:spacing w:line="360" w:lineRule="auto" w:before="0" w:after="0"/>
-        <w:ind w:firstLine="0" w:left="709"/>
-        <w:jc w:val="both"/>
-      </w:pPr>
-      <w:r>
-        <w:rPr>
-          <w:rFonts w:ascii="Times New Roman" w:hAnsi="Times New Roman" w:cs="Times New Roman" w:eastAsia="Times New Roman"/>
-          <w:sz w:val="28"/>
-        </w:rPr>
-        <w:t>• высокая адаптивность — возможность проектировать оборудование под конкретные параметры технологического процесса заказчика;</w:t>
-      </w:r>
-    </w:p>
-    <w:p>
-      <w:pPr>
-        <w:spacing w:line="360" w:lineRule="auto" w:before="0" w:after="0"/>
-        <w:ind w:firstLine="0" w:left="709"/>
-        <w:jc w:val="both"/>
-      </w:pPr>
-      <w:r>
-        <w:rPr>
-          <w:rFonts w:ascii="Times New Roman" w:hAnsi="Times New Roman" w:cs="Times New Roman" w:eastAsia="Times New Roman"/>
-          <w:sz w:val="28"/>
-        </w:rPr>
-        <w:t>• импортозамещающий характер большинства решений, что в условиях санкционного давления особенно востребовано в нефтегазовой и химической промышленности;</w:t>
-      </w:r>
-    </w:p>
-    <w:p>
-      <w:pPr>
-        <w:spacing w:line="360" w:lineRule="auto" w:before="0" w:after="0"/>
-        <w:ind w:firstLine="0" w:left="709"/>
-        <w:jc w:val="both"/>
-      </w:pPr>
-      <w:r>
-        <w:rPr>
-          <w:rFonts w:ascii="Times New Roman" w:hAnsi="Times New Roman" w:cs="Times New Roman" w:eastAsia="Times New Roman"/>
-          <w:sz w:val="28"/>
-        </w:rPr>
-        <w:t>• многолетняя экспертиза учредителя и команды в области инжиниринга и патентного дела.</w:t>
-      </w:r>
-    </w:p>
-    <w:p>
-      <w:pPr>
-        <w:spacing w:line="360" w:lineRule="auto" w:before="0" w:after="0"/>
-        <w:ind w:firstLine="709"/>
-        <w:jc w:val="both"/>
-      </w:pPr>
-      <w:r>
-        <w:rPr>
-          <w:rFonts w:ascii="Times New Roman" w:hAnsi="Times New Roman" w:cs="Times New Roman" w:eastAsia="Times New Roman"/>
-          <w:sz w:val="28"/>
-        </w:rPr>
-        <w:t>К ключевым ограничениям деятельности относятся:</w:t>
-      </w:r>
-    </w:p>
-    <w:p>
-      <w:pPr>
-        <w:spacing w:line="360" w:lineRule="auto" w:before="0" w:after="0"/>
-        <w:ind w:firstLine="0" w:left="709"/>
-        <w:jc w:val="both"/>
-      </w:pPr>
-      <w:r>
-        <w:rPr>
-          <w:rFonts w:ascii="Times New Roman" w:hAnsi="Times New Roman" w:cs="Times New Roman" w:eastAsia="Times New Roman"/>
-          <w:sz w:val="28"/>
-        </w:rPr>
-        <w:t>• статус микропредприятия с ограниченным штатом не позволяет одновременно вести большое количество проектов;</w:t>
-      </w:r>
-    </w:p>
-    <w:p>
-      <w:pPr>
-        <w:spacing w:line="360" w:lineRule="auto" w:before="0" w:after="0"/>
-        <w:ind w:firstLine="0" w:left="709"/>
-        <w:jc w:val="both"/>
-      </w:pPr>
-      <w:r>
-        <w:rPr>
-          <w:rFonts w:ascii="Times New Roman" w:hAnsi="Times New Roman" w:cs="Times New Roman" w:eastAsia="Times New Roman"/>
-          <w:sz w:val="28"/>
-        </w:rPr>
-        <w:t>• отсутствие выделенной маркетинговой службы и системного маркетинга;</w:t>
-      </w:r>
-    </w:p>
-    <w:p>
-      <w:pPr>
-        <w:spacing w:line="360" w:lineRule="auto" w:before="0" w:after="0"/>
-        <w:ind w:firstLine="0" w:left="709"/>
-        <w:jc w:val="both"/>
-      </w:pPr>
-      <w:r>
-        <w:rPr>
-          <w:rFonts w:ascii="Times New Roman" w:hAnsi="Times New Roman" w:cs="Times New Roman" w:eastAsia="Times New Roman"/>
-          <w:sz w:val="28"/>
-        </w:rPr>
-        <w:t>• высокая зависимость продаж от лично-репутационных связей учредителя и коммерческой работы первых лиц;</w:t>
-      </w:r>
-    </w:p>
-    <w:p>
-      <w:pPr>
-        <w:spacing w:line="360" w:lineRule="auto" w:before="0" w:after="0"/>
-        <w:ind w:firstLine="0" w:left="709"/>
-        <w:jc w:val="both"/>
-      </w:pPr>
-      <w:r>
-        <w:rPr>
-          <w:rFonts w:ascii="Times New Roman" w:hAnsi="Times New Roman" w:cs="Times New Roman" w:eastAsia="Times New Roman"/>
-          <w:sz w:val="28"/>
-        </w:rPr>
-        <w:t>• инновационный характер продукции требует серьёзной разъяснительной работы с заказчиком и преодоления естественного консерватизма промышленных предприятий при выборе оборудования;</w:t>
-      </w:r>
-    </w:p>
-    <w:p>
-      <w:pPr>
-        <w:spacing w:line="360" w:lineRule="auto" w:before="0" w:after="0"/>
-        <w:ind w:firstLine="0" w:left="709"/>
-        <w:jc w:val="both"/>
-      </w:pPr>
-      <w:r>
-        <w:rPr>
-          <w:rFonts w:ascii="Times New Roman" w:hAnsi="Times New Roman" w:cs="Times New Roman" w:eastAsia="Times New Roman"/>
-          <w:sz w:val="28"/>
-        </w:rPr>
-        <w:t>• длительный цикл сделки усложняет планирование денежных потоков и инвестиций в продвижение.</w:t>
-      </w:r>
-    </w:p>
-    <w:p>
-      <w:pPr>
-        <w:spacing w:line="360" w:lineRule="auto" w:before="0" w:after="0"/>
-        <w:ind w:firstLine="709"/>
-        <w:jc w:val="both"/>
-      </w:pPr>
-      <w:r>
-        <w:rPr>
-          <w:rFonts w:ascii="Times New Roman" w:hAnsi="Times New Roman" w:cs="Times New Roman" w:eastAsia="Times New Roman"/>
-          <w:sz w:val="28"/>
-        </w:rPr>
-        <w:t>Финансово-экономическую сторону деятельности Общества можно охарактеризовать на основании данных бухгалтерской (финансовой) отчётности за последние годы. Сводные показатели представлены в таблице 2.2 (по данным бухгалтерской отчётности ООО «Фаст Инжиниринг» за 2022–2024 гг. и сведений из открытых источников).</w:t>
+        <w:t>Продуктовый портфель ООО «Фаст Инжиниринг», обследованный в ходе практики, включает несколько устойчивых групп оборудования и технологических решений, систематизированных в таблице 2.2. Эти данные одновременно характеризуют объём производственно-сбытовой деятельности предприятия и определяют содержание будущих рекламно-информационных сообщений.</w:t>
       </w:r>
     </w:p>
     <w:p>
@@ -6560,7 +6252,537 @@
           <w:b/>
           <w:sz w:val="28"/>
         </w:rPr>
-        <w:t>Таблица 2.2 — Основные финансово-экономические показатели ООО «Фаст Инжиниринг» в 2022–2024 гг., тыс. руб.</w:t>
+        <w:t>Таблица 2.2 — Номенклатура продукции и технологических решений ООО «Фаст Инжиниринг»</w:t>
+      </w:r>
+    </w:p>
+    <w:tbl>
+      <w:tblPr>
+        <w:tblStyle w:val="TableGrid"/>
+        <w:tblW w:type="auto" w:w="0"/>
+        <w:tblLook w:firstColumn="1" w:firstRow="1" w:lastColumn="0" w:lastRow="0" w:noHBand="0" w:noVBand="1" w:val="04A0"/>
+      </w:tblPr>
+      <w:tblGrid>
+        <w:gridCol w:w="4986"/>
+        <w:gridCol w:w="4986"/>
+      </w:tblGrid>
+      <w:tr>
+        <w:tc>
+          <w:tcPr>
+            <w:tcW w:type="dxa" w:w="4986"/>
+          </w:tcPr>
+          <w:p>
+            <w:pPr>
+              <w:jc w:val="center"/>
+            </w:pPr>
+            <w:r/>
+            <w:r>
+              <w:rPr>
+                <w:rFonts w:ascii="Times New Roman" w:hAnsi="Times New Roman"/>
+                <w:b/>
+                <w:sz w:val="24"/>
+              </w:rPr>
+              <w:t>Группа</w:t>
+            </w:r>
+          </w:p>
+        </w:tc>
+        <w:tc>
+          <w:tcPr>
+            <w:tcW w:type="dxa" w:w="4986"/>
+          </w:tcPr>
+          <w:p>
+            <w:pPr>
+              <w:jc w:val="center"/>
+            </w:pPr>
+            <w:r/>
+            <w:r>
+              <w:rPr>
+                <w:rFonts w:ascii="Times New Roman" w:hAnsi="Times New Roman"/>
+                <w:b/>
+                <w:sz w:val="24"/>
+              </w:rPr>
+              <w:t>Наименование</w:t>
+            </w:r>
+          </w:p>
+        </w:tc>
+      </w:tr>
+      <w:tr>
+        <w:tc>
+          <w:tcPr>
+            <w:tcW w:type="dxa" w:w="4986"/>
+          </w:tcPr>
+          <w:p>
+            <w:pPr>
+              <w:jc w:val="left"/>
+            </w:pPr>
+            <w:r/>
+            <w:r>
+              <w:rPr>
+                <w:rFonts w:ascii="Times New Roman" w:hAnsi="Times New Roman"/>
+                <w:sz w:val="24"/>
+              </w:rPr>
+              <w:t>Оборудование (насосное)</w:t>
+            </w:r>
+          </w:p>
+        </w:tc>
+        <w:tc>
+          <w:tcPr>
+            <w:tcW w:type="dxa" w:w="4986"/>
+          </w:tcPr>
+          <w:p>
+            <w:pPr>
+              <w:jc w:val="left"/>
+            </w:pPr>
+            <w:r/>
+            <w:r>
+              <w:rPr>
+                <w:rFonts w:ascii="Times New Roman" w:hAnsi="Times New Roman"/>
+                <w:sz w:val="24"/>
+              </w:rPr>
+              <w:t>Насос Астановского для перемещения жидкостей в нефтехимии, энергетике, на транспорте</w:t>
+            </w:r>
+          </w:p>
+        </w:tc>
+      </w:tr>
+      <w:tr>
+        <w:tc>
+          <w:tcPr>
+            <w:tcW w:type="dxa" w:w="4986"/>
+          </w:tcPr>
+          <w:p>
+            <w:pPr>
+              <w:jc w:val="left"/>
+            </w:pPr>
+            <w:r/>
+            <w:r>
+              <w:rPr>
+                <w:rFonts w:ascii="Times New Roman" w:hAnsi="Times New Roman"/>
+                <w:sz w:val="24"/>
+              </w:rPr>
+              <w:t>Оборудование (теплообменное)</w:t>
+            </w:r>
+          </w:p>
+        </w:tc>
+        <w:tc>
+          <w:tcPr>
+            <w:tcW w:type="dxa" w:w="4986"/>
+          </w:tcPr>
+          <w:p>
+            <w:pPr>
+              <w:jc w:val="left"/>
+            </w:pPr>
+            <w:r/>
+            <w:r>
+              <w:rPr>
+                <w:rFonts w:ascii="Times New Roman" w:hAnsi="Times New Roman"/>
+                <w:sz w:val="24"/>
+              </w:rPr>
+              <w:t>Теплообменный аппарат радиально-спирального типа конструкции «Фаст Инжиниринг»®</w:t>
+            </w:r>
+          </w:p>
+        </w:tc>
+      </w:tr>
+      <w:tr>
+        <w:tc>
+          <w:tcPr>
+            <w:tcW w:type="dxa" w:w="4986"/>
+          </w:tcPr>
+          <w:p>
+            <w:pPr>
+              <w:jc w:val="left"/>
+            </w:pPr>
+            <w:r/>
+            <w:r>
+              <w:rPr>
+                <w:rFonts w:ascii="Times New Roman" w:hAnsi="Times New Roman"/>
+                <w:sz w:val="24"/>
+              </w:rPr>
+              <w:t>Оборудование (массообменное)</w:t>
+            </w:r>
+          </w:p>
+        </w:tc>
+        <w:tc>
+          <w:tcPr>
+            <w:tcW w:type="dxa" w:w="4986"/>
+          </w:tcPr>
+          <w:p>
+            <w:pPr>
+              <w:jc w:val="left"/>
+            </w:pPr>
+            <w:r/>
+            <w:r>
+              <w:rPr>
+                <w:rFonts w:ascii="Times New Roman" w:hAnsi="Times New Roman"/>
+                <w:sz w:val="24"/>
+              </w:rPr>
+              <w:t>Массообменный аппарат для абсорбционных процессов и улавливания компонентов из отходящих газов</w:t>
+            </w:r>
+          </w:p>
+        </w:tc>
+      </w:tr>
+      <w:tr>
+        <w:tc>
+          <w:tcPr>
+            <w:tcW w:type="dxa" w:w="4986"/>
+          </w:tcPr>
+          <w:p>
+            <w:pPr>
+              <w:jc w:val="left"/>
+            </w:pPr>
+            <w:r/>
+            <w:r>
+              <w:rPr>
+                <w:rFonts w:ascii="Times New Roman" w:hAnsi="Times New Roman"/>
+                <w:sz w:val="24"/>
+              </w:rPr>
+              <w:t>Оборудование (каталитическое)</w:t>
+            </w:r>
+          </w:p>
+        </w:tc>
+        <w:tc>
+          <w:tcPr>
+            <w:tcW w:type="dxa" w:w="4986"/>
+          </w:tcPr>
+          <w:p>
+            <w:pPr>
+              <w:jc w:val="left"/>
+            </w:pPr>
+            <w:r/>
+            <w:r>
+              <w:rPr>
+                <w:rFonts w:ascii="Times New Roman" w:hAnsi="Times New Roman"/>
+                <w:sz w:val="24"/>
+              </w:rPr>
+              <w:t>Каталитический реактор радиально-спирального типа для процессов гетерогенного катализа</w:t>
+            </w:r>
+          </w:p>
+        </w:tc>
+      </w:tr>
+      <w:tr>
+        <w:tc>
+          <w:tcPr>
+            <w:tcW w:type="dxa" w:w="4986"/>
+          </w:tcPr>
+          <w:p>
+            <w:pPr>
+              <w:jc w:val="left"/>
+            </w:pPr>
+            <w:r/>
+            <w:r>
+              <w:rPr>
+                <w:rFonts w:ascii="Times New Roman" w:hAnsi="Times New Roman"/>
+                <w:sz w:val="24"/>
+              </w:rPr>
+              <w:t>Оборудование (компрессорное)</w:t>
+            </w:r>
+          </w:p>
+        </w:tc>
+        <w:tc>
+          <w:tcPr>
+            <w:tcW w:type="dxa" w:w="4986"/>
+          </w:tcPr>
+          <w:p>
+            <w:pPr>
+              <w:jc w:val="left"/>
+            </w:pPr>
+            <w:r/>
+            <w:r>
+              <w:rPr>
+                <w:rFonts w:ascii="Times New Roman" w:hAnsi="Times New Roman"/>
+                <w:sz w:val="24"/>
+              </w:rPr>
+              <w:t>Компрессор Астановского для сжатия воздуха и других газов</w:t>
+            </w:r>
+          </w:p>
+        </w:tc>
+      </w:tr>
+      <w:tr>
+        <w:tc>
+          <w:tcPr>
+            <w:tcW w:type="dxa" w:w="4986"/>
+          </w:tcPr>
+          <w:p>
+            <w:pPr>
+              <w:jc w:val="left"/>
+            </w:pPr>
+            <w:r/>
+            <w:r>
+              <w:rPr>
+                <w:rFonts w:ascii="Times New Roman" w:hAnsi="Times New Roman"/>
+                <w:sz w:val="24"/>
+              </w:rPr>
+              <w:t>Оборудование (рекуперация)</w:t>
+            </w:r>
+          </w:p>
+        </w:tc>
+        <w:tc>
+          <w:tcPr>
+            <w:tcW w:type="dxa" w:w="4986"/>
+          </w:tcPr>
+          <w:p>
+            <w:pPr>
+              <w:jc w:val="left"/>
+            </w:pPr>
+            <w:r/>
+            <w:r>
+              <w:rPr>
+                <w:rFonts w:ascii="Times New Roman" w:hAnsi="Times New Roman"/>
+                <w:sz w:val="24"/>
+              </w:rPr>
+              <w:t>Рекуператоры тепла для нагрева воздуха, топлива, воды отходящими дымовыми газами</w:t>
+            </w:r>
+          </w:p>
+        </w:tc>
+      </w:tr>
+      <w:tr>
+        <w:tc>
+          <w:tcPr>
+            <w:tcW w:type="dxa" w:w="4986"/>
+          </w:tcPr>
+          <w:p>
+            <w:pPr>
+              <w:jc w:val="left"/>
+            </w:pPr>
+            <w:r/>
+            <w:r>
+              <w:rPr>
+                <w:rFonts w:ascii="Times New Roman" w:hAnsi="Times New Roman"/>
+                <w:sz w:val="24"/>
+              </w:rPr>
+              <w:t>Оборудование (сжигание)</w:t>
+            </w:r>
+          </w:p>
+        </w:tc>
+        <w:tc>
+          <w:tcPr>
+            <w:tcW w:type="dxa" w:w="4986"/>
+          </w:tcPr>
+          <w:p>
+            <w:pPr>
+              <w:jc w:val="left"/>
+            </w:pPr>
+            <w:r/>
+            <w:r>
+              <w:rPr>
+                <w:rFonts w:ascii="Times New Roman" w:hAnsi="Times New Roman"/>
+                <w:sz w:val="24"/>
+              </w:rPr>
+              <w:t>Беспламенная горелка конструкции «Фаст Инжиниринг»®</w:t>
+            </w:r>
+          </w:p>
+        </w:tc>
+      </w:tr>
+      <w:tr>
+        <w:tc>
+          <w:tcPr>
+            <w:tcW w:type="dxa" w:w="4986"/>
+          </w:tcPr>
+          <w:p>
+            <w:pPr>
+              <w:jc w:val="left"/>
+            </w:pPr>
+            <w:r/>
+            <w:r>
+              <w:rPr>
+                <w:rFonts w:ascii="Times New Roman" w:hAnsi="Times New Roman"/>
+                <w:sz w:val="24"/>
+              </w:rPr>
+              <w:t>Оборудование (водородная энергетика)</w:t>
+            </w:r>
+          </w:p>
+        </w:tc>
+        <w:tc>
+          <w:tcPr>
+            <w:tcW w:type="dxa" w:w="4986"/>
+          </w:tcPr>
+          <w:p>
+            <w:pPr>
+              <w:jc w:val="left"/>
+            </w:pPr>
+            <w:r/>
+            <w:r>
+              <w:rPr>
+                <w:rFonts w:ascii="Times New Roman" w:hAnsi="Times New Roman"/>
+                <w:sz w:val="24"/>
+              </w:rPr>
+              <w:t>Блок аккумуляторов водорода</w:t>
+            </w:r>
+          </w:p>
+        </w:tc>
+      </w:tr>
+      <w:tr>
+        <w:tc>
+          <w:tcPr>
+            <w:tcW w:type="dxa" w:w="4986"/>
+          </w:tcPr>
+          <w:p>
+            <w:pPr>
+              <w:jc w:val="left"/>
+            </w:pPr>
+            <w:r/>
+            <w:r>
+              <w:rPr>
+                <w:rFonts w:ascii="Times New Roman" w:hAnsi="Times New Roman"/>
+                <w:sz w:val="24"/>
+              </w:rPr>
+              <w:t>Оборудование (фильтрация)</w:t>
+            </w:r>
+          </w:p>
+        </w:tc>
+        <w:tc>
+          <w:tcPr>
+            <w:tcW w:type="dxa" w:w="4986"/>
+          </w:tcPr>
+          <w:p>
+            <w:pPr>
+              <w:jc w:val="left"/>
+            </w:pPr>
+            <w:r/>
+            <w:r>
+              <w:rPr>
+                <w:rFonts w:ascii="Times New Roman" w:hAnsi="Times New Roman"/>
+                <w:sz w:val="24"/>
+              </w:rPr>
+              <w:t>Фильтр непрерывного действия для очистки воды и жидких сред</w:t>
+            </w:r>
+          </w:p>
+        </w:tc>
+      </w:tr>
+      <w:tr>
+        <w:tc>
+          <w:tcPr>
+            <w:tcW w:type="dxa" w:w="4986"/>
+          </w:tcPr>
+          <w:p>
+            <w:pPr>
+              <w:jc w:val="left"/>
+            </w:pPr>
+            <w:r/>
+            <w:r>
+              <w:rPr>
+                <w:rFonts w:ascii="Times New Roman" w:hAnsi="Times New Roman"/>
+                <w:sz w:val="24"/>
+              </w:rPr>
+              <w:t>Технологии</w:t>
+            </w:r>
+          </w:p>
+        </w:tc>
+        <w:tc>
+          <w:tcPr>
+            <w:tcW w:type="dxa" w:w="4986"/>
+          </w:tcPr>
+          <w:p>
+            <w:pPr>
+              <w:jc w:val="left"/>
+            </w:pPr>
+            <w:r/>
+            <w:r>
+              <w:rPr>
+                <w:rFonts w:ascii="Times New Roman" w:hAnsi="Times New Roman"/>
+                <w:sz w:val="24"/>
+              </w:rPr>
+              <w:t>Получение синтез-газа из углеводородного сырья; производство водорода; получение метанола из природного газа; получение синтетических жидких углеводородов; газификация твёрдых топлив; термическое обезвреживание сточных вод; производство аммиака; очистка газовых выбросов; каталитическая очистка от CO и NOx; подготовка сырой нефти к транспорту; подготовка топливного газа; гидрогенизационная обработка нефтепродуктов; регенерация водометанольного раствора; извлечение CO₂ из отходящих газов</w:t>
+            </w:r>
+          </w:p>
+        </w:tc>
+      </w:tr>
+    </w:tbl>
+    <w:p>
+      <w:pPr>
+        <w:spacing w:line="360" w:lineRule="auto" w:before="0" w:after="0"/>
+        <w:ind w:firstLine="0"/>
+        <w:jc w:val="both"/>
+      </w:pPr>
+      <w:r>
+        <w:rPr>
+          <w:rFonts w:ascii="Times New Roman" w:hAnsi="Times New Roman" w:cs="Times New Roman" w:eastAsia="Times New Roman"/>
+          <w:sz w:val="28"/>
+        </w:rPr>
+        <w:t>Источник: составлено автором по материалам официального сайта предприятия и материалам, собранным в ходе производственной практики (преддипломной).</w:t>
+      </w:r>
+    </w:p>
+    <w:p>
+      <w:pPr>
+        <w:spacing w:line="360" w:lineRule="auto" w:before="0" w:after="0"/>
+        <w:ind w:firstLine="709"/>
+        <w:jc w:val="both"/>
+      </w:pPr>
+      <w:r>
+        <w:rPr>
+          <w:rFonts w:ascii="Times New Roman" w:hAnsi="Times New Roman" w:cs="Times New Roman" w:eastAsia="Times New Roman"/>
+          <w:sz w:val="28"/>
+        </w:rPr>
+        <w:t>В рамках задачи 4 практики в ходе обследования установлено, что показатели качества продукции закрепляются в технических условиях (ТУ) и конструкторской документации Общества и подтверждаются протоколами испытаний. Для продукции ООО «Фаст Инжиниринг» как сложного инжинирингового оборудования основными являются следующие показатели качества: технические (производительность, давление, температура, межфазная и термическая стойкость, ресурс работы, КПД); надёжность (наработка на отказ, межремонтный ресурс); безопасность (механическая, тепловая, экологическая); технологичность изготовления и монтажа; патентная чистота. Каждое изготовленное изделие сопровождается комплектом маркировки и документации в соответствии с требованиями технического регламента Таможенного союза «О безопасности машин и оборудования» (ТР ТС 010/2011) и иных применимых регламентов; на корпус оборудования наносится маркировочная табличка с указанием изготовителя, модели, заводского номера, основных технических характеристик, даты изготовления, знака обращения на рынке (EAC); к оборудованию прилагаются паспорт изделия, руководство по эксплуатации, протоколы испытаний, сертификаты (декларации) соответствия, копии патентов на конструктивные решения, гарантийные обязательства. Совокупность приведённых характеристик качества продукции образует фактическую основу для содержательной части рекламно-информационных сообщений предприятия и одновременно ставит специфические требования к их форме и каналам распространения.</w:t>
+      </w:r>
+    </w:p>
+    <w:p>
+      <w:pPr>
+        <w:spacing w:line="360" w:lineRule="auto" w:before="0" w:after="0"/>
+        <w:ind w:firstLine="709"/>
+        <w:jc w:val="both"/>
+      </w:pPr>
+      <w:r>
+        <w:rPr>
+          <w:rFonts w:ascii="Times New Roman" w:hAnsi="Times New Roman" w:cs="Times New Roman" w:eastAsia="Times New Roman"/>
+          <w:sz w:val="28"/>
+        </w:rPr>
+        <w:t>Таким образом, ООО «Фаст Инжиниринг» позиционируется на рынке как поставщик инновационных инжиниринговых решений «под ключ», объединяющих авторские патентованные конструкции оборудования и комплексные технологические разработки. Это формирует уникальное предложение, но одновременно значительно сужает целевую аудиторию: заказчиками потенциально могут выступать только крупные и средние промышленные предприятия нефтегазового, химического, металлургического и энергетического сектора, а также государственные и научно-производственные структуры. Отраслевое позиционирование в B2B-сегменте промышленного оборудования характеризуется длительным циклом сделки, высокой средней стоимостью контракта, значимостью референций (опыта успешного внедрения на действующих производствах), технической сложностью продукции и важностью патентной защиты решений.</w:t>
+      </w:r>
+    </w:p>
+    <w:p>
+      <w:pPr>
+        <w:spacing w:line="360" w:lineRule="auto" w:before="0" w:after="0"/>
+        <w:ind w:firstLine="709"/>
+        <w:jc w:val="both"/>
+      </w:pPr>
+      <w:r>
+        <w:rPr>
+          <w:rFonts w:ascii="Times New Roman" w:hAnsi="Times New Roman" w:cs="Times New Roman" w:eastAsia="Times New Roman"/>
+          <w:sz w:val="28"/>
+        </w:rPr>
+        <w:t>Организационная структура предприятия как микропредприятия — линейно-функциональная, с минимальной формализацией. Руководство Обществом осуществляется единоличным исполнительным органом — президентом Общества, в подчинении которого находятся ключевые функциональные направления: научно-конструкторская работа (разработка изобретений и проектирование оборудования), производственно-технологическое сопровождение (контроль изготовления и пусконаладки на площадках заказчика), коммерческая работа (привлечение клиентов, ведение переговоров, заключение и сопровождение договоров), экономико-административная работа (бухгалтерия, кадровое и юридическое сопровождение). Маркетинговая и рекламно-информационная функция в Обществе в настоящее время не выделена в самостоятельное подразделение и распределена между руководителем и коммерческим персоналом, что характерно для организаций аналогичного масштаба и одновременно является одной из ключевых организационных предпосылок выявленных далее проблем рекламно-информационной работы.</w:t>
+      </w:r>
+    </w:p>
+    <w:p>
+      <w:pPr>
+        <w:spacing w:line="360" w:lineRule="auto" w:before="0" w:after="0"/>
+        <w:ind w:firstLine="709"/>
+        <w:jc w:val="both"/>
+      </w:pPr>
+      <w:r>
+        <w:rPr>
+          <w:rFonts w:ascii="Times New Roman" w:hAnsi="Times New Roman" w:cs="Times New Roman" w:eastAsia="Times New Roman"/>
+          <w:sz w:val="28"/>
+        </w:rPr>
+        <w:t>В качестве ключевых конкурентных преимуществ предприятия следует отметить: собственные патенты Российской Федерации на конструкции оборудования и технологические решения; экономию энергоресурсов и снижение эксплуатационных затрат на действующих производствах заказчика; экологическую безопасность предлагаемых решений; высокую адаптивность — возможность проектировать оборудование под конкретные параметры технологического процесса заказчика; импортозамещающий характер большинства решений, что в условиях санкционного давления особенно востребовано в нефтегазовой и химической промышленности; многолетнюю экспертизу учредителя и команды в области инжиниринга и патентного дела. К ключевым ограничениям деятельности относятся: статус микропредприятия с ограниченным штатом, не позволяющий одновременно вести большое количество проектов; отсутствие выделенной маркетинговой службы и системного маркетинга; высокая зависимость продаж от лично-репутационных связей учредителя и коммерческой работы первых лиц; инновационный характер продукции, требующий серьёзной разъяснительной работы с заказчиком и преодоления естественного консерватизма промышленных предприятий при выборе оборудования; длительный цикл сделки.</w:t>
+      </w:r>
+    </w:p>
+    <w:p>
+      <w:pPr>
+        <w:spacing w:line="360" w:lineRule="auto" w:before="0" w:after="0"/>
+        <w:ind w:firstLine="709"/>
+        <w:jc w:val="both"/>
+      </w:pPr>
+      <w:r>
+        <w:rPr>
+          <w:rFonts w:ascii="Times New Roman" w:hAnsi="Times New Roman" w:cs="Times New Roman" w:eastAsia="Times New Roman"/>
+          <w:sz w:val="28"/>
+        </w:rPr>
+        <w:t>Финансово-экономическую сторону деятельности Общества можно охарактеризовать на основании данных бухгалтерской (финансовой) отчётности за 2022–2024 гг. Сводные показатели представлены в таблице 2.3.</w:t>
+      </w:r>
+    </w:p>
+    <w:p>
+      <w:pPr>
+        <w:spacing w:line="360" w:lineRule="auto" w:before="0" w:after="0"/>
+        <w:ind w:firstLine="0"/>
+        <w:jc w:val="left"/>
+      </w:pPr>
+      <w:r>
+        <w:rPr>
+          <w:rFonts w:ascii="Times New Roman" w:hAnsi="Times New Roman" w:cs="Times New Roman" w:eastAsia="Times New Roman"/>
+          <w:b/>
+          <w:sz w:val="28"/>
+        </w:rPr>
+        <w:t>Таблица 2.3 — Основные финансово-экономические показатели ООО «Фаст Инжиниринг» в 2022–2024 гг., тыс. руб.</w:t>
       </w:r>
     </w:p>
     <w:tbl>
@@ -7276,7 +7498,7 @@
                 <w:rFonts w:ascii="Times New Roman" w:hAnsi="Times New Roman"/>
                 <w:sz w:val="24"/>
               </w:rPr>
-              <w:t>775</w:t>
+              <w:t>775,0</w:t>
             </w:r>
           </w:p>
         </w:tc>
@@ -7379,7 +7601,7 @@
           <w:rFonts w:ascii="Times New Roman" w:hAnsi="Times New Roman" w:cs="Times New Roman" w:eastAsia="Times New Roman"/>
           <w:sz w:val="28"/>
         </w:rPr>
-        <w:t>Анализ данных таблицы 2.2 показывает резкое ухудшение финансово-экономических результатов деятельности ООО «Фаст Инжиниринг» в 2024 г. по сравнению с предыдущими периодами: выручка снизилась с 5 605 тыс. руб. в 2023 г. до 375 тыс. руб. в 2024 г., что составляет более чем 14-кратное падение. По итогам 2024 г. предприятие фактически работало «в ноль» по валовой прибыли и получило чистый убыток. Подобная динамика свидетельствует о фактическом прекращении регулярного потока заказов и переходе предприятия в режим точечного выполнения отдельных проектов. Важно подчеркнуть, что причина такого падения, по всей видимости, носит не операционный, а сбытовой характер: производственные мощности и научный потенциал предприятия сохранены, но устойчивого канала привлечения новых заказов в 2024 г. фактически не работало.</w:t>
+        <w:t>Анализ данных таблицы 2.3 показывает резкое ухудшение финансово-экономических результатов деятельности ООО «Фаст Инжиниринг» в 2024 г. по сравнению с предыдущими периодами: выручка снизилась с 5 605 тыс. руб. в 2023 г. до 375 тыс. руб. в 2024 г., что составляет более чем 14-кратное падение. По итогам 2024 г. предприятие фактически работало «в ноль» по валовой прибыли и получило чистый убыток. Подобная динамика свидетельствует о фактическом прекращении регулярного потока заказов и переходе предприятия в режим точечного выполнения отдельных проектов. Важно подчеркнуть, что причина такого падения, как было установлено в ходе практики, носит не операционный, а сбытовой характер: производственные мощности и научный потенциал предприятия сохранены, но устойчивого канала привлечения новых заказов в 2024 г. фактически не работало.</w:t>
       </w:r>
     </w:p>
     <w:p>
@@ -7393,7 +7615,7 @@
           <w:rFonts w:ascii="Times New Roman" w:hAnsi="Times New Roman" w:cs="Times New Roman" w:eastAsia="Times New Roman"/>
           <w:sz w:val="28"/>
         </w:rPr>
-        <w:t>Это положение дел ставит вопрос о состоянии рекламно-информационной работы предприятия как одного из ключевых факторов формирования входящего потока заявок и, соответственно, выручки. Анализу действующей системы рекламно-информационной работы ООО «Фаст Инжиниринг» посвящён следующий параграф.</w:t>
+        <w:t>Это положение дел ставит вопрос о состоянии рекламно-информационной работы предприятия как одного из ключевых факторов формирования входящего потока заявок и, соответственно, выручки, и обусловливает практическую значимость темы дипломной работы для предприятия. Анализу действующей системы рекламно-информационной работы ООО «Фаст Инжиниринг», а также организации экономической, маркетинговой и коммерческой деятельности, в рамках которых эта работа осуществляется, посвящён следующий параграф.</w:t>
       </w:r>
     </w:p>
     <w:p>
@@ -7408,7 +7630,7 @@
           <w:b/>
           <w:sz w:val="28"/>
         </w:rPr>
-        <w:t>2.2. Анализ существующей системы рекламно-информационной работы предприятия</w:t>
+        <w:t>2.2. Анализ организации экономической, маркетинговой и коммерческой деятельности ООО «Фаст Инжиниринг»</w:t>
       </w:r>
     </w:p>
     <w:p>
@@ -7422,7 +7644,7 @@
           <w:rFonts w:ascii="Times New Roman" w:hAnsi="Times New Roman" w:cs="Times New Roman" w:eastAsia="Times New Roman"/>
           <w:sz w:val="28"/>
         </w:rPr>
-        <w:t>Действующая в ООО «Фаст Инжиниринг» рекламно-информационная работа характеризуется ограниченным набором каналов коммуникации, отсутствием формализованной маркетинговой стратегии и опорой на имеющиеся репутационные и профессиональные связи учредителя и сотрудников. Систематизированная характеристика используемых каналов представлена ниже.</w:t>
+        <w:t>Содержание настоящего параграфа основано на материалах, собранных в ходе выполнения задачи 2 индивидуального задания на производственную практику (преддипломную) — описать организацию экономической и маркетинговой деятельности предприятия (период 22.04.2026 – 24.04.2026), и задачи 3 — исследовать и описать коммерческую деятельность предприятия (период 27.04.2026 – 30.04.2026). Указанные задачи практики соответствуют видам деятельности ВД2 и ВД1 ФГОС СПО 38.02.04. В рамках настоящей дипломной работы из собранного материала используются те его элементы, которые непосредственно характеризуют рекламно-информационную работу предприятия и факторы, определяющие её организацию.</w:t>
       </w:r>
     </w:p>
     <w:p>
@@ -7434,65 +7656,10 @@
       <w:r>
         <w:rPr>
           <w:rFonts w:ascii="Times New Roman" w:hAnsi="Times New Roman" w:cs="Times New Roman" w:eastAsia="Times New Roman"/>
-          <w:sz w:val="28"/>
-        </w:rPr>
-        <w:t>1. Корпоративный сайт fe1.ru. Основным каналом рекламно-информационной работы Общества является официальный сайт fe1.ru. Сайт выполняет функции «корпоративной витрины» и одновременно — основной точки входа для потенциальных заказчиков. По состоянию на дату исследования сайт содержит следующие разделы:</w:t>
-      </w:r>
-    </w:p>
-    <w:p>
-      <w:pPr>
-        <w:spacing w:line="360" w:lineRule="auto" w:before="0" w:after="0"/>
-        <w:ind w:firstLine="0" w:left="709"/>
-        <w:jc w:val="both"/>
-      </w:pPr>
-      <w:r>
-        <w:rPr>
-          <w:rFonts w:ascii="Times New Roman" w:hAnsi="Times New Roman" w:cs="Times New Roman" w:eastAsia="Times New Roman"/>
-          <w:sz w:val="28"/>
-        </w:rPr>
-        <w:t>• главная страница с тезисным изложением миссии предприятия и кратким перечнем продуктов и технологий;</w:t>
-      </w:r>
-    </w:p>
-    <w:p>
-      <w:pPr>
-        <w:spacing w:line="360" w:lineRule="auto" w:before="0" w:after="0"/>
-        <w:ind w:firstLine="0" w:left="709"/>
-        <w:jc w:val="both"/>
-      </w:pPr>
-      <w:r>
-        <w:rPr>
-          <w:rFonts w:ascii="Times New Roman" w:hAnsi="Times New Roman" w:cs="Times New Roman" w:eastAsia="Times New Roman"/>
-          <w:sz w:val="28"/>
-        </w:rPr>
-        <w:t>• раздел «Оборудование» с описанием насоса Астановского, теплообменного аппарата, массообменного аппарата, каталитического реактора, компрессора Астановского, рекуператоров тепла, беспламенной горелки, блока аккумуляторов водорода, фильтра непрерывного действия;</w:t>
-      </w:r>
-    </w:p>
-    <w:p>
-      <w:pPr>
-        <w:spacing w:line="360" w:lineRule="auto" w:before="0" w:after="0"/>
-        <w:ind w:firstLine="0" w:left="709"/>
-        <w:jc w:val="both"/>
-      </w:pPr>
-      <w:r>
-        <w:rPr>
-          <w:rFonts w:ascii="Times New Roman" w:hAnsi="Times New Roman" w:cs="Times New Roman" w:eastAsia="Times New Roman"/>
-          <w:sz w:val="28"/>
-        </w:rPr>
-        <w:t>• раздел «Технологии» с описанием получения синтез-газа, водорода, метанола, синтетических жидких углеводородов, газификации твёрдых топлив, термического обезвреживания сточных вод, технологии производства аммиака, очистки газовых выбросов, подготовки сырой нефти, подготовки топливного газа, гидрогенизационной обработки нефтепродуктов, регенерации ВМР, извлечения CO₂;</w:t>
-      </w:r>
-    </w:p>
-    <w:p>
-      <w:pPr>
-        <w:spacing w:line="360" w:lineRule="auto" w:before="0" w:after="0"/>
-        <w:ind w:firstLine="0" w:left="709"/>
-        <w:jc w:val="both"/>
-      </w:pPr>
-      <w:r>
-        <w:rPr>
-          <w:rFonts w:ascii="Times New Roman" w:hAnsi="Times New Roman" w:cs="Times New Roman" w:eastAsia="Times New Roman"/>
-          <w:sz w:val="28"/>
-        </w:rPr>
-        <w:t>• контактные данные предприятия (адрес, телефон, форма обратной связи).</w:t>
+          <w:i/>
+          <w:sz w:val="28"/>
+        </w:rPr>
+        <w:t>Организация экономической и маркетинговой деятельности</w:t>
       </w:r>
     </w:p>
     <w:p>
@@ -7506,105 +7673,7 @@
           <w:rFonts w:ascii="Times New Roman" w:hAnsi="Times New Roman" w:cs="Times New Roman" w:eastAsia="Times New Roman"/>
           <w:sz w:val="28"/>
         </w:rPr>
-        <w:t>Сильными сторонами сайта являются: содержательная глубина технических описаний; наличие единой стилистики; ясная привязка решений к отраслям применения. Вместе с тем, как информационный и продающий ресурс сайт обладает рядом существенных недостатков:</w:t>
-      </w:r>
-    </w:p>
-    <w:p>
-      <w:pPr>
-        <w:spacing w:line="360" w:lineRule="auto" w:before="0" w:after="0"/>
-        <w:ind w:firstLine="0" w:left="709"/>
-        <w:jc w:val="both"/>
-      </w:pPr>
-      <w:r>
-        <w:rPr>
-          <w:rFonts w:ascii="Times New Roman" w:hAnsi="Times New Roman" w:cs="Times New Roman" w:eastAsia="Times New Roman"/>
-          <w:sz w:val="28"/>
-        </w:rPr>
-        <w:t>• отсутствие референс-листа реализованных проектов и кейсов внедрения с конкретными показателями экономии и эффективности;</w:t>
-      </w:r>
-    </w:p>
-    <w:p>
-      <w:pPr>
-        <w:spacing w:line="360" w:lineRule="auto" w:before="0" w:after="0"/>
-        <w:ind w:firstLine="0" w:left="709"/>
-        <w:jc w:val="both"/>
-      </w:pPr>
-      <w:r>
-        <w:rPr>
-          <w:rFonts w:ascii="Times New Roman" w:hAnsi="Times New Roman" w:cs="Times New Roman" w:eastAsia="Times New Roman"/>
-          <w:sz w:val="28"/>
-        </w:rPr>
-        <w:t>• отсутствие отдельных посадочных страниц (landing pages) под целевые отрасли (нефтегазовая, химическая, металлургическая, энергетика);</w:t>
-      </w:r>
-    </w:p>
-    <w:p>
-      <w:pPr>
-        <w:spacing w:line="360" w:lineRule="auto" w:before="0" w:after="0"/>
-        <w:ind w:firstLine="0" w:left="709"/>
-        <w:jc w:val="both"/>
-      </w:pPr>
-      <w:r>
-        <w:rPr>
-          <w:rFonts w:ascii="Times New Roman" w:hAnsi="Times New Roman" w:cs="Times New Roman" w:eastAsia="Times New Roman"/>
-          <w:sz w:val="28"/>
-        </w:rPr>
-        <w:t>• отсутствие явных конверсионных элементов — кнопок «Запросить технико-коммерческое предложение», «Заказать обратный звонок», «Скачать опросный лист»;</w:t>
-      </w:r>
-    </w:p>
-    <w:p>
-      <w:pPr>
-        <w:spacing w:line="360" w:lineRule="auto" w:before="0" w:after="0"/>
-        <w:ind w:firstLine="0" w:left="709"/>
-        <w:jc w:val="both"/>
-      </w:pPr>
-      <w:r>
-        <w:rPr>
-          <w:rFonts w:ascii="Times New Roman" w:hAnsi="Times New Roman" w:cs="Times New Roman" w:eastAsia="Times New Roman"/>
-          <w:sz w:val="28"/>
-        </w:rPr>
-        <w:t>• отсутствие раздела с публикациями (статьи, обзоры, экспертные комментарии), который мог бы выступать инструментом контент-маркетинга и укреплять SEO-позиции сайта;</w:t>
-      </w:r>
-    </w:p>
-    <w:p>
-      <w:pPr>
-        <w:spacing w:line="360" w:lineRule="auto" w:before="0" w:after="0"/>
-        <w:ind w:firstLine="0" w:left="709"/>
-        <w:jc w:val="both"/>
-      </w:pPr>
-      <w:r>
-        <w:rPr>
-          <w:rFonts w:ascii="Times New Roman" w:hAnsi="Times New Roman" w:cs="Times New Roman" w:eastAsia="Times New Roman"/>
-          <w:sz w:val="28"/>
-        </w:rPr>
-        <w:t>• отсутствие чёткого блока «О компании», подкреплённого фактами (год основания, численность научного состава, перечень патентов, награды, членство в отраслевых ассоциациях);</w:t>
-      </w:r>
-    </w:p>
-    <w:p>
-      <w:pPr>
-        <w:spacing w:line="360" w:lineRule="auto" w:before="0" w:after="0"/>
-        <w:ind w:firstLine="0" w:left="709"/>
-        <w:jc w:val="both"/>
-      </w:pPr>
-      <w:r>
-        <w:rPr>
-          <w:rFonts w:ascii="Times New Roman" w:hAnsi="Times New Roman" w:cs="Times New Roman" w:eastAsia="Times New Roman"/>
-          <w:sz w:val="28"/>
-        </w:rPr>
-        <w:t>• отсутствие интеграции с системами веб-аналитики и форм сбора лидов; как следствие, предприятие не располагает достоверными данными о посещаемости сайта, географии посетителей, конверсии в обращения;</w:t>
-      </w:r>
-    </w:p>
-    <w:p>
-      <w:pPr>
-        <w:spacing w:line="360" w:lineRule="auto" w:before="0" w:after="0"/>
-        <w:ind w:firstLine="0" w:left="709"/>
-        <w:jc w:val="both"/>
-      </w:pPr>
-      <w:r>
-        <w:rPr>
-          <w:rFonts w:ascii="Times New Roman" w:hAnsi="Times New Roman" w:cs="Times New Roman" w:eastAsia="Times New Roman"/>
-          <w:sz w:val="28"/>
-        </w:rPr>
-        <w:t>• отсутствие адаптации под мобильные устройства, ограниченный контент в видео-формате и на иностранных языках (что особенно важно при работе с потенциальными зарубежными заказчиками из дружественных стран).</w:t>
+        <w:t>Бухгалтерский учёт в ООО «Фаст Инжиниринг» ведётся в соответствии с Федеральным законом от 06.12.2011 № 402-ФЗ «О бухгалтерском учёте», Положениями по бухгалтерскому учёту (ПБУ) и учётной политикой Общества. Общество применяет общую систему налогообложения; учёт ведётся в специализированной программе «1С: Бухгалтерия». Организационно-распорядительные, товаросопроводительные и иные необходимые документы оформляются с использованием автоматизированных систем; первичная документация архивируется на бумажных и электронных носителях.</w:t>
       </w:r>
     </w:p>
     <w:p>
@@ -7618,7 +7687,7 @@
           <w:rFonts w:ascii="Times New Roman" w:hAnsi="Times New Roman" w:cs="Times New Roman" w:eastAsia="Times New Roman"/>
           <w:sz w:val="28"/>
         </w:rPr>
-        <w:t>2. Поисковая оптимизация и контекстная реклама. Сайт fe1.ru, по данным открытых сервисов оценки видимости, имеет ограниченную видимость в поисковых системах по высокочастотным коммерческим запросам («каталитический реактор купить», «теплообменный аппарат поставщик», «энергосберегающее промышленное оборудование» и т. п.). Очевидно, что систематической работы по SEO (оптимизации структуры, метатегов, контента, технических параметров, наращиванию ссылочной массы) и платному продвижению в поисковых системах («Яндекс Директ») предприятием не ведётся.</w:t>
+        <w:t>Ценообразование на продукцию ООО «Фаст Инжиниринг» осуществляется индивидуально по каждому проекту, исходя из технических параметров оборудования, сложности проектирования, стоимости материалов и комплектующих, а также рыночной конъюнктуры по аналогичным решениям. В качестве укрупнённых ориентиров применяются нормативы трудозатрат на проектирование и базовые цены на узлы и материалы. Подобный механизм ценообразования предполагает индивидуальное согласование коммерческого предложения с каждым заказчиком и, как следствие, требует от рекламно-информационной работы не «ценовой», а «компетентностной» позиции — демонстрации экспертизы и подтверждённого опыта внедрения, а не публичных прайс-листов.</w:t>
       </w:r>
     </w:p>
     <w:p>
@@ -7632,7 +7701,7 @@
           <w:rFonts w:ascii="Times New Roman" w:hAnsi="Times New Roman" w:cs="Times New Roman" w:eastAsia="Times New Roman"/>
           <w:sz w:val="28"/>
         </w:rPr>
-        <w:t>3. Социальные сети и мессенджеры. Официальные сообщества ООО «Фаст Инжиниринг» в социальных сетях («ВКонтакте», Telegram-канал, Rutube), которые могли бы выполнять функцию контент-маркетинга, по результатам поиска не обнаружены. Это означает, что значительная часть профессиональной аудитории — главных инженеров, главных технологов, директоров по производству и закупкам — оказывается вне зоны рекламно-информационного воздействия предприятия.</w:t>
+        <w:t>В ходе обследования маркетинговой деятельности предприятия установлено, что в структуре управления Общества самостоятельная маркетинговая служба отсутствует: соответствующие функции распределены между президентом Общества (стратегические решения о продвижении и участие в ключевых переговорах) и сотрудниками коммерческого блока (текущее ведение клиентов, поддержка сайта, подготовка раздаточных материалов). Формальная маркетинговая стратегия и годовой медиаплан не разработаны; ключевые решения о коммуникациях принимаются преимущественно по инициативе руководителя в ситуативном порядке. Это положение дел соответствует масштабу микропредприятия, но одновременно не отвечает современным требованиям к управлению рекламно-информационной работой коммерческой организации, изложенным в первой главе настоящей работы.</w:t>
       </w:r>
     </w:p>
     <w:p>
@@ -7646,77 +7715,7 @@
           <w:rFonts w:ascii="Times New Roman" w:hAnsi="Times New Roman" w:cs="Times New Roman" w:eastAsia="Times New Roman"/>
           <w:sz w:val="28"/>
         </w:rPr>
-        <w:t>4. Отраслевая пресса и публикации. На сайте предприятия отсутствует раздел с архивом публикаций, что не позволяет оценить плотность присутствия Общества в отраслевой деловой и научно-технической прессе. Учитывая, что инжиниринговые компании обычно используют публикации в журналах «Нефтегазовая вертикаль», «Нефтегаз. Технологии», «Химическая промышленность», «Промышленная энергетика», «Газохимия» и в бюллетенях профильных ассоциаций как один из ключевых каналов формирования профессиональной репутации, отсутствие подобной работы — заметный пробел.</w:t>
-      </w:r>
-    </w:p>
-    <w:p>
-      <w:pPr>
-        <w:spacing w:line="360" w:lineRule="auto" w:before="0" w:after="0"/>
-        <w:ind w:firstLine="709"/>
-        <w:jc w:val="both"/>
-      </w:pPr>
-      <w:r>
-        <w:rPr>
-          <w:rFonts w:ascii="Times New Roman" w:hAnsi="Times New Roman" w:cs="Times New Roman" w:eastAsia="Times New Roman"/>
-          <w:sz w:val="28"/>
-        </w:rPr>
-        <w:t>5. Выставочно-ярмарочная деятельность. Профильные выставки в России — «Нефтегаз», «Химия», «Электро», «Газ. Нефть. Технологии», «Heat &amp; Power», «Экватек», «РусХимБиоСинтез» и др. — традиционно являются эффективным каналом B2B-продвижения для производителей промышленного оборудования. Систематическое участие ООО «Фаст Инжиниринг» в подобных мероприятиях по доступным открытым данным не подтверждается. С учётом масштаба предприятия и стоимости стендов на крупных выставках это может объясняться ресурсными ограничениями.</w:t>
-      </w:r>
-    </w:p>
-    <w:p>
-      <w:pPr>
-        <w:spacing w:line="360" w:lineRule="auto" w:before="0" w:after="0"/>
-        <w:ind w:firstLine="709"/>
-        <w:jc w:val="both"/>
-      </w:pPr>
-      <w:r>
-        <w:rPr>
-          <w:rFonts w:ascii="Times New Roman" w:hAnsi="Times New Roman" w:cs="Times New Roman" w:eastAsia="Times New Roman"/>
-          <w:sz w:val="28"/>
-        </w:rPr>
-        <w:t>6. Государственные закупки. По данным открытых источников, Общество участвовало в государственных закупках на общую сумму около 30 млн руб. (в трёх процедурах за всё время существования). Это говорит о том, что канал государственных и корпоративных закупок (на площадках zakupki.gov.ru, B2B-Center, ОТС и др.) предприятием освоен лишь в эпизодическом режиме.</w:t>
-      </w:r>
-    </w:p>
-    <w:p>
-      <w:pPr>
-        <w:spacing w:line="360" w:lineRule="auto" w:before="0" w:after="0"/>
-        <w:ind w:firstLine="709"/>
-        <w:jc w:val="both"/>
-      </w:pPr>
-      <w:r>
-        <w:rPr>
-          <w:rFonts w:ascii="Times New Roman" w:hAnsi="Times New Roman" w:cs="Times New Roman" w:eastAsia="Times New Roman"/>
-          <w:sz w:val="28"/>
-        </w:rPr>
-        <w:t>7. Прямые коммуникации и личные продажи. Основным реально работающим каналом привлечения клиентов в настоящее время, по всей видимости, остаются прямые контакты учредителя и коммерческих сотрудников: участие в технических совещаниях и круглых столах, личные контакты с главными инженерами и техническими директорами потенциальных заказчиков, рекомендации со стороны уже состоявшихся клиентов. Этот канал является высокоэффективным с точки зрения конверсии в сделку, но плохо масштабируем и крайне чувствителен к личной активности конкретных сотрудников.</w:t>
-      </w:r>
-    </w:p>
-    <w:p>
-      <w:pPr>
-        <w:spacing w:line="360" w:lineRule="auto" w:before="0" w:after="0"/>
-        <w:ind w:firstLine="709"/>
-        <w:jc w:val="both"/>
-      </w:pPr>
-      <w:r>
-        <w:rPr>
-          <w:rFonts w:ascii="Times New Roman" w:hAnsi="Times New Roman" w:cs="Times New Roman" w:eastAsia="Times New Roman"/>
-          <w:sz w:val="28"/>
-        </w:rPr>
-        <w:t>8. Печатные раздаточные материалы. На основании анализа сайта и публичных материалов можно предположить, что предприятие располагает корпоративными буклетами и каталогами оборудования, которые используются в ходе очных встреч с клиентами. Однако современная цифровая версия указанных материалов (интерактивный каталог, видеообзоры) на сайте предприятия не представлена.</w:t>
-      </w:r>
-    </w:p>
-    <w:p>
-      <w:pPr>
-        <w:spacing w:line="360" w:lineRule="auto" w:before="0" w:after="0"/>
-        <w:ind w:firstLine="709"/>
-        <w:jc w:val="both"/>
-      </w:pPr>
-      <w:r>
-        <w:rPr>
-          <w:rFonts w:ascii="Times New Roman" w:hAnsi="Times New Roman" w:cs="Times New Roman" w:eastAsia="Times New Roman"/>
-          <w:sz w:val="28"/>
-        </w:rPr>
-        <w:t>Сводная характеристика используемых каналов приведена в таблице 2.3.</w:t>
+        <w:t>Действующая в ООО «Фаст Инжиниринг» система рекламно-информационной работы характеризуется ограниченным набором каналов коммуникации и опорой на имеющиеся репутационные и профессиональные связи учредителя и сотрудников. Сводная характеристика используемых каналов представлена в таблице 2.4.</w:t>
       </w:r>
     </w:p>
     <w:p>
@@ -7731,7 +7730,7 @@
           <w:b/>
           <w:sz w:val="28"/>
         </w:rPr>
-        <w:t>Таблица 2.3 — Каналы рекламно-информационной работы ООО «Фаст Инжиниринг» (текущее состояние)</w:t>
+        <w:t>Таблица 2.4 — Каналы рекламно-информационной работы ООО «Фаст Инжиниринг» (текущее состояние)</w:t>
       </w:r>
     </w:p>
     <w:tbl>
@@ -8724,7 +8723,7 @@
           <w:rFonts w:ascii="Times New Roman" w:hAnsi="Times New Roman" w:cs="Times New Roman" w:eastAsia="Times New Roman"/>
           <w:sz w:val="28"/>
         </w:rPr>
-        <w:t>Источник: составлено автором по данным анализа сайта fe1.ru, открытых государственных реестров и материалов отрытых источников.</w:t>
+        <w:t>Источник: составлено автором по результатам производственной практики.</w:t>
       </w:r>
     </w:p>
     <w:p>
@@ -8738,7 +8737,135 @@
           <w:rFonts w:ascii="Times New Roman" w:hAnsi="Times New Roman" w:cs="Times New Roman" w:eastAsia="Times New Roman"/>
           <w:sz w:val="28"/>
         </w:rPr>
-        <w:t>Для систематизации текущего положения предприятия в области рекламно-информационной работы целесообразно использовать SWOT-анализ (таблица 2.4).</w:t>
+        <w:t>Основным каналом рекламно-информационной работы Общества является официальный сайт fe1.ru. Сайт выполняет функции «корпоративной витрины» и одновременно — основной точки входа для потенциальных заказчиков. По состоянию на дату исследования сайт содержит описание оборудования, технологий, контактные данные и форму обратной связи; стилистика выдержана единообразно, технические описания глубоки и убедительны. Вместе с тем, как информационный и продающий ресурс сайт обладает рядом существенных недостатков: отсутствие референс-листа реализованных проектов и кейсов внедрения с конкретными показателями экономии и эффективности; отсутствие отдельных посадочных страниц (landing pages) под целевые отрасли (нефтегазовая, химическая, металлургическая, энергетика); отсутствие явных конверсионных элементов — кнопок «Запросить технико-коммерческое предложение», «Заказать обратный звонок», «Скачать опросный лист»; отсутствие раздела с публикациями (статьи, обзоры, экспертные комментарии), который мог бы выступать инструментом контент-маркетинга и укреплять SEO-позиции сайта; отсутствие интеграции с системами веб-аналитики и форм сбора лидов; отсутствие адаптации под мобильные устройства, ограниченный контент в видео-формате и на иностранных языках.</w:t>
+      </w:r>
+    </w:p>
+    <w:p>
+      <w:pPr>
+        <w:spacing w:line="360" w:lineRule="auto" w:before="0" w:after="0"/>
+        <w:ind w:firstLine="709"/>
+        <w:jc w:val="both"/>
+      </w:pPr>
+      <w:r>
+        <w:rPr>
+          <w:rFonts w:ascii="Times New Roman" w:hAnsi="Times New Roman" w:cs="Times New Roman" w:eastAsia="Times New Roman"/>
+          <w:sz w:val="28"/>
+        </w:rPr>
+        <w:t>Сайт fe1.ru, по данным открытых сервисов оценки видимости, имеет ограниченную видимость в поисковых системах по высокочастотным коммерческим запросам («каталитический реактор купить», «теплообменный аппарат поставщик», «энергосберегающее промышленное оборудование» и т. п.); очевидно, что систематической работы по SEO и платному продвижению в поисковых системах («Яндекс Директ») предприятием не ведётся. Официальные сообщества ООО «Фаст Инжиниринг» в социальных сетях («ВКонтакте», Telegram-канал, Rutube), которые могли бы выполнять функцию контент-маркетинга, по результатам поиска не обнаружены. В отраслевой деловой и научно-технической прессе плотность присутствия Общества также ограничена; систематическое участие в специализированных выставках по доступным открытым данным не подтверждается, что может объясняться ресурсными ограничениями микропредприятия. Использование канала государственных и корпоративных закупок носит эпизодический характер: по данным открытых реестров, Общество участвовало в государственных закупках в трёх процедурах за всё время существования.</w:t>
+      </w:r>
+    </w:p>
+    <w:p>
+      <w:pPr>
+        <w:spacing w:line="360" w:lineRule="auto" w:before="0" w:after="0"/>
+        <w:ind w:firstLine="709"/>
+        <w:jc w:val="both"/>
+      </w:pPr>
+      <w:r>
+        <w:rPr>
+          <w:rFonts w:ascii="Times New Roman" w:hAnsi="Times New Roman" w:cs="Times New Roman" w:eastAsia="Times New Roman"/>
+          <w:sz w:val="28"/>
+        </w:rPr>
+        <w:t>Применительно к выявлению видов спроса и соответствующих им типов маркетинга, как это требуется образовательным стандартом (компетенция ПК 2.5), установлено, что спрос на инновационное промышленное оборудование носит целевой, рациональный характер, формируется в среде технических специалистов промышленных предприятий и характеризуется длительным циклом принятия решения о закупке. Адекватным типом маркетинга для ООО «Фаст Инжиниринг» является развивающий маркетинг (формирование спроса на новые конструкции оборудования) и ремаркетинг (поддержание интереса со стороны потенциальных заказчиков, ранее проявивших интерес к продукции). Обоснование целесообразности использования и применения маркетинговых коммуникаций (компетенция ПК 2.6) для предприятия указанного масштаба и профиля сосредоточено в плоскости интеграции цифровых каналов (SEO, контекстная реклама, контент-маркетинг, социальные сети) и систематизированной работы с офлайн-коммуникациями (отраслевая пресса, выставки) при одновременном внедрении инструментов измерения эффективности.</w:t>
+      </w:r>
+    </w:p>
+    <w:p>
+      <w:pPr>
+        <w:spacing w:line="360" w:lineRule="auto" w:before="0" w:after="0"/>
+        <w:ind w:firstLine="709"/>
+        <w:jc w:val="both"/>
+      </w:pPr>
+      <w:r>
+        <w:rPr>
+          <w:rFonts w:ascii="Times New Roman" w:hAnsi="Times New Roman" w:cs="Times New Roman" w:eastAsia="Times New Roman"/>
+          <w:i/>
+          <w:sz w:val="28"/>
+        </w:rPr>
+        <w:t>Организация коммерческой деятельности</w:t>
+      </w:r>
+    </w:p>
+    <w:p>
+      <w:pPr>
+        <w:spacing w:line="360" w:lineRule="auto" w:before="0" w:after="0"/>
+        <w:ind w:firstLine="709"/>
+        <w:jc w:val="both"/>
+      </w:pPr>
+      <w:r>
+        <w:rPr>
+          <w:rFonts w:ascii="Times New Roman" w:hAnsi="Times New Roman" w:cs="Times New Roman" w:eastAsia="Times New Roman"/>
+          <w:sz w:val="28"/>
+        </w:rPr>
+        <w:t>Деловые контакты с потенциальными заказчиками устанавливаются в ООО «Фаст Инжиниринг» преимущественно по инициативе предприятия — путём прямых обращений к техническим руководителям профильных промышленных предприятий, участия в отраслевых совещаниях и конференциях, личных коммуникаций руководителя Общества (компетенция ПК 1.1). Часть контактов формируется по линии входящих обращений через корпоративный сайт fe1.ru, а также по рекомендациям ранее обслуженных заказчиков. По итогам первоначальных переговоров проводятся технические совещания, на которых уточняются параметры будущего оборудования, после чего готовится технико-коммерческое предложение (ТКП). При согласовании условий стороны переходят к стадии заключения договора.</w:t>
+      </w:r>
+    </w:p>
+    <w:p>
+      <w:pPr>
+        <w:spacing w:line="360" w:lineRule="auto" w:before="0" w:after="0"/>
+        <w:ind w:firstLine="709"/>
+        <w:jc w:val="both"/>
+      </w:pPr>
+      <w:r>
+        <w:rPr>
+          <w:rFonts w:ascii="Times New Roman" w:hAnsi="Times New Roman" w:cs="Times New Roman" w:eastAsia="Times New Roman"/>
+          <w:sz w:val="28"/>
+        </w:rPr>
+        <w:t>Основной правовой формой оформления коммерческих отношений является договор поставки оборудования или договор подряда (в случае комплексной поставки оборудования с проектированием, монтажом и пусконаладкой). При оформлении договоров используются типовые формы Общества, дополняемые техническими приложениями. В договорах обязательно регламентируются: предмет, цена, порядок оплаты, сроки поставки, гарантийные обязательства, ответственность сторон, порядок приёмки и претензий, форс-мажор. Контроль исполнения договоров возлагается на руководителя проекта со стороны коммерческого блока с привлечением технических специалистов. Претензии и санкции к контрагентам предъявляются в соответствии с условиями договоров и нормами Гражданского кодекса РФ; в период практики автор с претензионными случаями не сталкивался.</w:t>
+      </w:r>
+    </w:p>
+    <w:p>
+      <w:pPr>
+        <w:spacing w:line="360" w:lineRule="auto" w:before="0" w:after="0"/>
+        <w:ind w:firstLine="709"/>
+        <w:jc w:val="both"/>
+      </w:pPr>
+      <w:r>
+        <w:rPr>
+          <w:rFonts w:ascii="Times New Roman" w:hAnsi="Times New Roman" w:cs="Times New Roman" w:eastAsia="Times New Roman"/>
+          <w:sz w:val="28"/>
+        </w:rPr>
+        <w:t>Сбытовая политика предприятия носит прямой адресный характер: продажи осуществляются непосредственно конечным заказчикам — крупным и средним промышленным предприятиям нефтегазовой, химической, металлургической и энергетической отраслей. Посреднические каналы сбыта (дилеры, дистрибьюторы) не используются, что обусловлено технической сложностью продукции, индивидуальным характером каждого проекта и необходимостью прямого взаимодействия с техническими службами заказчика (компетенция ПК 2.8). Конкурентоспособность продукции обеспечивается за счёт авторских патентованных конструкций оборудования, экономии энергоресурсов и снижения эксплуатационных затрат у заказчика, экологической безопасности предлагаемых решений и адаптивности под параметры конкретного технологического процесса.</w:t>
+      </w:r>
+    </w:p>
+    <w:p>
+      <w:pPr>
+        <w:spacing w:line="360" w:lineRule="auto" w:before="0" w:after="0"/>
+        <w:ind w:firstLine="709"/>
+        <w:jc w:val="both"/>
+      </w:pPr>
+      <w:r>
+        <w:rPr>
+          <w:rFonts w:ascii="Times New Roman" w:hAnsi="Times New Roman" w:cs="Times New Roman" w:eastAsia="Times New Roman"/>
+          <w:sz w:val="28"/>
+        </w:rPr>
+        <w:t>Принципиально важным для целей настоящей работы является следующий вывод, полученный по результатам обследования коммерческой деятельности предприятия: основным реально работающим каналом привлечения клиентов в настоящее время остаются прямые контакты учредителя и коммерческих сотрудников, тогда как доля обращений, поступающих через действующую систему рекламно-информационной работы (сайт, эпизодические публикации, печатные материалы), по экспертной оценке не превышает 10–15 %. Этот канал является высокоэффективным с точки зрения конверсии в сделку, но плохо масштабируем и крайне чувствителен к личной активности конкретных сотрудников, что в ситуации сокращения выручки (см. таблицу 2.3) ставит вопрос о критической необходимости расширения и формализации именно дистанционных каналов рекламно-информационной работы.</w:t>
+      </w:r>
+    </w:p>
+    <w:p>
+      <w:pPr>
+        <w:spacing w:line="360" w:lineRule="auto" w:before="0" w:after="0"/>
+        <w:ind w:firstLine="709"/>
+        <w:jc w:val="both"/>
+      </w:pPr>
+      <w:r>
+        <w:rPr>
+          <w:rFonts w:ascii="Times New Roman" w:hAnsi="Times New Roman" w:cs="Times New Roman" w:eastAsia="Times New Roman"/>
+          <w:i/>
+          <w:sz w:val="28"/>
+        </w:rPr>
+        <w:t>Сводная оценка организации в формате SWOT</w:t>
+      </w:r>
+    </w:p>
+    <w:p>
+      <w:pPr>
+        <w:spacing w:line="360" w:lineRule="auto" w:before="0" w:after="0"/>
+        <w:ind w:firstLine="709"/>
+        <w:jc w:val="both"/>
+      </w:pPr>
+      <w:r>
+        <w:rPr>
+          <w:rFonts w:ascii="Times New Roman" w:hAnsi="Times New Roman" w:cs="Times New Roman" w:eastAsia="Times New Roman"/>
+          <w:sz w:val="28"/>
+        </w:rPr>
+        <w:t>Для систематизации текущего положения предприятия в области рекламно-информационной работы целесообразно использовать SWOT-анализ (таблица 2.5).</w:t>
       </w:r>
     </w:p>
     <w:p>
@@ -8753,7 +8880,7 @@
           <w:b/>
           <w:sz w:val="28"/>
         </w:rPr>
-        <w:t>Таблица 2.4 — SWOT-анализ системы рекламно-информационной работы ООО «Фаст Инжиниринг»</w:t>
+        <w:t>Таблица 2.5 — SWOT-анализ системы рекламно-информационной работы ООО «Фаст Инжиниринг»</w:t>
       </w:r>
     </w:p>
     <w:tbl>
@@ -9311,7 +9438,7 @@
           <w:rFonts w:ascii="Times New Roman" w:hAnsi="Times New Roman" w:cs="Times New Roman" w:eastAsia="Times New Roman"/>
           <w:sz w:val="28"/>
         </w:rPr>
-        <w:t>Источник: составлено автором.</w:t>
+        <w:t>Источник: составлено автором по результатам производственной практики (преддипломной).</w:t>
       </w:r>
     </w:p>
     <w:p>
@@ -9325,7 +9452,7 @@
           <w:rFonts w:ascii="Times New Roman" w:hAnsi="Times New Roman" w:cs="Times New Roman" w:eastAsia="Times New Roman"/>
           <w:sz w:val="28"/>
         </w:rPr>
-        <w:t>Анализ матрицы SWOT показывает, что ключевые слабые стороны ООО «Фаст Инжиниринг» в области рекламно-информационной работы носят преимущественно организационный, а не финансовый или ресурсный характер: предприятие располагает мощным содержательным «фундаментом» (продукт, экспертиза, репутация), но не использует значительную часть доступных современных каналов коммуникации. Это создаёт благоприятные условия для последовательного расширения системы рекламно-информационной работы при относительно небольших дополнительных бюджетных затратах.</w:t>
+        <w:t>Анализ матрицы SWOT показывает, что ключевые слабые стороны ООО «Фаст Инжиниринг» в области рекламно-информационной работы носят преимущественно организационный, а не финансовый или ресурсный характер: предприятие располагает мощным содержательным «фундаментом» (продукт, экспертиза, репутация), но не использует значительную часть доступных современных каналов коммуникации. Это создаёт благоприятные условия для последовательного расширения системы рекламно-информационной работы при относительно небольших дополнительных бюджетных затратах. Количественная оценка эффективности действующей рекламно-информационной работы и формализованный перечень выявленных проблем рассматриваются в следующем параграфе.</w:t>
       </w:r>
     </w:p>
     <w:p>
@@ -9340,7 +9467,7 @@
           <w:b/>
           <w:sz w:val="28"/>
         </w:rPr>
-        <w:t>2.3. Оценка эффективности действующей рекламно-информационной работы и выявление проблем</w:t>
+        <w:t>2.3. Оценка эффективности рекламно-информационной работы ООО «Фаст Инжиниринг» и выявление проблем</w:t>
       </w:r>
     </w:p>
     <w:p>
@@ -9354,7 +9481,7 @@
           <w:rFonts w:ascii="Times New Roman" w:hAnsi="Times New Roman" w:cs="Times New Roman" w:eastAsia="Times New Roman"/>
           <w:sz w:val="28"/>
         </w:rPr>
-        <w:t>В рамках проведённого исследования была выполнена оценка эффективности действующей рекламно-информационной работы ООО «Фаст Инжиниринг» по двум направлениям — экономической и коммуникативной эффективности. С учётом ограниченности раскрываемой Обществом информации и микро-масштаба предприятия применялись косвенные показатели и экспертные оценки, основанные на данных открытых источников, анализе сайта и сопоставлении с типичными значениями показателей по B2B-сегменту промышленного оборудования.</w:t>
+        <w:t>Содержание настоящего параграфа основано на материалах, собранных в ходе выполнения задачи 5 индивидуального задания на производственную практику (преддипломную) — подбор материала в соответствии с темой выпускной квалификационной работы (период 12.05.2026 – 16.05.2026), а также на сводной систематизации данных, собранных при выполнении задач 1–4 практики. В рамках настоящего параграфа выполняется количественная и качественная оценка эффективности действующей рекламно-информационной работы предприятия и формулируется итоговый перечень проблем, образующий основу для разработки рекомендаций в третьей главе работы.</w:t>
       </w:r>
     </w:p>
     <w:p>
@@ -9366,9 +9493,24 @@
       <w:r>
         <w:rPr>
           <w:rFonts w:ascii="Times New Roman" w:hAnsi="Times New Roman" w:cs="Times New Roman" w:eastAsia="Times New Roman"/>
-          <w:sz w:val="28"/>
-        </w:rPr>
-        <w:t>Оценка экономической эффективности рекламно-информационной работы. В отсутствие выделенного рекламного бюджета и маркетингового учёта в Обществе классические показатели эффективности (CPL, CAC, ROMI) могут быть рассчитаны только условно. На основании косвенных данных можно сформировать следующую оценочную картину (таблица 2.5).</w:t>
+          <w:i/>
+          <w:sz w:val="28"/>
+        </w:rPr>
+        <w:t>Оценка экономической эффективности</w:t>
+      </w:r>
+    </w:p>
+    <w:p>
+      <w:pPr>
+        <w:spacing w:line="360" w:lineRule="auto" w:before="0" w:after="0"/>
+        <w:ind w:firstLine="709"/>
+        <w:jc w:val="both"/>
+      </w:pPr>
+      <w:r>
+        <w:rPr>
+          <w:rFonts w:ascii="Times New Roman" w:hAnsi="Times New Roman" w:cs="Times New Roman" w:eastAsia="Times New Roman"/>
+          <w:sz w:val="28"/>
+        </w:rPr>
+        <w:t>В отсутствие выделенного рекламного бюджета и маркетингового учёта в Обществе классические показатели эффективности (CPL, CAC, ROMI) могут быть рассчитаны только условно. На основании косвенных данных, собранных в ходе практики, формируется следующая оценочная картина (таблица 2.6).</w:t>
       </w:r>
     </w:p>
     <w:p>
@@ -9383,7 +9525,7 @@
           <w:b/>
           <w:sz w:val="28"/>
         </w:rPr>
-        <w:t>Таблица 2.5 — Оценка показателей экономической эффективности рекламно-информационной работы ООО «Фаст Инжиниринг» в 2024 г. (расчётно)</w:t>
+        <w:t>Таблица 2.6 — Оценка показателей экономической эффективности рекламно-информационной работы ООО «Фаст Инжиниринг» в 2024 г. (расчётно)</w:t>
       </w:r>
     </w:p>
     <w:tbl>
@@ -9916,7 +10058,7 @@
           <w:rFonts w:ascii="Times New Roman" w:hAnsi="Times New Roman" w:cs="Times New Roman" w:eastAsia="Times New Roman"/>
           <w:sz w:val="28"/>
         </w:rPr>
-        <w:t>Источник: расчёты автора на основе данных бухгалтерской отчётности и открытых источников. Точные значения подлежат уточнению по внутренним данным предприятия.</w:t>
+        <w:t>Источник: расчёты автора. Точные значения подлежат уточнению по внутренним данным предприятия.</w:t>
       </w:r>
     </w:p>
     <w:p>
@@ -9930,7 +10072,7 @@
           <w:rFonts w:ascii="Times New Roman" w:hAnsi="Times New Roman" w:cs="Times New Roman" w:eastAsia="Times New Roman"/>
           <w:sz w:val="28"/>
         </w:rPr>
-        <w:t>Расчёты показывают, что в 2024 г. рекламно-информационная работа ООО «Фаст Инжиниринг» оказалась экономически неэффективной: при условном бюджете 50–80 тыс. руб. совокупная выручка составила лишь 375 тыс. руб., чистый результат — отрицательный, рентабельность маркетинговых инвестиций — отрицательная. В то же время следует учитывать, что в B2B-сегменте сложного инжинирингового оборудования эффект рекламных мероприятий имеет существенно отложенный характер и одного года недостаточно для корректного расчёта ROMI. Более обоснованной является оценка на горизонте 2–3 лет, однако даже в этом случае динамика выручки 2022–2024 гг. (6 200 → 5 605 → 375 тыс. руб.) свидетельствует об устойчивой отрицательной тенденции, не компенсируемой текущей системой рекламно-информационной работы.</w:t>
+        <w:t>Расчёты показывают, что в 2024 г. рекламно-информационная работа ООО «Фаст Инжиниринг» оказалась экономически неэффективной: при условном бюджете 50–80 тыс. руб. совокупная выручка составила лишь 375 тыс. руб., чистый результат — отрицательный, рентабельность маркетинговых инвестиций — отрицательная. В то же время следует учитывать, что в B2B-сегменте сложного инжинирингового оборудования эффект рекламных мероприятий имеет существенно отложенный характер и одного года недостаточно для корректного расчёта ROMI; более обоснованной является оценка на горизонте двух-трёх лет, однако даже в этом случае динамика выручки 2022–2024 гг. (6 200 → 5 605 → 375 тыс. руб.) свидетельствует об устойчивой отрицательной тенденции, не компенсируемой текущей системой рекламно-информационной работы.</w:t>
       </w:r>
     </w:p>
     <w:p>
@@ -9942,9 +10084,24 @@
       <w:r>
         <w:rPr>
           <w:rFonts w:ascii="Times New Roman" w:hAnsi="Times New Roman" w:cs="Times New Roman" w:eastAsia="Times New Roman"/>
-          <w:sz w:val="28"/>
-        </w:rPr>
-        <w:t>Оценка коммуникативной эффективности. Прямые количественные показатели коммуникативной эффективности рекламно-информационной работы предприятия (охват, частота, узнаваемость, запоминаемость) систематически не измеряются. На основе анализа цифрового присутствия Общества можно сформировать следующую оценку (таблица 2.6).</w:t>
+          <w:i/>
+          <w:sz w:val="28"/>
+        </w:rPr>
+        <w:t>Оценка коммуникативной эффективности</w:t>
+      </w:r>
+    </w:p>
+    <w:p>
+      <w:pPr>
+        <w:spacing w:line="360" w:lineRule="auto" w:before="0" w:after="0"/>
+        <w:ind w:firstLine="709"/>
+        <w:jc w:val="both"/>
+      </w:pPr>
+      <w:r>
+        <w:rPr>
+          <w:rFonts w:ascii="Times New Roman" w:hAnsi="Times New Roman" w:cs="Times New Roman" w:eastAsia="Times New Roman"/>
+          <w:sz w:val="28"/>
+        </w:rPr>
+        <w:t>Прямые количественные показатели коммуникативной эффективности рекламно-информационной работы предприятия (охват, частота, узнаваемость, запоминаемость) систематически не измеряются. На основе анализа цифрового присутствия Общества формируется следующая оценка (таблица 2.7).</w:t>
       </w:r>
     </w:p>
     <w:p>
@@ -9959,7 +10116,7 @@
           <w:b/>
           <w:sz w:val="28"/>
         </w:rPr>
-        <w:t>Таблица 2.6 — Оценка коммуникативной эффективности рекламно-информационной работы ООО «Фаст Инжиниринг»</w:t>
+        <w:t>Таблица 2.7 — Оценка коммуникативной эффективности рекламно-информационной работы ООО «Фаст Инжиниринг»</w:t>
       </w:r>
     </w:p>
     <w:tbl>
@@ -10394,7 +10551,7 @@
           <w:rFonts w:ascii="Times New Roman" w:hAnsi="Times New Roman" w:cs="Times New Roman" w:eastAsia="Times New Roman"/>
           <w:sz w:val="28"/>
         </w:rPr>
-        <w:t>1) Attention (внимание) — этап критически слабый: основная масса представителей целевой аудитории даже не знает о существовании предприятия и его продуктов; цифровое присутствие минимально, узнаваемость низкая;</w:t>
+        <w:t>• Attention (внимание) — этап критически слабый: основная масса представителей целевой аудитории даже не знает о существовании предприятия и его продуктов; цифровое присутствие минимально, узнаваемость низкая;</w:t>
       </w:r>
     </w:p>
     <w:p>
@@ -10408,7 +10565,7 @@
           <w:rFonts w:ascii="Times New Roman" w:hAnsi="Times New Roman" w:cs="Times New Roman" w:eastAsia="Times New Roman"/>
           <w:sz w:val="28"/>
         </w:rPr>
-        <w:t>2) Interest (интерес) — для тех немногих, кто всё же попадает на сайт, интерес может быть сформирован: технические описания продукции содержательны и убедительны;</w:t>
+        <w:t>• Interest (интерес) — для тех немногих, кто всё же попадает на сайт, интерес может быть сформирован: технические описания продукции содержательны и убедительны;</w:t>
       </w:r>
     </w:p>
     <w:p>
@@ -10422,7 +10579,7 @@
           <w:rFonts w:ascii="Times New Roman" w:hAnsi="Times New Roman" w:cs="Times New Roman" w:eastAsia="Times New Roman"/>
           <w:sz w:val="28"/>
         </w:rPr>
-        <w:t>3) Desire (желание) — формируется фрагментарно: на сайте отсутствуют референс-кейсы, отзывы заказчиков, расчёты эффективности на типовых задачах, видеообзоры внедрений, в результате чего потенциальный клиент с трудом представляет результат сотрудничества;</w:t>
+        <w:t>• Desire (желание) — формируется фрагментарно: на сайте отсутствуют референс-кейсы, отзывы заказчиков, расчёты эффективности на типовых задачах, видеообзоры внедрений, в результате чего потенциальный клиент с трудом представляет результат сотрудничества;</w:t>
       </w:r>
     </w:p>
     <w:p>
@@ -10436,7 +10593,7 @@
           <w:rFonts w:ascii="Times New Roman" w:hAnsi="Times New Roman" w:cs="Times New Roman" w:eastAsia="Times New Roman"/>
           <w:sz w:val="28"/>
         </w:rPr>
-        <w:t>4) Action (действие) — конверсионные элементы на сайте развиты слабо, сама по себе форма обратной связи не превращена в инструмент квалификации лида (нет полей для описания задачи, отрасли, технических параметров).</w:t>
+        <w:t>• Action (действие) — конверсионные элементы на сайте развиты слабо, сама по себе форма обратной связи не превращена в инструмент квалификации лида (нет полей для описания задачи, отрасли, технических параметров).</w:t>
       </w:r>
     </w:p>
     <w:p>
@@ -10462,9 +10619,24 @@
       <w:r>
         <w:rPr>
           <w:rFonts w:ascii="Times New Roman" w:hAnsi="Times New Roman" w:cs="Times New Roman" w:eastAsia="Times New Roman"/>
-          <w:sz w:val="28"/>
-        </w:rPr>
-        <w:t>Итоговые проблемы, выявленные в ходе анализа рекламно-информационной работы ООО «Фаст Инжиниринг», сгруппированы следующим образом:</w:t>
+          <w:i/>
+          <w:sz w:val="28"/>
+        </w:rPr>
+        <w:t>Итоговый перечень проблем</w:t>
+      </w:r>
+    </w:p>
+    <w:p>
+      <w:pPr>
+        <w:spacing w:line="360" w:lineRule="auto" w:before="0" w:after="0"/>
+        <w:ind w:firstLine="709"/>
+        <w:jc w:val="both"/>
+      </w:pPr>
+      <w:r>
+        <w:rPr>
+          <w:rFonts w:ascii="Times New Roman" w:hAnsi="Times New Roman" w:cs="Times New Roman" w:eastAsia="Times New Roman"/>
+          <w:sz w:val="28"/>
+        </w:rPr>
+        <w:t>Итоговые проблемы рекламно-информационной работы ООО «Фаст Инжиниринг», выявленные в ходе анализа и подкреплённые материалами производственной практики (преддипломной), сгруппированы следующим образом:</w:t>
       </w:r>
     </w:p>
     <w:p>
@@ -10478,7 +10650,7 @@
           <w:rFonts w:ascii="Times New Roman" w:hAnsi="Times New Roman" w:cs="Times New Roman" w:eastAsia="Times New Roman"/>
           <w:sz w:val="28"/>
         </w:rPr>
-        <w:t>1) Организационно-управленческие проблемы:</w:t>
+        <w:t>1) Организационно-управленческие проблемы: отсутствие выделенной маркетинговой функции и формализованной стратегии рекламно-информационной работы; отсутствие годового медиаплана и плана-графика рекламных мероприятий; отсутствие зафиксированных KPI рекламно-информационной работы и системы их регулярного мониторинга.</w:t>
       </w:r>
     </w:p>
     <w:p>
@@ -10492,7 +10664,7 @@
           <w:rFonts w:ascii="Times New Roman" w:hAnsi="Times New Roman" w:cs="Times New Roman" w:eastAsia="Times New Roman"/>
           <w:sz w:val="28"/>
         </w:rPr>
-        <w:t>• отсутствие выделенной маркетинговой функции и формализованной стратегии рекламно-информационной работы;</w:t>
+        <w:t>2) Проблемы цифрового присутствия: устаревший с точки зрения UX и конверсии корпоративный сайт; отсутствие SEO-стратегии и платного продвижения в поиске; отсутствие представительства в социальных сетях и мессенджерах; отсутствие систем веб-аналитики и сквозной аналитики; отсутствие контент-маркетинга (блога, кейсов, экспертных статей).</w:t>
       </w:r>
     </w:p>
     <w:p>
@@ -10506,7 +10678,7 @@
           <w:rFonts w:ascii="Times New Roman" w:hAnsi="Times New Roman" w:cs="Times New Roman" w:eastAsia="Times New Roman"/>
           <w:sz w:val="28"/>
         </w:rPr>
-        <w:t>• отсутствие годового медиаплана и плана-графика рекламных мероприятий;</w:t>
+        <w:t>3) Проблемы офлайн-коммуникаций: недостаточная активность в отраслевой деловой прессе; несистематическое участие в специализированных выставках и конференциях; отсутствие современных мультимедийных презентационных материалов (видеоролики, 3D-визуализация оборудования, интерактивный каталог).</w:t>
       </w:r>
     </w:p>
     <w:p>
@@ -10520,7 +10692,7 @@
           <w:rFonts w:ascii="Times New Roman" w:hAnsi="Times New Roman" w:cs="Times New Roman" w:eastAsia="Times New Roman"/>
           <w:sz w:val="28"/>
         </w:rPr>
-        <w:t>• отсутствие зафиксированных KPI рекламно-информационной работы и системы их регулярного мониторинга.</w:t>
+        <w:t>4) Проблемы коммерческого блока: высокая зависимость продаж от личной активности учредителя и единичных сотрудников; отсутствие референс-листа реализованных проектов как ключевого элемента доверия в B2B-сегменте; низкая конверсия из обращений в коммерческие предложения и из коммерческих предложений в договоры (в силу отсутствия структурированного процесса).</w:t>
       </w:r>
     </w:p>
     <w:p>
@@ -10534,245 +10706,7 @@
           <w:rFonts w:ascii="Times New Roman" w:hAnsi="Times New Roman" w:cs="Times New Roman" w:eastAsia="Times New Roman"/>
           <w:sz w:val="28"/>
         </w:rPr>
-        <w:t>2) Проблемы цифрового присутствия:</w:t>
-      </w:r>
-    </w:p>
-    <w:p>
-      <w:pPr>
-        <w:spacing w:line="360" w:lineRule="auto" w:before="0" w:after="0"/>
-        <w:ind w:firstLine="0" w:left="709"/>
-        <w:jc w:val="both"/>
-      </w:pPr>
-      <w:r>
-        <w:rPr>
-          <w:rFonts w:ascii="Times New Roman" w:hAnsi="Times New Roman" w:cs="Times New Roman" w:eastAsia="Times New Roman"/>
-          <w:sz w:val="28"/>
-        </w:rPr>
-        <w:t>• устаревший с точки зрения UX и конверсии корпоративный сайт;</w:t>
-      </w:r>
-    </w:p>
-    <w:p>
-      <w:pPr>
-        <w:spacing w:line="360" w:lineRule="auto" w:before="0" w:after="0"/>
-        <w:ind w:firstLine="0" w:left="709"/>
-        <w:jc w:val="both"/>
-      </w:pPr>
-      <w:r>
-        <w:rPr>
-          <w:rFonts w:ascii="Times New Roman" w:hAnsi="Times New Roman" w:cs="Times New Roman" w:eastAsia="Times New Roman"/>
-          <w:sz w:val="28"/>
-        </w:rPr>
-        <w:t>• отсутствие SEO-стратегии и платного продвижения в поиске;</w:t>
-      </w:r>
-    </w:p>
-    <w:p>
-      <w:pPr>
-        <w:spacing w:line="360" w:lineRule="auto" w:before="0" w:after="0"/>
-        <w:ind w:firstLine="0" w:left="709"/>
-        <w:jc w:val="both"/>
-      </w:pPr>
-      <w:r>
-        <w:rPr>
-          <w:rFonts w:ascii="Times New Roman" w:hAnsi="Times New Roman" w:cs="Times New Roman" w:eastAsia="Times New Roman"/>
-          <w:sz w:val="28"/>
-        </w:rPr>
-        <w:t>• отсутствие представительства в социальных сетях и мессенджерах;</w:t>
-      </w:r>
-    </w:p>
-    <w:p>
-      <w:pPr>
-        <w:spacing w:line="360" w:lineRule="auto" w:before="0" w:after="0"/>
-        <w:ind w:firstLine="0" w:left="709"/>
-        <w:jc w:val="both"/>
-      </w:pPr>
-      <w:r>
-        <w:rPr>
-          <w:rFonts w:ascii="Times New Roman" w:hAnsi="Times New Roman" w:cs="Times New Roman" w:eastAsia="Times New Roman"/>
-          <w:sz w:val="28"/>
-        </w:rPr>
-        <w:t>• отсутствие систем веб-аналитики и сквозной аналитики;</w:t>
-      </w:r>
-    </w:p>
-    <w:p>
-      <w:pPr>
-        <w:spacing w:line="360" w:lineRule="auto" w:before="0" w:after="0"/>
-        <w:ind w:firstLine="0" w:left="709"/>
-        <w:jc w:val="both"/>
-      </w:pPr>
-      <w:r>
-        <w:rPr>
-          <w:rFonts w:ascii="Times New Roman" w:hAnsi="Times New Roman" w:cs="Times New Roman" w:eastAsia="Times New Roman"/>
-          <w:sz w:val="28"/>
-        </w:rPr>
-        <w:t>• отсутствие контент-маркетинга (блога, кейсов, экспертных статей).</w:t>
-      </w:r>
-    </w:p>
-    <w:p>
-      <w:pPr>
-        <w:spacing w:line="360" w:lineRule="auto" w:before="0" w:after="0"/>
-        <w:ind w:firstLine="0" w:left="709"/>
-        <w:jc w:val="both"/>
-      </w:pPr>
-      <w:r>
-        <w:rPr>
-          <w:rFonts w:ascii="Times New Roman" w:hAnsi="Times New Roman" w:cs="Times New Roman" w:eastAsia="Times New Roman"/>
-          <w:sz w:val="28"/>
-        </w:rPr>
-        <w:t>3) Проблемы офлайн-коммуникаций:</w:t>
-      </w:r>
-    </w:p>
-    <w:p>
-      <w:pPr>
-        <w:spacing w:line="360" w:lineRule="auto" w:before="0" w:after="0"/>
-        <w:ind w:firstLine="0" w:left="709"/>
-        <w:jc w:val="both"/>
-      </w:pPr>
-      <w:r>
-        <w:rPr>
-          <w:rFonts w:ascii="Times New Roman" w:hAnsi="Times New Roman" w:cs="Times New Roman" w:eastAsia="Times New Roman"/>
-          <w:sz w:val="28"/>
-        </w:rPr>
-        <w:t>• недостаточная активность в отраслевой деловой прессе;</w:t>
-      </w:r>
-    </w:p>
-    <w:p>
-      <w:pPr>
-        <w:spacing w:line="360" w:lineRule="auto" w:before="0" w:after="0"/>
-        <w:ind w:firstLine="0" w:left="709"/>
-        <w:jc w:val="both"/>
-      </w:pPr>
-      <w:r>
-        <w:rPr>
-          <w:rFonts w:ascii="Times New Roman" w:hAnsi="Times New Roman" w:cs="Times New Roman" w:eastAsia="Times New Roman"/>
-          <w:sz w:val="28"/>
-        </w:rPr>
-        <w:t>• несистематическое участие в специализированных выставках и конференциях;</w:t>
-      </w:r>
-    </w:p>
-    <w:p>
-      <w:pPr>
-        <w:spacing w:line="360" w:lineRule="auto" w:before="0" w:after="0"/>
-        <w:ind w:firstLine="0" w:left="709"/>
-        <w:jc w:val="both"/>
-      </w:pPr>
-      <w:r>
-        <w:rPr>
-          <w:rFonts w:ascii="Times New Roman" w:hAnsi="Times New Roman" w:cs="Times New Roman" w:eastAsia="Times New Roman"/>
-          <w:sz w:val="28"/>
-        </w:rPr>
-        <w:t>• отсутствие современных мультимедийных презентационных материалов (видеоролики, 3D-визуализация оборудования, интерактивный каталог).</w:t>
-      </w:r>
-    </w:p>
-    <w:p>
-      <w:pPr>
-        <w:spacing w:line="360" w:lineRule="auto" w:before="0" w:after="0"/>
-        <w:ind w:firstLine="0" w:left="709"/>
-        <w:jc w:val="both"/>
-      </w:pPr>
-      <w:r>
-        <w:rPr>
-          <w:rFonts w:ascii="Times New Roman" w:hAnsi="Times New Roman" w:cs="Times New Roman" w:eastAsia="Times New Roman"/>
-          <w:sz w:val="28"/>
-        </w:rPr>
-        <w:t>4) Проблемы коммерческого блока:</w:t>
-      </w:r>
-    </w:p>
-    <w:p>
-      <w:pPr>
-        <w:spacing w:line="360" w:lineRule="auto" w:before="0" w:after="0"/>
-        <w:ind w:firstLine="0" w:left="709"/>
-        <w:jc w:val="both"/>
-      </w:pPr>
-      <w:r>
-        <w:rPr>
-          <w:rFonts w:ascii="Times New Roman" w:hAnsi="Times New Roman" w:cs="Times New Roman" w:eastAsia="Times New Roman"/>
-          <w:sz w:val="28"/>
-        </w:rPr>
-        <w:t>• высокая зависимость продаж от личной активности учредителя и единичных сотрудников;</w:t>
-      </w:r>
-    </w:p>
-    <w:p>
-      <w:pPr>
-        <w:spacing w:line="360" w:lineRule="auto" w:before="0" w:after="0"/>
-        <w:ind w:firstLine="0" w:left="709"/>
-        <w:jc w:val="both"/>
-      </w:pPr>
-      <w:r>
-        <w:rPr>
-          <w:rFonts w:ascii="Times New Roman" w:hAnsi="Times New Roman" w:cs="Times New Roman" w:eastAsia="Times New Roman"/>
-          <w:sz w:val="28"/>
-        </w:rPr>
-        <w:t>• отсутствие референс-листа реализованных проектов как ключевого элемента доверия в B2B-сегменте;</w:t>
-      </w:r>
-    </w:p>
-    <w:p>
-      <w:pPr>
-        <w:spacing w:line="360" w:lineRule="auto" w:before="0" w:after="0"/>
-        <w:ind w:firstLine="0" w:left="709"/>
-        <w:jc w:val="both"/>
-      </w:pPr>
-      <w:r>
-        <w:rPr>
-          <w:rFonts w:ascii="Times New Roman" w:hAnsi="Times New Roman" w:cs="Times New Roman" w:eastAsia="Times New Roman"/>
-          <w:sz w:val="28"/>
-        </w:rPr>
-        <w:t>• низкая конверсия из обращений в коммерческие предложения и из коммерческих предложений в договоры (в силу отсутствия структурированного процесса).</w:t>
-      </w:r>
-    </w:p>
-    <w:p>
-      <w:pPr>
-        <w:spacing w:line="360" w:lineRule="auto" w:before="0" w:after="0"/>
-        <w:ind w:firstLine="0" w:left="709"/>
-        <w:jc w:val="both"/>
-      </w:pPr>
-      <w:r>
-        <w:rPr>
-          <w:rFonts w:ascii="Times New Roman" w:hAnsi="Times New Roman" w:cs="Times New Roman" w:eastAsia="Times New Roman"/>
-          <w:sz w:val="28"/>
-        </w:rPr>
-        <w:t>5) Проблемы измеримости эффективности:</w:t>
-      </w:r>
-    </w:p>
-    <w:p>
-      <w:pPr>
-        <w:spacing w:line="360" w:lineRule="auto" w:before="0" w:after="0"/>
-        <w:ind w:firstLine="0" w:left="709"/>
-        <w:jc w:val="both"/>
-      </w:pPr>
-      <w:r>
-        <w:rPr>
-          <w:rFonts w:ascii="Times New Roman" w:hAnsi="Times New Roman" w:cs="Times New Roman" w:eastAsia="Times New Roman"/>
-          <w:sz w:val="28"/>
-        </w:rPr>
-        <w:t>• отсутствие маркетингового учёта расходов на рекламно-информационную работу по каналам;</w:t>
-      </w:r>
-    </w:p>
-    <w:p>
-      <w:pPr>
-        <w:spacing w:line="360" w:lineRule="auto" w:before="0" w:after="0"/>
-        <w:ind w:firstLine="0" w:left="709"/>
-        <w:jc w:val="both"/>
-      </w:pPr>
-      <w:r>
-        <w:rPr>
-          <w:rFonts w:ascii="Times New Roman" w:hAnsi="Times New Roman" w:cs="Times New Roman" w:eastAsia="Times New Roman"/>
-          <w:sz w:val="28"/>
-        </w:rPr>
-        <w:t>• невозможность раздельной оценки эффективности отдельных каналов;</w:t>
-      </w:r>
-    </w:p>
-    <w:p>
-      <w:pPr>
-        <w:spacing w:line="360" w:lineRule="auto" w:before="0" w:after="0"/>
-        <w:ind w:firstLine="0" w:left="709"/>
-        <w:jc w:val="both"/>
-      </w:pPr>
-      <w:r>
-        <w:rPr>
-          <w:rFonts w:ascii="Times New Roman" w:hAnsi="Times New Roman" w:cs="Times New Roman" w:eastAsia="Times New Roman"/>
-          <w:sz w:val="28"/>
-        </w:rPr>
-        <w:t>• отсутствие данных для расчёта классических показателей эффективности (CPL, CAC, ROMI, LTV).</w:t>
+        <w:t>5) Проблемы измеримости эффективности: отсутствие маркетингового учёта расходов на рекламно-информационную работу по каналам; невозможность раздельной оценки эффективности отдельных каналов; отсутствие данных для расчёта классических показателей эффективности (CPL, CAC, ROMI, LTV).</w:t>
       </w:r>
     </w:p>
     <w:p>
@@ -10786,7 +10720,7 @@
           <w:rFonts w:ascii="Times New Roman" w:hAnsi="Times New Roman" w:cs="Times New Roman" w:eastAsia="Times New Roman"/>
           <w:sz w:val="28"/>
         </w:rPr>
-        <w:t>Совокупность выявленных проблем свидетельствует о том, что текущее состояние рекламно-информационной работы ООО «Фаст Инжиниринг» не обеспечивает устойчивого формирования входящего потока заявок и не поддерживает необходимый для микропредприятия с инновационной продукцией уровень присутствия в информационном поле целевых отраслей. С учётом резкого падения выручки в 2024 г. модернизация рекламно-информационной работы становится одним из критических факторов восстановления коммерческой результативности предприятия.</w:t>
+        <w:t>Совокупность выявленных проблем свидетельствует о том, что текущее состояние рекламно-информационной работы ООО «Фаст Инжиниринг» не обеспечивает устойчивого формирования входящего потока заявок и не поддерживает необходимый для микропредприятия с инновационной продукцией уровень присутствия в информационном поле целевых отраслей. С учётом резкого падения выручки в 2024 г. модернизация рекламно-информационной работы становится одним из критических факторов восстановления коммерческой результативности предприятия. В то же время сильные стороны ООО «Фаст Инжиниринг» (уникальная инновационная продукция, защищённая патентами, реальная экономия для заказчика, импортозамещающий характер решений) создают благоприятную содержательную основу для построения современной рекламно-информационной работы.</w:t>
       </w:r>
     </w:p>
     <w:p>
@@ -10798,9 +10732,584 @@
       <w:r>
         <w:rPr>
           <w:rFonts w:ascii="Times New Roman" w:hAnsi="Times New Roman" w:cs="Times New Roman" w:eastAsia="Times New Roman"/>
-          <w:sz w:val="28"/>
-        </w:rPr>
-        <w:t>В то же время, сильные стороны ООО «Фаст Инжиниринг» — уникальная инновационная продукция, защищённая патентами, реальная экономия для заказчика, импортозамещающий характер решений — создают благоприятную содержательную основу для построения современной рекламно-информационной работы. Задача состоит в том, чтобы дополнить эту содержательную основу актуальными цифровыми и коммуникационными инструментами и обеспечить системность, измеримость и последовательность их применения. Конкретные направления и мероприятия, направленные на решение выявленных проблем, рассмотрены в следующей главе настоящей дипломной работы.</w:t>
+          <w:b/>
+          <w:sz w:val="28"/>
+        </w:rPr>
+        <w:t>Выводы по второй главе</w:t>
+      </w:r>
+    </w:p>
+    <w:p>
+      <w:pPr>
+        <w:spacing w:line="360" w:lineRule="auto" w:before="0" w:after="0"/>
+        <w:ind w:firstLine="709"/>
+        <w:jc w:val="both"/>
+      </w:pPr>
+      <w:r>
+        <w:rPr>
+          <w:rFonts w:ascii="Times New Roman" w:hAnsi="Times New Roman" w:cs="Times New Roman" w:eastAsia="Times New Roman"/>
+          <w:sz w:val="28"/>
+        </w:rPr>
+        <w:t>В соответствии с задачами настоящего исследования и материалами, собранными в ходе производственной практики (преддипломной) на ООО «Фаст Инжиниринг», во второй главе работы получены следующие основные результаты.</w:t>
+      </w:r>
+    </w:p>
+    <w:p>
+      <w:pPr>
+        <w:spacing w:line="360" w:lineRule="auto" w:before="0" w:after="0"/>
+        <w:ind w:firstLine="709"/>
+        <w:jc w:val="both"/>
+      </w:pPr>
+      <w:r>
+        <w:rPr>
+          <w:rFonts w:ascii="Times New Roman" w:hAnsi="Times New Roman" w:cs="Times New Roman" w:eastAsia="Times New Roman"/>
+          <w:sz w:val="28"/>
+        </w:rPr>
+        <w:t>По первой задаче главы — дать организационно-экономическую характеристику предприятия (параграф 2.1). ООО «Фаст Инжиниринг» представляет собой типичное микропредприятие B2B-сегмента, специализирующееся на разработке и поставке инновационного промышленного оборудования (насос Астановского, теплообменные и массообменные аппараты, каталитические реакторы, компрессоры, рекуператоры тепла, беспламенные горелки, водородные технологии и комплексные технологические решения). Предприятие располагает собственными патентами Российской Федерации, многолетней отраслевой экспертизой и устойчивой репутацией в узких профессиональных кругах. Финансово-экономический анализ за 2022–2024 гг. показал резкое ухудшение результатов в 2024 г. (снижение выручки в 14 раз, чистый убыток), причина которого носит сбытовой характер и связана с недостаточностью канала привлечения новых заказчиков. Указанная задача основана на материалах задач 1 и 4 индивидуального задания на практику.</w:t>
+      </w:r>
+    </w:p>
+    <w:p>
+      <w:pPr>
+        <w:spacing w:line="360" w:lineRule="auto" w:before="0" w:after="0"/>
+        <w:ind w:firstLine="709"/>
+        <w:jc w:val="both"/>
+      </w:pPr>
+      <w:r>
+        <w:rPr>
+          <w:rFonts w:ascii="Times New Roman" w:hAnsi="Times New Roman" w:cs="Times New Roman" w:eastAsia="Times New Roman"/>
+          <w:sz w:val="28"/>
+        </w:rPr>
+        <w:t>По второй задаче главы — проанализировать организацию экономической, маркетинговой и коммерческой деятельности предприятия и его действующую систему рекламно-информационной работы (параграф 2.2). Установлено, что в Обществе отсутствует самостоятельная маркетинговая служба и формализованная стратегия рекламно-информационной работы. Используемые каналы коммуникации ограничены, ключевыми из них являются корпоративный сайт fe1.ru и прямые личные контакты руководителя и коммерческого персонала. Современные цифровые каналы (контекстная реклама, социальные сети, контент-маркетинг, видеохостинги, сквозная аналитика) фактически не применяются. Сбытовая политика построена на прямом адресном взаимодействии с конечными промышленными заказчиками, что обеспечивает высокое качество отработки сделок, но плохо масштабируется. SWOT-анализ показал, что ключевые слабые стороны предприятия в области рекламно-информационной работы носят организационный, а не финансовый характер. Указанная задача основана на материалах задач 2 и 3 индивидуального задания на практику.</w:t>
+      </w:r>
+    </w:p>
+    <w:p>
+      <w:pPr>
+        <w:spacing w:line="360" w:lineRule="auto" w:before="0" w:after="0"/>
+        <w:ind w:firstLine="709"/>
+        <w:jc w:val="both"/>
+      </w:pPr>
+      <w:r>
+        <w:rPr>
+          <w:rFonts w:ascii="Times New Roman" w:hAnsi="Times New Roman" w:cs="Times New Roman" w:eastAsia="Times New Roman"/>
+          <w:sz w:val="28"/>
+        </w:rPr>
+        <w:t>По третьей задаче главы — выполнить оценку эффективности действующей рекламно-информационной работы и сформулировать перечень проблем (параграф 2.3). Расчёт условных показателей эффективности (CPL, CAC, ROMI) свидетельствует об отрицательной отдаче маркетинговых инвестиций предприятия в 2024 г. Анализ коммуникативной воронки в логике модели AIDA выявил критические разрывы на этапах привлечения внимания и побуждения к действию. По итогам анализа сформулирован сводный перечень проблем рекламно-информационной работы, объединённых в пять групп: организационно-управленческие, цифрового присутствия, офлайн-коммуникаций, коммерческого блока, измеримости эффективности. Указанная задача основана на материалах задачи 5 индивидуального задания на практику и интегрирует данные, собранные при выполнении всех предыдущих задач практики.</w:t>
+      </w:r>
+    </w:p>
+    <w:p>
+      <w:pPr>
+        <w:spacing w:line="360" w:lineRule="auto" w:before="0" w:after="0"/>
+        <w:ind w:firstLine="709"/>
+        <w:jc w:val="both"/>
+      </w:pPr>
+      <w:r>
+        <w:rPr>
+          <w:rFonts w:ascii="Times New Roman" w:hAnsi="Times New Roman" w:cs="Times New Roman" w:eastAsia="Times New Roman"/>
+          <w:sz w:val="28"/>
+        </w:rPr>
+        <w:t>В обобщённом виде соответствие задач индивидуального задания на производственную практику (преддипломную) и параграфов второй главы дипломной работы представлено в таблице 2.8.</w:t>
+      </w:r>
+    </w:p>
+    <w:p>
+      <w:pPr>
+        <w:spacing w:line="360" w:lineRule="auto" w:before="0" w:after="0"/>
+        <w:ind w:firstLine="0"/>
+        <w:jc w:val="left"/>
+      </w:pPr>
+      <w:r>
+        <w:rPr>
+          <w:rFonts w:ascii="Times New Roman" w:hAnsi="Times New Roman" w:cs="Times New Roman" w:eastAsia="Times New Roman"/>
+          <w:b/>
+          <w:sz w:val="28"/>
+        </w:rPr>
+        <w:t>Таблица 2.8 — Соответствие задач преддипломной практики и параграфов второй главы дипломной работы</w:t>
+      </w:r>
+    </w:p>
+    <w:tbl>
+      <w:tblPr>
+        <w:tblStyle w:val="TableGrid"/>
+        <w:tblW w:type="auto" w:w="0"/>
+        <w:tblLook w:firstColumn="1" w:firstRow="1" w:lastColumn="0" w:lastRow="0" w:noHBand="0" w:noVBand="1" w:val="04A0"/>
+      </w:tblPr>
+      <w:tblGrid>
+        <w:gridCol w:w="2493"/>
+        <w:gridCol w:w="2493"/>
+        <w:gridCol w:w="2493"/>
+        <w:gridCol w:w="2493"/>
+      </w:tblGrid>
+      <w:tr>
+        <w:tc>
+          <w:tcPr>
+            <w:tcW w:type="dxa" w:w="2493"/>
+          </w:tcPr>
+          <w:p>
+            <w:pPr>
+              <w:jc w:val="center"/>
+            </w:pPr>
+            <w:r/>
+            <w:r>
+              <w:rPr>
+                <w:rFonts w:ascii="Times New Roman" w:hAnsi="Times New Roman"/>
+                <w:b/>
+                <w:sz w:val="24"/>
+              </w:rPr>
+              <w:t>Задача индивидуального задания на практику</w:t>
+            </w:r>
+          </w:p>
+        </w:tc>
+        <w:tc>
+          <w:tcPr>
+            <w:tcW w:type="dxa" w:w="2493"/>
+          </w:tcPr>
+          <w:p>
+            <w:pPr>
+              <w:jc w:val="center"/>
+            </w:pPr>
+            <w:r/>
+            <w:r>
+              <w:rPr>
+                <w:rFonts w:ascii="Times New Roman" w:hAnsi="Times New Roman"/>
+                <w:b/>
+                <w:sz w:val="24"/>
+              </w:rPr>
+              <w:t>Период</w:t>
+            </w:r>
+          </w:p>
+        </w:tc>
+        <w:tc>
+          <w:tcPr>
+            <w:tcW w:type="dxa" w:w="2493"/>
+          </w:tcPr>
+          <w:p>
+            <w:pPr>
+              <w:jc w:val="center"/>
+            </w:pPr>
+            <w:r/>
+            <w:r>
+              <w:rPr>
+                <w:rFonts w:ascii="Times New Roman" w:hAnsi="Times New Roman"/>
+                <w:b/>
+                <w:sz w:val="24"/>
+              </w:rPr>
+              <w:t>Параграф 2 главы дипломной работы</w:t>
+            </w:r>
+          </w:p>
+        </w:tc>
+        <w:tc>
+          <w:tcPr>
+            <w:tcW w:type="dxa" w:w="2493"/>
+          </w:tcPr>
+          <w:p>
+            <w:pPr>
+              <w:jc w:val="center"/>
+            </w:pPr>
+            <w:r/>
+            <w:r>
+              <w:rPr>
+                <w:rFonts w:ascii="Times New Roman" w:hAnsi="Times New Roman"/>
+                <w:b/>
+                <w:sz w:val="24"/>
+              </w:rPr>
+              <w:t>Использованные данные и материалы</w:t>
+            </w:r>
+          </w:p>
+        </w:tc>
+      </w:tr>
+      <w:tr>
+        <w:tc>
+          <w:tcPr>
+            <w:tcW w:type="dxa" w:w="2493"/>
+          </w:tcPr>
+          <w:p>
+            <w:pPr>
+              <w:jc w:val="left"/>
+            </w:pPr>
+            <w:r/>
+            <w:r>
+              <w:rPr>
+                <w:rFonts w:ascii="Times New Roman" w:hAnsi="Times New Roman"/>
+                <w:sz w:val="24"/>
+              </w:rPr>
+              <w:t>1. Описать организационно-экономическую характеристику предприятия</w:t>
+            </w:r>
+          </w:p>
+        </w:tc>
+        <w:tc>
+          <w:tcPr>
+            <w:tcW w:type="dxa" w:w="2493"/>
+          </w:tcPr>
+          <w:p>
+            <w:pPr>
+              <w:jc w:val="left"/>
+            </w:pPr>
+            <w:r/>
+            <w:r>
+              <w:rPr>
+                <w:rFonts w:ascii="Times New Roman" w:hAnsi="Times New Roman"/>
+                <w:sz w:val="24"/>
+              </w:rPr>
+              <w:t>20.04 – 21.04.2026</w:t>
+            </w:r>
+          </w:p>
+        </w:tc>
+        <w:tc>
+          <w:tcPr>
+            <w:tcW w:type="dxa" w:w="2493"/>
+          </w:tcPr>
+          <w:p>
+            <w:pPr>
+              <w:jc w:val="left"/>
+            </w:pPr>
+            <w:r/>
+            <w:r>
+              <w:rPr>
+                <w:rFonts w:ascii="Times New Roman" w:hAnsi="Times New Roman"/>
+                <w:sz w:val="24"/>
+              </w:rPr>
+              <w:t>2.1</w:t>
+            </w:r>
+          </w:p>
+        </w:tc>
+        <w:tc>
+          <w:tcPr>
+            <w:tcW w:type="dxa" w:w="2493"/>
+          </w:tcPr>
+          <w:p>
+            <w:pPr>
+              <w:jc w:val="left"/>
+            </w:pPr>
+            <w:r/>
+            <w:r>
+              <w:rPr>
+                <w:rFonts w:ascii="Times New Roman" w:hAnsi="Times New Roman"/>
+                <w:sz w:val="24"/>
+              </w:rPr>
+              <w:t>Учредительные документы, выписка из ЕГРЮЛ, оргструктура, финпоказатели 2022–2024 гг.</w:t>
+            </w:r>
+          </w:p>
+        </w:tc>
+      </w:tr>
+      <w:tr>
+        <w:tc>
+          <w:tcPr>
+            <w:tcW w:type="dxa" w:w="2493"/>
+          </w:tcPr>
+          <w:p>
+            <w:pPr>
+              <w:jc w:val="left"/>
+            </w:pPr>
+            <w:r/>
+            <w:r>
+              <w:rPr>
+                <w:rFonts w:ascii="Times New Roman" w:hAnsi="Times New Roman"/>
+                <w:sz w:val="24"/>
+              </w:rPr>
+              <w:t>2. Описать организацию экономической и маркетинговой деятельности предприятия</w:t>
+            </w:r>
+          </w:p>
+        </w:tc>
+        <w:tc>
+          <w:tcPr>
+            <w:tcW w:type="dxa" w:w="2493"/>
+          </w:tcPr>
+          <w:p>
+            <w:pPr>
+              <w:jc w:val="left"/>
+            </w:pPr>
+            <w:r/>
+            <w:r>
+              <w:rPr>
+                <w:rFonts w:ascii="Times New Roman" w:hAnsi="Times New Roman"/>
+                <w:sz w:val="24"/>
+              </w:rPr>
+              <w:t>22.04 – 24.04.2026</w:t>
+            </w:r>
+          </w:p>
+        </w:tc>
+        <w:tc>
+          <w:tcPr>
+            <w:tcW w:type="dxa" w:w="2493"/>
+          </w:tcPr>
+          <w:p>
+            <w:pPr>
+              <w:jc w:val="left"/>
+            </w:pPr>
+            <w:r/>
+            <w:r>
+              <w:rPr>
+                <w:rFonts w:ascii="Times New Roman" w:hAnsi="Times New Roman"/>
+                <w:sz w:val="24"/>
+              </w:rPr>
+              <w:t>2.2</w:t>
+            </w:r>
+          </w:p>
+        </w:tc>
+        <w:tc>
+          <w:tcPr>
+            <w:tcW w:type="dxa" w:w="2493"/>
+          </w:tcPr>
+          <w:p>
+            <w:pPr>
+              <w:jc w:val="left"/>
+            </w:pPr>
+            <w:r/>
+            <w:r>
+              <w:rPr>
+                <w:rFonts w:ascii="Times New Roman" w:hAnsi="Times New Roman"/>
+                <w:sz w:val="24"/>
+              </w:rPr>
+              <w:t>Учётная политика, ценообразование, перечень каналов рекламно-информационной работы, оценка маркетинговых коммуникаций</w:t>
+            </w:r>
+          </w:p>
+        </w:tc>
+      </w:tr>
+      <w:tr>
+        <w:tc>
+          <w:tcPr>
+            <w:tcW w:type="dxa" w:w="2493"/>
+          </w:tcPr>
+          <w:p>
+            <w:pPr>
+              <w:jc w:val="left"/>
+            </w:pPr>
+            <w:r/>
+            <w:r>
+              <w:rPr>
+                <w:rFonts w:ascii="Times New Roman" w:hAnsi="Times New Roman"/>
+                <w:sz w:val="24"/>
+              </w:rPr>
+              <w:t>3. Исследовать и описать коммерческую деятельность предприятия</w:t>
+            </w:r>
+          </w:p>
+        </w:tc>
+        <w:tc>
+          <w:tcPr>
+            <w:tcW w:type="dxa" w:w="2493"/>
+          </w:tcPr>
+          <w:p>
+            <w:pPr>
+              <w:jc w:val="left"/>
+            </w:pPr>
+            <w:r/>
+            <w:r>
+              <w:rPr>
+                <w:rFonts w:ascii="Times New Roman" w:hAnsi="Times New Roman"/>
+                <w:sz w:val="24"/>
+              </w:rPr>
+              <w:t>27.04 – 30.04.2026</w:t>
+            </w:r>
+          </w:p>
+        </w:tc>
+        <w:tc>
+          <w:tcPr>
+            <w:tcW w:type="dxa" w:w="2493"/>
+          </w:tcPr>
+          <w:p>
+            <w:pPr>
+              <w:jc w:val="left"/>
+            </w:pPr>
+            <w:r/>
+            <w:r>
+              <w:rPr>
+                <w:rFonts w:ascii="Times New Roman" w:hAnsi="Times New Roman"/>
+                <w:sz w:val="24"/>
+              </w:rPr>
+              <w:t>2.2</w:t>
+            </w:r>
+          </w:p>
+        </w:tc>
+        <w:tc>
+          <w:tcPr>
+            <w:tcW w:type="dxa" w:w="2493"/>
+          </w:tcPr>
+          <w:p>
+            <w:pPr>
+              <w:jc w:val="left"/>
+            </w:pPr>
+            <w:r/>
+            <w:r>
+              <w:rPr>
+                <w:rFonts w:ascii="Times New Roman" w:hAnsi="Times New Roman"/>
+                <w:sz w:val="24"/>
+              </w:rPr>
+              <w:t>Установление контактов, заключение договоров, претензионная работа, сбытовая политика, конкурентоспособность продукции</w:t>
+            </w:r>
+          </w:p>
+        </w:tc>
+      </w:tr>
+      <w:tr>
+        <w:tc>
+          <w:tcPr>
+            <w:tcW w:type="dxa" w:w="2493"/>
+          </w:tcPr>
+          <w:p>
+            <w:pPr>
+              <w:jc w:val="left"/>
+            </w:pPr>
+            <w:r/>
+            <w:r>
+              <w:rPr>
+                <w:rFonts w:ascii="Times New Roman" w:hAnsi="Times New Roman"/>
+                <w:sz w:val="24"/>
+              </w:rPr>
+              <w:t>4. Исследовать и описать формирование ассортимента, оценку качества и маркировку продукции</w:t>
+            </w:r>
+          </w:p>
+        </w:tc>
+        <w:tc>
+          <w:tcPr>
+            <w:tcW w:type="dxa" w:w="2493"/>
+          </w:tcPr>
+          <w:p>
+            <w:pPr>
+              <w:jc w:val="left"/>
+            </w:pPr>
+            <w:r/>
+            <w:r>
+              <w:rPr>
+                <w:rFonts w:ascii="Times New Roman" w:hAnsi="Times New Roman"/>
+                <w:sz w:val="24"/>
+              </w:rPr>
+              <w:t>04.05 – 07.05.2026</w:t>
+            </w:r>
+          </w:p>
+        </w:tc>
+        <w:tc>
+          <w:tcPr>
+            <w:tcW w:type="dxa" w:w="2493"/>
+          </w:tcPr>
+          <w:p>
+            <w:pPr>
+              <w:jc w:val="left"/>
+            </w:pPr>
+            <w:r/>
+            <w:r>
+              <w:rPr>
+                <w:rFonts w:ascii="Times New Roman" w:hAnsi="Times New Roman"/>
+                <w:sz w:val="24"/>
+              </w:rPr>
+              <w:t>2.1 (часть)</w:t>
+            </w:r>
+          </w:p>
+        </w:tc>
+        <w:tc>
+          <w:tcPr>
+            <w:tcW w:type="dxa" w:w="2493"/>
+          </w:tcPr>
+          <w:p>
+            <w:pPr>
+              <w:jc w:val="left"/>
+            </w:pPr>
+            <w:r/>
+            <w:r>
+              <w:rPr>
+                <w:rFonts w:ascii="Times New Roman" w:hAnsi="Times New Roman"/>
+                <w:sz w:val="24"/>
+              </w:rPr>
+              <w:t>Номенклатура продукции, показатели качества, патенты, ТР ТС 010/2011, маркировка и сопроводительные документы</w:t>
+            </w:r>
+          </w:p>
+        </w:tc>
+      </w:tr>
+      <w:tr>
+        <w:tc>
+          <w:tcPr>
+            <w:tcW w:type="dxa" w:w="2493"/>
+          </w:tcPr>
+          <w:p>
+            <w:pPr>
+              <w:jc w:val="left"/>
+            </w:pPr>
+            <w:r/>
+            <w:r>
+              <w:rPr>
+                <w:rFonts w:ascii="Times New Roman" w:hAnsi="Times New Roman"/>
+                <w:sz w:val="24"/>
+              </w:rPr>
+              <w:t>5. Подбор материала в соответствии с темой ВКР</w:t>
+            </w:r>
+          </w:p>
+        </w:tc>
+        <w:tc>
+          <w:tcPr>
+            <w:tcW w:type="dxa" w:w="2493"/>
+          </w:tcPr>
+          <w:p>
+            <w:pPr>
+              <w:jc w:val="left"/>
+            </w:pPr>
+            <w:r/>
+            <w:r>
+              <w:rPr>
+                <w:rFonts w:ascii="Times New Roman" w:hAnsi="Times New Roman"/>
+                <w:sz w:val="24"/>
+              </w:rPr>
+              <w:t>12.05 – 16.05.2026</w:t>
+            </w:r>
+          </w:p>
+        </w:tc>
+        <w:tc>
+          <w:tcPr>
+            <w:tcW w:type="dxa" w:w="2493"/>
+          </w:tcPr>
+          <w:p>
+            <w:pPr>
+              <w:jc w:val="left"/>
+            </w:pPr>
+            <w:r/>
+            <w:r>
+              <w:rPr>
+                <w:rFonts w:ascii="Times New Roman" w:hAnsi="Times New Roman"/>
+                <w:sz w:val="24"/>
+              </w:rPr>
+              <w:t>2.3</w:t>
+            </w:r>
+          </w:p>
+        </w:tc>
+        <w:tc>
+          <w:tcPr>
+            <w:tcW w:type="dxa" w:w="2493"/>
+          </w:tcPr>
+          <w:p>
+            <w:pPr>
+              <w:jc w:val="left"/>
+            </w:pPr>
+            <w:r/>
+            <w:r>
+              <w:rPr>
+                <w:rFonts w:ascii="Times New Roman" w:hAnsi="Times New Roman"/>
+                <w:sz w:val="24"/>
+              </w:rPr>
+              <w:t>Систематизация всех собранных данных, расчёт показателей эффективности, формулировка проблем</w:t>
+            </w:r>
+          </w:p>
+        </w:tc>
+      </w:tr>
+    </w:tbl>
+    <w:p>
+      <w:pPr>
+        <w:spacing w:line="360" w:lineRule="auto" w:before="0" w:after="0"/>
+        <w:ind w:firstLine="0"/>
+        <w:jc w:val="both"/>
+      </w:pPr>
+      <w:r>
+        <w:rPr>
+          <w:rFonts w:ascii="Times New Roman" w:hAnsi="Times New Roman" w:cs="Times New Roman" w:eastAsia="Times New Roman"/>
+          <w:sz w:val="28"/>
+        </w:rPr>
+        <w:t>Источник: составлено автором.</w:t>
+      </w:r>
+    </w:p>
+    <w:p>
+      <w:pPr>
+        <w:spacing w:line="360" w:lineRule="auto" w:before="0" w:after="0"/>
+        <w:ind w:firstLine="709"/>
+        <w:jc w:val="both"/>
+      </w:pPr>
+      <w:r>
+        <w:rPr>
+          <w:rFonts w:ascii="Times New Roman" w:hAnsi="Times New Roman" w:cs="Times New Roman" w:eastAsia="Times New Roman"/>
+          <w:sz w:val="28"/>
+        </w:rPr>
+        <w:t>Полученные во второй главе результаты подтверждают актуальность темы дипломной работы для конкретного предприятия и обосновывают необходимость разработки комплекса мероприятий по совершенствованию рекламно-информационной работы ООО «Фаст Инжиниринг», представленного в третьей главе настоящей работы.</w:t>
       </w:r>
     </w:p>
     <w:p>
@@ -16593,7 +17102,7 @@
           <w:b/>
           <w:sz w:val="28"/>
         </w:rPr>
-        <w:t>Нормативные правовые акты</w:t>
+        <w:t>I. Нормативно-правовые источники</w:t>
       </w:r>
     </w:p>
     <w:p>
@@ -16635,7 +17144,7 @@
           <w:rFonts w:ascii="Times New Roman" w:hAnsi="Times New Roman" w:cs="Times New Roman" w:eastAsia="Times New Roman"/>
           <w:sz w:val="28"/>
         </w:rPr>
-        <w:t>3. О рекламе : Федеральный закон от 13.03.2006 № 38-ФЗ (ред. от 14.04.2023) // Собрание законодательства РФ. — 2006. — № 12. — Ст. 1232.</w:t>
+        <w:t>3. Гражданский кодекс Российской Федерации (часть вторая) : Федеральный закон от 26.01.1996 № 14-ФЗ (ред. от 24.07.2023). — URL: http://www.consultant.ru (дата обращения: 30.04.2026).</w:t>
       </w:r>
     </w:p>
     <w:p>
@@ -16649,7 +17158,7 @@
           <w:rFonts w:ascii="Times New Roman" w:hAnsi="Times New Roman" w:cs="Times New Roman" w:eastAsia="Times New Roman"/>
           <w:sz w:val="28"/>
         </w:rPr>
-        <w:t>4. О защите конкуренции : Федеральный закон от 26.07.2006 № 135-ФЗ (ред. от 04.08.2023) // Собрание законодательства РФ. — 2006. — № 31 (ч. 1). — Ст. 3434.</w:t>
+        <w:t>4. Налоговый кодекс Российской Федерации (часть первая) : Федеральный закон от 31.07.1998 № 146-ФЗ (ред. от 04.08.2023). — URL: http://www.consultant.ru (дата обращения: 30.04.2026).</w:t>
       </w:r>
     </w:p>
     <w:p>
@@ -16663,7 +17172,7 @@
           <w:rFonts w:ascii="Times New Roman" w:hAnsi="Times New Roman" w:cs="Times New Roman" w:eastAsia="Times New Roman"/>
           <w:sz w:val="28"/>
         </w:rPr>
-        <w:t>5. О защите прав потребителей : Закон Российской Федерации от 07.02.1992 № 2300-1 (ред. от 04.08.2023). — URL: http://www.consultant.ru (дата обращения: 30.04.2026).</w:t>
+        <w:t>5. Трудовой кодекс Российской Федерации : Федеральный закон от 30.12.2001 № 197-ФЗ (ред. от 04.08.2023). — URL: http://www.consultant.ru (дата обращения: 30.04.2026).</w:t>
       </w:r>
     </w:p>
     <w:p>
@@ -16675,10 +17184,108 @@
       <w:r>
         <w:rPr>
           <w:rFonts w:ascii="Times New Roman" w:hAnsi="Times New Roman" w:cs="Times New Roman" w:eastAsia="Times New Roman"/>
+          <w:sz w:val="28"/>
+        </w:rPr>
+        <w:t>6. О рекламе : Федеральный закон от 13.03.2006 № 38-ФЗ (ред. от 14.04.2023) // Собрание законодательства РФ. — 2006. — № 12. — Ст. 1232.</w:t>
+      </w:r>
+    </w:p>
+    <w:p>
+      <w:pPr>
+        <w:spacing w:line="360" w:lineRule="auto" w:before="0" w:after="0"/>
+        <w:ind w:firstLine="709"/>
+        <w:jc w:val="both"/>
+      </w:pPr>
+      <w:r>
+        <w:rPr>
+          <w:rFonts w:ascii="Times New Roman" w:hAnsi="Times New Roman" w:cs="Times New Roman" w:eastAsia="Times New Roman"/>
+          <w:sz w:val="28"/>
+        </w:rPr>
+        <w:t>7. О защите конкуренции : Федеральный закон от 26.07.2006 № 135-ФЗ (ред. от 04.08.2023) // Собрание законодательства РФ. — 2006. — № 31 (ч. 1). — Ст. 3434.</w:t>
+      </w:r>
+    </w:p>
+    <w:p>
+      <w:pPr>
+        <w:spacing w:line="360" w:lineRule="auto" w:before="0" w:after="0"/>
+        <w:ind w:firstLine="709"/>
+        <w:jc w:val="both"/>
+      </w:pPr>
+      <w:r>
+        <w:rPr>
+          <w:rFonts w:ascii="Times New Roman" w:hAnsi="Times New Roman" w:cs="Times New Roman" w:eastAsia="Times New Roman"/>
+          <w:sz w:val="28"/>
+        </w:rPr>
+        <w:t>8. О защите прав потребителей : Закон Российской Федерации от 07.02.1992 № 2300-1 (ред. от 04.08.2023). — URL: http://www.consultant.ru (дата обращения: 30.04.2026).</w:t>
+      </w:r>
+    </w:p>
+    <w:p>
+      <w:pPr>
+        <w:spacing w:line="360" w:lineRule="auto" w:before="0" w:after="0"/>
+        <w:ind w:firstLine="709"/>
+        <w:jc w:val="both"/>
+      </w:pPr>
+      <w:r>
+        <w:rPr>
+          <w:rFonts w:ascii="Times New Roman" w:hAnsi="Times New Roman" w:cs="Times New Roman" w:eastAsia="Times New Roman"/>
+          <w:sz w:val="28"/>
+        </w:rPr>
+        <w:t>9. Об обществах с ограниченной ответственностью : Федеральный закон от 08.02.1998 № 14-ФЗ (ред. от 13.06.2023). — URL: http://www.consultant.ru (дата обращения: 30.04.2026).</w:t>
+      </w:r>
+    </w:p>
+    <w:p>
+      <w:pPr>
+        <w:spacing w:line="360" w:lineRule="auto" w:before="0" w:after="0"/>
+        <w:ind w:firstLine="709"/>
+        <w:jc w:val="both"/>
+      </w:pPr>
+      <w:r>
+        <w:rPr>
+          <w:rFonts w:ascii="Times New Roman" w:hAnsi="Times New Roman" w:cs="Times New Roman" w:eastAsia="Times New Roman"/>
+          <w:sz w:val="28"/>
+        </w:rPr>
+        <w:t>10. О бухгалтерском учёте : Федеральный закон от 06.12.2011 № 402-ФЗ (ред. от 12.12.2023). — URL: http://www.consultant.ru (дата обращения: 30.04.2026).</w:t>
+      </w:r>
+    </w:p>
+    <w:p>
+      <w:pPr>
+        <w:spacing w:line="360" w:lineRule="auto" w:before="0" w:after="0"/>
+        <w:ind w:firstLine="709"/>
+        <w:jc w:val="both"/>
+      </w:pPr>
+      <w:r>
+        <w:rPr>
+          <w:rFonts w:ascii="Times New Roman" w:hAnsi="Times New Roman" w:cs="Times New Roman" w:eastAsia="Times New Roman"/>
+          <w:sz w:val="28"/>
+        </w:rPr>
+        <w:t>11. О развитии малого и среднего предпринимательства в Российской Федерации : Федеральный закон от 24.07.2007 № 209-ФЗ (ред. от 04.08.2023). — URL: http://www.consultant.ru (дата обращения: 30.04.2026).</w:t>
+      </w:r>
+    </w:p>
+    <w:p>
+      <w:pPr>
+        <w:spacing w:line="360" w:lineRule="auto" w:before="0" w:after="0"/>
+        <w:ind w:firstLine="709"/>
+        <w:jc w:val="both"/>
+      </w:pPr>
+      <w:r>
+        <w:rPr>
+          <w:rFonts w:ascii="Times New Roman" w:hAnsi="Times New Roman" w:cs="Times New Roman" w:eastAsia="Times New Roman"/>
+          <w:sz w:val="28"/>
+        </w:rPr>
+        <w:t>12. Технический регламент Таможенного союза «О безопасности машин и оборудования» : ТР ТС 010/2011 (утв. решением Комиссии Таможенного союза от 18.10.2011 № 823). — URL: http://www.eaeunion.org (дата обращения: 30.04.2026).</w:t>
+      </w:r>
+    </w:p>
+    <w:p>
+      <w:pPr>
+        <w:spacing w:line="360" w:lineRule="auto" w:before="0" w:after="0"/>
+        <w:ind w:firstLine="709"/>
+        <w:jc w:val="both"/>
+      </w:pPr>
+      <w:r>
+        <w:rPr>
+          <w:rFonts w:ascii="Times New Roman" w:hAnsi="Times New Roman" w:cs="Times New Roman" w:eastAsia="Times New Roman"/>
           <w:b/>
           <w:sz w:val="28"/>
         </w:rPr>
-        <w:t>Учебники, учебные пособия и монографии</w:t>
+        <w:t>II. Учебники, монографии, брошюры</w:t>
       </w:r>
     </w:p>
     <w:p>
@@ -16692,7 +17299,7 @@
           <w:rFonts w:ascii="Times New Roman" w:hAnsi="Times New Roman" w:cs="Times New Roman" w:eastAsia="Times New Roman"/>
           <w:sz w:val="28"/>
         </w:rPr>
-        <w:t>6. Котлер, Ф. Маркетинг менеджмент. Экспресс-курс : пер. с англ. / Ф. Котлер, К. Л. Келлер ; под науч. ред. С. Г. Жильцова. — 5-е изд. — Санкт-Петербург : Питер, 2021. — 480 с.</w:t>
+        <w:t>13. Аакер, Д. Стратегическое рыночное управление : пер. с англ. / Д. Аакер. — 8-е изд. — Санкт-Петербург : Питер, 2020. — 496 с.</w:t>
       </w:r>
     </w:p>
     <w:p>
@@ -16706,7 +17313,7 @@
           <w:rFonts w:ascii="Times New Roman" w:hAnsi="Times New Roman" w:cs="Times New Roman" w:eastAsia="Times New Roman"/>
           <w:sz w:val="28"/>
         </w:rPr>
-        <w:t>7. Бернет, Дж. Маркетинговые коммуникации: интегрированный подход : пер. с англ. / Дж. Бернет, С. Мориарти. — Санкт-Петербург : Питер, 2019. — 864 с.</w:t>
+        <w:t>14. Анурин, В. Маркетинговые исследования потребительского рынка / В. Анурин, И. Муромкина, Е. Евтушенко. — Санкт-Петербург : Питер, 2019. — 270 с.</w:t>
       </w:r>
     </w:p>
     <w:p>
@@ -16720,7 +17327,7 @@
           <w:rFonts w:ascii="Times New Roman" w:hAnsi="Times New Roman" w:cs="Times New Roman" w:eastAsia="Times New Roman"/>
           <w:sz w:val="28"/>
         </w:rPr>
-        <w:t>8. Шарков, Ф. И. Интегрированные коммуникации: реклама, паблик рилейшнз, брендинг : учебное пособие / Ф. И. Шарков. — 5-е изд. — Москва : Дашков и К°, 2022. — 324 с.</w:t>
+        <w:t>15. Багиев, Г. Л. Маркетинг : учебник для вузов / Г. Л. Багиев, В. М. Тарасевич, Х. Анн. — 4-е изд. — Санкт-Петербург : Питер, 2019. — 560 с.</w:t>
       </w:r>
     </w:p>
     <w:p>
@@ -16734,7 +17341,7 @@
           <w:rFonts w:ascii="Times New Roman" w:hAnsi="Times New Roman" w:cs="Times New Roman" w:eastAsia="Times New Roman"/>
           <w:sz w:val="28"/>
         </w:rPr>
-        <w:t>9. Ромат, Е. В. Реклама : учебник для вузов / Е. В. Ромат, Д. В. Сендеров. — 9-е изд. — Санкт-Петербург : Питер, 2021. — 512 с.</w:t>
+        <w:t>16. Бернет, Дж. Маркетинговые коммуникации: интегрированный подход : пер. с англ. / Дж. Бернет, С. Мориарти. — Санкт-Петербург : Питер, 2019. — 864 с.</w:t>
       </w:r>
     </w:p>
     <w:p>
@@ -16748,7 +17355,7 @@
           <w:rFonts w:ascii="Times New Roman" w:hAnsi="Times New Roman" w:cs="Times New Roman" w:eastAsia="Times New Roman"/>
           <w:sz w:val="28"/>
         </w:rPr>
-        <w:t>10. Мудров, А. Н. Основы рекламы : учебник / А. Н. Мудров. — 3-е изд., перераб. и доп. — Москва : Магистр : ИНФРА-М, 2020. — 416 с.</w:t>
+        <w:t>17. Васильев, Г. А. Рекламный маркетинг : учебное пособие / Г. А. Васильев, В. А. Поляков. — Москва : Вузовский учебник : ИНФРА-М, 2020. — 276 с.</w:t>
       </w:r>
     </w:p>
     <w:p>
@@ -16762,7 +17369,7 @@
           <w:rFonts w:ascii="Times New Roman" w:hAnsi="Times New Roman" w:cs="Times New Roman" w:eastAsia="Times New Roman"/>
           <w:sz w:val="28"/>
         </w:rPr>
-        <w:t>11. Музыкант, В. Л. Основы интегрированных коммуникаций: теория и современные практики : в 2 ч. / В. Л. Музыкант. — 2-е изд., перераб. и доп. — Москва : Юрайт, 2020. — Ч. 1. — 342 с.</w:t>
+        <w:t>18. Виноградова, С. Н. Коммерческая деятельность : учебник / С. Н. Виноградова, О. В. Пигунова. — 3-е изд., стер. — Минск : Вышэйшая школа, 2019. — 351 с.</w:t>
       </w:r>
     </w:p>
     <w:p>
@@ -16776,7 +17383,7 @@
           <w:rFonts w:ascii="Times New Roman" w:hAnsi="Times New Roman" w:cs="Times New Roman" w:eastAsia="Times New Roman"/>
           <w:sz w:val="28"/>
         </w:rPr>
-        <w:t>12. Назайкин, А. Н. Эффективная реклама в прессе. Практическое пособие / А. Н. Назайкин. — Москва : МЦФЭР, 2019. — 304 с.</w:t>
+        <w:t>19. Гольдштейн, Г. Я. Маркетинг : учебное пособие / Г. Я. Гольдштейн, А. В. Катаев. — Москва : Дашков и К°, 2021. — 248 с.</w:t>
       </w:r>
     </w:p>
     <w:p>
@@ -16790,7 +17397,7 @@
           <w:rFonts w:ascii="Times New Roman" w:hAnsi="Times New Roman" w:cs="Times New Roman" w:eastAsia="Times New Roman"/>
           <w:sz w:val="28"/>
         </w:rPr>
-        <w:t>13. Аакер, Д. Стратегическое рыночное управление : пер. с англ. / Д. Аакер. — 8-е изд. — Санкт-Петербург : Питер, 2020. — 496 с.</w:t>
+        <w:t>20. Голубков, Е. П. Основы маркетинга : учебник / Е. П. Голубков. — 4-е изд., перераб. и доп. — Москва : Финпресс, 2020. — 704 с.</w:t>
       </w:r>
     </w:p>
     <w:p>
@@ -16804,7 +17411,7 @@
           <w:rFonts w:ascii="Times New Roman" w:hAnsi="Times New Roman" w:cs="Times New Roman" w:eastAsia="Times New Roman"/>
           <w:sz w:val="28"/>
         </w:rPr>
-        <w:t>14. Райан, Д. Краткий курс интернет-маркетинга : пер. с англ. / Д. Райан, К. Джонс. — Москва : Манн, Иванов и Фербер, 2019. — 320 с.</w:t>
+        <w:t>21. Гуров, Ф. Н. Продвижение бизнеса в Интернете : всё о PR и рекламе в Сети / Ф. Н. Гуров. — Москва : Вершина, 2019. — 152 с.</w:t>
       </w:r>
     </w:p>
     <w:p>
@@ -16818,7 +17425,7 @@
           <w:rFonts w:ascii="Times New Roman" w:hAnsi="Times New Roman" w:cs="Times New Roman" w:eastAsia="Times New Roman"/>
           <w:sz w:val="28"/>
         </w:rPr>
-        <w:t>15. Гольдштейн, Г. Я. Маркетинг : учебное пособие / Г. Я. Гольдштейн, А. В. Катаев. — Москва : Дашков и К°, 2021. — 248 с.</w:t>
+        <w:t>22. Дашков, Л. П. Организация и управление коммерческой деятельностью : учебник для бакалавров / Л. П. Дашков, О. В. Памбухчиянц. — 3-е изд., перераб. — Москва : Дашков и К°, 2020. — 400 с.</w:t>
       </w:r>
     </w:p>
     <w:p>
@@ -16832,7 +17439,7 @@
           <w:rFonts w:ascii="Times New Roman" w:hAnsi="Times New Roman" w:cs="Times New Roman" w:eastAsia="Times New Roman"/>
           <w:sz w:val="28"/>
         </w:rPr>
-        <w:t>16. Багиев, Г. Л. Маркетинг : учебник для вузов / Г. Л. Багиев, В. М. Тарасевич, Х. Анн. — 4-е изд. — Санкт-Петербург : Питер, 2019. — 560 с.</w:t>
+        <w:t>23. Дойль, П. Маркетинг, ориентированный на стоимость : пер. с англ. / П. Дойль. — Санкт-Петербург : Питер, 2019. — 480 с.</w:t>
       </w:r>
     </w:p>
     <w:p>
@@ -16846,7 +17453,7 @@
           <w:rFonts w:ascii="Times New Roman" w:hAnsi="Times New Roman" w:cs="Times New Roman" w:eastAsia="Times New Roman"/>
           <w:sz w:val="28"/>
         </w:rPr>
-        <w:t>17. Панкратов, Ф. Г. Коммерческая деятельность : учебник для студ. сред. проф. учеб. заведений / Ф. Г. Панкратов, Н. Ф. Солдатова. — 14-е изд., перераб. и доп. — Москва : Дашков и К°, 2020. — 500 с.</w:t>
+        <w:t>24. Каплунов, Д. Контент, маркетинг и рок-н-ролл : книга-муза для покорения клиентов в Интернете / Д. Каплунов. — Москва : Манн, Иванов и Фербер, 2020. — 432 с.</w:t>
       </w:r>
     </w:p>
     <w:p>
@@ -16860,7 +17467,7 @@
           <w:rFonts w:ascii="Times New Roman" w:hAnsi="Times New Roman" w:cs="Times New Roman" w:eastAsia="Times New Roman"/>
           <w:sz w:val="28"/>
         </w:rPr>
-        <w:t>18. Половцева, Ф. П. Коммерческая деятельность : учебник / Ф. П. Половцева. — 3-е изд., перераб. и доп. — Москва : ИНФРА-М, 2021. — 309 с.</w:t>
+        <w:t>25. Карпова, С. В. Рекламное дело : учебник и практикум для СПО / С. В. Карпова. — 3-е изд., перераб. и доп. — Москва : Юрайт, 2021. — 431 с.</w:t>
       </w:r>
     </w:p>
     <w:p>
@@ -16874,7 +17481,7 @@
           <w:rFonts w:ascii="Times New Roman" w:hAnsi="Times New Roman" w:cs="Times New Roman" w:eastAsia="Times New Roman"/>
           <w:sz w:val="28"/>
         </w:rPr>
-        <w:t>19. Дашков, Л. П. Организация и управление коммерческой деятельностью : учебник для бакалавров / Л. П. Дашков, О. В. Памбухчиянц. — 3-е изд., перераб. — Москва : Дашков и К°, 2020. — 400 с.</w:t>
+        <w:t>26. Котлер, Ф. Маркетинг менеджмент. Экспресс-курс : пер. с англ. / Ф. Котлер, К. Л. Келлер ; под науч. ред. С. Г. Жильцова. — 5-е изд. — Санкт-Петербург : Питер, 2021. — 480 с.</w:t>
       </w:r>
     </w:p>
     <w:p>
@@ -16888,7 +17495,7 @@
           <w:rFonts w:ascii="Times New Roman" w:hAnsi="Times New Roman" w:cs="Times New Roman" w:eastAsia="Times New Roman"/>
           <w:sz w:val="28"/>
         </w:rPr>
-        <w:t>20. Анурин, В. Маркетинговые исследования потребительского рынка / В. Анурин, И. Муромкина, Е. Евтушенко. — Санкт-Петербург : Питер, 2019. — 270 с.</w:t>
+        <w:t>27. Котлер, Ф. Основы маркетинга : пер. с англ. / Ф. Котлер, Г. Армстронг. — 5-е европ. изд. — Москва : Вильямс, 2020. — 752 с.</w:t>
       </w:r>
     </w:p>
     <w:p>
@@ -16900,10 +17507,374 @@
       <w:r>
         <w:rPr>
           <w:rFonts w:ascii="Times New Roman" w:hAnsi="Times New Roman" w:cs="Times New Roman" w:eastAsia="Times New Roman"/>
+          <w:sz w:val="28"/>
+        </w:rPr>
+        <w:t>28. Кузнецов, П. А. Современные технологии коммерческой рекламы : практическое пособие / П. А. Кузнецов. — Москва : Дашков и К°, 2019. — 296 с.</w:t>
+      </w:r>
+    </w:p>
+    <w:p>
+      <w:pPr>
+        <w:spacing w:line="360" w:lineRule="auto" w:before="0" w:after="0"/>
+        <w:ind w:firstLine="709"/>
+        <w:jc w:val="both"/>
+      </w:pPr>
+      <w:r>
+        <w:rPr>
+          <w:rFonts w:ascii="Times New Roman" w:hAnsi="Times New Roman" w:cs="Times New Roman" w:eastAsia="Times New Roman"/>
+          <w:sz w:val="28"/>
+        </w:rPr>
+        <w:t>29. Левинсон, Дж. К. Партизанский маркетинг : простые способы получения больших прибылей при малых затратах : пер. с англ. / Дж. К. Левинсон. — Москва : Манн, Иванов и Фербер, 2019. — 384 с.</w:t>
+      </w:r>
+    </w:p>
+    <w:p>
+      <w:pPr>
+        <w:spacing w:line="360" w:lineRule="auto" w:before="0" w:after="0"/>
+        <w:ind w:firstLine="709"/>
+        <w:jc w:val="both"/>
+      </w:pPr>
+      <w:r>
+        <w:rPr>
+          <w:rFonts w:ascii="Times New Roman" w:hAnsi="Times New Roman" w:cs="Times New Roman" w:eastAsia="Times New Roman"/>
+          <w:sz w:val="28"/>
+        </w:rPr>
+        <w:t>30. Манн, И. Маркетинг на 100 % : ремикс. Как стать хорошим менеджером по маркетингу / И. Манн. — 8-е изд. — Москва : Манн, Иванов и Фербер, 2020. — 416 с.</w:t>
+      </w:r>
+    </w:p>
+    <w:p>
+      <w:pPr>
+        <w:spacing w:line="360" w:lineRule="auto" w:before="0" w:after="0"/>
+        <w:ind w:firstLine="709"/>
+        <w:jc w:val="both"/>
+      </w:pPr>
+      <w:r>
+        <w:rPr>
+          <w:rFonts w:ascii="Times New Roman" w:hAnsi="Times New Roman" w:cs="Times New Roman" w:eastAsia="Times New Roman"/>
+          <w:sz w:val="28"/>
+        </w:rPr>
+        <w:t>31. Михайлова, Е. А. Бенчмаркинг и инструменты совершенствования бизнес-процессов / Е. А. Михайлова. — Москва : ИНФРА-М, 2020. — 224 с.</w:t>
+      </w:r>
+    </w:p>
+    <w:p>
+      <w:pPr>
+        <w:spacing w:line="360" w:lineRule="auto" w:before="0" w:after="0"/>
+        <w:ind w:firstLine="709"/>
+        <w:jc w:val="both"/>
+      </w:pPr>
+      <w:r>
+        <w:rPr>
+          <w:rFonts w:ascii="Times New Roman" w:hAnsi="Times New Roman" w:cs="Times New Roman" w:eastAsia="Times New Roman"/>
+          <w:sz w:val="28"/>
+        </w:rPr>
+        <w:t>32. Мудров, А. Н. Основы рекламы : учебник / А. Н. Мудров. — 3-е изд., перераб. и доп. — Москва : Магистр : ИНФРА-М, 2020. — 416 с.</w:t>
+      </w:r>
+    </w:p>
+    <w:p>
+      <w:pPr>
+        <w:spacing w:line="360" w:lineRule="auto" w:before="0" w:after="0"/>
+        <w:ind w:firstLine="709"/>
+        <w:jc w:val="both"/>
+      </w:pPr>
+      <w:r>
+        <w:rPr>
+          <w:rFonts w:ascii="Times New Roman" w:hAnsi="Times New Roman" w:cs="Times New Roman" w:eastAsia="Times New Roman"/>
+          <w:sz w:val="28"/>
+        </w:rPr>
+        <w:t>33. Музыкант, В. Л. Основы интегрированных коммуникаций: теория и современные практики : в 2 ч. / В. Л. Музыкант. — 2-е изд., перераб. и доп. — Москва : Юрайт, 2020. — Ч. 1. — 342 с.</w:t>
+      </w:r>
+    </w:p>
+    <w:p>
+      <w:pPr>
+        <w:spacing w:line="360" w:lineRule="auto" w:before="0" w:after="0"/>
+        <w:ind w:firstLine="709"/>
+        <w:jc w:val="both"/>
+      </w:pPr>
+      <w:r>
+        <w:rPr>
+          <w:rFonts w:ascii="Times New Roman" w:hAnsi="Times New Roman" w:cs="Times New Roman" w:eastAsia="Times New Roman"/>
+          <w:sz w:val="28"/>
+        </w:rPr>
+        <w:t>34. Назайкин, А. Н. Эффективная реклама в прессе : практическое пособие / А. Н. Назайкин. — Москва : МЦФЭР, 2019. — 304 с.</w:t>
+      </w:r>
+    </w:p>
+    <w:p>
+      <w:pPr>
+        <w:spacing w:line="360" w:lineRule="auto" w:before="0" w:after="0"/>
+        <w:ind w:firstLine="709"/>
+        <w:jc w:val="both"/>
+      </w:pPr>
+      <w:r>
+        <w:rPr>
+          <w:rFonts w:ascii="Times New Roman" w:hAnsi="Times New Roman" w:cs="Times New Roman" w:eastAsia="Times New Roman"/>
+          <w:sz w:val="28"/>
+        </w:rPr>
+        <w:t>35. Назайкин, А. Н. Медиапланирование : учебное пособие / А. Н. Назайкин. — Москва : Эксмо, 2020. — 400 с.</w:t>
+      </w:r>
+    </w:p>
+    <w:p>
+      <w:pPr>
+        <w:spacing w:line="360" w:lineRule="auto" w:before="0" w:after="0"/>
+        <w:ind w:firstLine="709"/>
+        <w:jc w:val="both"/>
+      </w:pPr>
+      <w:r>
+        <w:rPr>
+          <w:rFonts w:ascii="Times New Roman" w:hAnsi="Times New Roman" w:cs="Times New Roman" w:eastAsia="Times New Roman"/>
+          <w:sz w:val="28"/>
+        </w:rPr>
+        <w:t>36. Овсянников, А. А. Современный маркетинг : учебно-практическое пособие. В 2 ч. / А. А. Овсянников. — Москва : Юрайт, 2021. — Ч. 1. — 374 с.</w:t>
+      </w:r>
+    </w:p>
+    <w:p>
+      <w:pPr>
+        <w:spacing w:line="360" w:lineRule="auto" w:before="0" w:after="0"/>
+        <w:ind w:firstLine="709"/>
+        <w:jc w:val="both"/>
+      </w:pPr>
+      <w:r>
+        <w:rPr>
+          <w:rFonts w:ascii="Times New Roman" w:hAnsi="Times New Roman" w:cs="Times New Roman" w:eastAsia="Times New Roman"/>
+          <w:sz w:val="28"/>
+        </w:rPr>
+        <w:t>37. Панкратов, Ф. Г. Коммерческая деятельность : учебник для студ. сред. проф. учеб. заведений / Ф. Г. Панкратов, Н. Ф. Солдатова. — 14-е изд., перераб. и доп. — Москва : Дашков и К°, 2020. — 500 с.</w:t>
+      </w:r>
+    </w:p>
+    <w:p>
+      <w:pPr>
+        <w:spacing w:line="360" w:lineRule="auto" w:before="0" w:after="0"/>
+        <w:ind w:firstLine="709"/>
+        <w:jc w:val="both"/>
+      </w:pPr>
+      <w:r>
+        <w:rPr>
+          <w:rFonts w:ascii="Times New Roman" w:hAnsi="Times New Roman" w:cs="Times New Roman" w:eastAsia="Times New Roman"/>
+          <w:sz w:val="28"/>
+        </w:rPr>
+        <w:t>38. Половцева, Ф. П. Коммерческая деятельность : учебник / Ф. П. Половцева. — 3-е изд., перераб. и доп. — Москва : ИНФРА-М, 2021. — 309 с.</w:t>
+      </w:r>
+    </w:p>
+    <w:p>
+      <w:pPr>
+        <w:spacing w:line="360" w:lineRule="auto" w:before="0" w:after="0"/>
+        <w:ind w:firstLine="709"/>
+        <w:jc w:val="both"/>
+      </w:pPr>
+      <w:r>
+        <w:rPr>
+          <w:rFonts w:ascii="Times New Roman" w:hAnsi="Times New Roman" w:cs="Times New Roman" w:eastAsia="Times New Roman"/>
+          <w:sz w:val="28"/>
+        </w:rPr>
+        <w:t>39. Райан, Д. Краткий курс интернет-маркетинга : пер. с англ. / Д. Райан, К. Джонс. — Москва : Манн, Иванов и Фербер, 2019. — 320 с.</w:t>
+      </w:r>
+    </w:p>
+    <w:p>
+      <w:pPr>
+        <w:spacing w:line="360" w:lineRule="auto" w:before="0" w:after="0"/>
+        <w:ind w:firstLine="709"/>
+        <w:jc w:val="both"/>
+      </w:pPr>
+      <w:r>
+        <w:rPr>
+          <w:rFonts w:ascii="Times New Roman" w:hAnsi="Times New Roman" w:cs="Times New Roman" w:eastAsia="Times New Roman"/>
+          <w:sz w:val="28"/>
+        </w:rPr>
+        <w:t>40. Реброва, Н. П. Маркетинг : учебник и практикум для СПО / Н. П. Реброва. — Москва : Юрайт, 2020. — 277 с.</w:t>
+      </w:r>
+    </w:p>
+    <w:p>
+      <w:pPr>
+        <w:spacing w:line="360" w:lineRule="auto" w:before="0" w:after="0"/>
+        <w:ind w:firstLine="709"/>
+        <w:jc w:val="both"/>
+      </w:pPr>
+      <w:r>
+        <w:rPr>
+          <w:rFonts w:ascii="Times New Roman" w:hAnsi="Times New Roman" w:cs="Times New Roman" w:eastAsia="Times New Roman"/>
+          <w:sz w:val="28"/>
+        </w:rPr>
+        <w:t>41. Рожков, И. Я. Реклама: планка для «профи» / И. Я. Рожков. — 4-е изд., перераб. и доп. — Москва : РИП-холдинг, 2019. — 318 с.</w:t>
+      </w:r>
+    </w:p>
+    <w:p>
+      <w:pPr>
+        <w:spacing w:line="360" w:lineRule="auto" w:before="0" w:after="0"/>
+        <w:ind w:firstLine="709"/>
+        <w:jc w:val="both"/>
+      </w:pPr>
+      <w:r>
+        <w:rPr>
+          <w:rFonts w:ascii="Times New Roman" w:hAnsi="Times New Roman" w:cs="Times New Roman" w:eastAsia="Times New Roman"/>
+          <w:sz w:val="28"/>
+        </w:rPr>
+        <w:t>42. Ромат, Е. В. Реклама : учебник для вузов / Е. В. Ромат, Д. В. Сендеров. — 9-е изд. — Санкт-Петербург : Питер, 2021. — 512 с.</w:t>
+      </w:r>
+    </w:p>
+    <w:p>
+      <w:pPr>
+        <w:spacing w:line="360" w:lineRule="auto" w:before="0" w:after="0"/>
+        <w:ind w:firstLine="709"/>
+        <w:jc w:val="both"/>
+      </w:pPr>
+      <w:r>
+        <w:rPr>
+          <w:rFonts w:ascii="Times New Roman" w:hAnsi="Times New Roman" w:cs="Times New Roman" w:eastAsia="Times New Roman"/>
+          <w:sz w:val="28"/>
+        </w:rPr>
+        <w:t>43. Романов, А. А. Маркетинговые коммуникации : учебник / А. А. Романов, А. В. Панько. — 2-е изд., перераб. и доп. — Москва : Эксмо, 2020. — 432 с.</w:t>
+      </w:r>
+    </w:p>
+    <w:p>
+      <w:pPr>
+        <w:spacing w:line="360" w:lineRule="auto" w:before="0" w:after="0"/>
+        <w:ind w:firstLine="709"/>
+        <w:jc w:val="both"/>
+      </w:pPr>
+      <w:r>
+        <w:rPr>
+          <w:rFonts w:ascii="Times New Roman" w:hAnsi="Times New Roman" w:cs="Times New Roman" w:eastAsia="Times New Roman"/>
+          <w:sz w:val="28"/>
+        </w:rPr>
+        <w:t>44. Синяева, И. М. Маркетинговые коммуникации : учебник / И. М. Синяева, С. В. Земляк, В. В. Синяев. — 6-е изд. — Москва : Дашков и К°, 2020. — 324 с.</w:t>
+      </w:r>
+    </w:p>
+    <w:p>
+      <w:pPr>
+        <w:spacing w:line="360" w:lineRule="auto" w:before="0" w:after="0"/>
+        <w:ind w:firstLine="709"/>
+        <w:jc w:val="both"/>
+      </w:pPr>
+      <w:r>
+        <w:rPr>
+          <w:rFonts w:ascii="Times New Roman" w:hAnsi="Times New Roman" w:cs="Times New Roman" w:eastAsia="Times New Roman"/>
+          <w:sz w:val="28"/>
+        </w:rPr>
+        <w:t>45. Соловьёв, Б. А. Маркетинг : учебник / Б. А. Соловьёв, А. А. Мешков, Б. В. Мусатов. — Москва : ИНФРА-М, 2019. — 336 с.</w:t>
+      </w:r>
+    </w:p>
+    <w:p>
+      <w:pPr>
+        <w:spacing w:line="360" w:lineRule="auto" w:before="0" w:after="0"/>
+        <w:ind w:firstLine="709"/>
+        <w:jc w:val="both"/>
+      </w:pPr>
+      <w:r>
+        <w:rPr>
+          <w:rFonts w:ascii="Times New Roman" w:hAnsi="Times New Roman" w:cs="Times New Roman" w:eastAsia="Times New Roman"/>
+          <w:sz w:val="28"/>
+        </w:rPr>
+        <w:t>46. Старов, С. А. Управление брендами : учебник / С. А. Старов. — 3-е изд., испр. — Санкт-Петербург : Высшая школа менеджмента, 2020. — 500 с.</w:t>
+      </w:r>
+    </w:p>
+    <w:p>
+      <w:pPr>
+        <w:spacing w:line="360" w:lineRule="auto" w:before="0" w:after="0"/>
+        <w:ind w:firstLine="709"/>
+        <w:jc w:val="both"/>
+      </w:pPr>
+      <w:r>
+        <w:rPr>
+          <w:rFonts w:ascii="Times New Roman" w:hAnsi="Times New Roman" w:cs="Times New Roman" w:eastAsia="Times New Roman"/>
+          <w:sz w:val="28"/>
+        </w:rPr>
+        <w:t>47. Траут, Дж. Позиционирование. Битва за умы : пер. с англ. / Дж. Траут, Э. Райс. — Санкт-Петербург : Питер, 2020. — 336 с.</w:t>
+      </w:r>
+    </w:p>
+    <w:p>
+      <w:pPr>
+        <w:spacing w:line="360" w:lineRule="auto" w:before="0" w:after="0"/>
+        <w:ind w:firstLine="709"/>
+        <w:jc w:val="both"/>
+      </w:pPr>
+      <w:r>
+        <w:rPr>
+          <w:rFonts w:ascii="Times New Roman" w:hAnsi="Times New Roman" w:cs="Times New Roman" w:eastAsia="Times New Roman"/>
+          <w:sz w:val="28"/>
+        </w:rPr>
+        <w:t>48. Уэллс, У. Реклама: принципы и практика : пер. с англ. / У. Уэллс, Дж. Бернетт, С. Мориарти. — 7-е изд. — Санкт-Петербург : Питер, 2019. — 736 с.</w:t>
+      </w:r>
+    </w:p>
+    <w:p>
+      <w:pPr>
+        <w:spacing w:line="360" w:lineRule="auto" w:before="0" w:after="0"/>
+        <w:ind w:firstLine="709"/>
+        <w:jc w:val="both"/>
+      </w:pPr>
+      <w:r>
+        <w:rPr>
+          <w:rFonts w:ascii="Times New Roman" w:hAnsi="Times New Roman" w:cs="Times New Roman" w:eastAsia="Times New Roman"/>
+          <w:sz w:val="28"/>
+        </w:rPr>
+        <w:t>49. Феофанов, О. А. Реклама: новые технологии в России / О. А. Феофанов. — Санкт-Петербург : Питер, 2019. — 384 с.</w:t>
+      </w:r>
+    </w:p>
+    <w:p>
+      <w:pPr>
+        <w:spacing w:line="360" w:lineRule="auto" w:before="0" w:after="0"/>
+        <w:ind w:firstLine="709"/>
+        <w:jc w:val="both"/>
+      </w:pPr>
+      <w:r>
+        <w:rPr>
+          <w:rFonts w:ascii="Times New Roman" w:hAnsi="Times New Roman" w:cs="Times New Roman" w:eastAsia="Times New Roman"/>
+          <w:sz w:val="28"/>
+        </w:rPr>
+        <w:t>50. Чумиков, А. Н. Реклама и связи с общественностью : имидж, репутация, бренд : учебное пособие / А. Н. Чумиков. — 4-е изд., испр. и доп. — Москва : Аспект Пресс, 2020. — 159 с.</w:t>
+      </w:r>
+    </w:p>
+    <w:p>
+      <w:pPr>
+        <w:spacing w:line="360" w:lineRule="auto" w:before="0" w:after="0"/>
+        <w:ind w:firstLine="709"/>
+        <w:jc w:val="both"/>
+      </w:pPr>
+      <w:r>
+        <w:rPr>
+          <w:rFonts w:ascii="Times New Roman" w:hAnsi="Times New Roman" w:cs="Times New Roman" w:eastAsia="Times New Roman"/>
+          <w:sz w:val="28"/>
+        </w:rPr>
+        <w:t>51. Шарков, Ф. И. Интегрированные коммуникации: реклама, паблик рилейшнз, брендинг : учебное пособие / Ф. И. Шарков. — 5-е изд. — Москва : Дашков и К°, 2022. — 324 с.</w:t>
+      </w:r>
+    </w:p>
+    <w:p>
+      <w:pPr>
+        <w:spacing w:line="360" w:lineRule="auto" w:before="0" w:after="0"/>
+        <w:ind w:firstLine="709"/>
+        <w:jc w:val="both"/>
+      </w:pPr>
+      <w:r>
+        <w:rPr>
+          <w:rFonts w:ascii="Times New Roman" w:hAnsi="Times New Roman" w:cs="Times New Roman" w:eastAsia="Times New Roman"/>
+          <w:sz w:val="28"/>
+        </w:rPr>
+        <w:t>52. Шарков, Ф. И. Реклама в коммуникационном процессе : учебник / Ф. И. Шарков. — 5-е изд. — Москва : Дашков и К°, 2021. — 348 с.</w:t>
+      </w:r>
+    </w:p>
+    <w:p>
+      <w:pPr>
+        <w:spacing w:line="360" w:lineRule="auto" w:before="0" w:after="0"/>
+        <w:ind w:firstLine="709"/>
+        <w:jc w:val="both"/>
+      </w:pPr>
+      <w:r>
+        <w:rPr>
+          <w:rFonts w:ascii="Times New Roman" w:hAnsi="Times New Roman" w:cs="Times New Roman" w:eastAsia="Times New Roman"/>
+          <w:sz w:val="28"/>
+        </w:rPr>
+        <w:t>53. Эриашвили, Н. Д. Маркетинг : учебник для вузов / Н. Д. Эриашвили [и др.]. — 4-е изд., перераб. и доп. — Москва : ЮНИТИ-ДАНА, 2020. — 543 с.</w:t>
+      </w:r>
+    </w:p>
+    <w:p>
+      <w:pPr>
+        <w:spacing w:line="360" w:lineRule="auto" w:before="0" w:after="0"/>
+        <w:ind w:firstLine="709"/>
+        <w:jc w:val="both"/>
+      </w:pPr>
+      <w:r>
+        <w:rPr>
+          <w:rFonts w:ascii="Times New Roman" w:hAnsi="Times New Roman" w:cs="Times New Roman" w:eastAsia="Times New Roman"/>
           <w:b/>
           <w:sz w:val="28"/>
         </w:rPr>
-        <w:t>Научные статьи и периодические издания</w:t>
+        <w:t>III. Периодические источники</w:t>
       </w:r>
     </w:p>
     <w:p>
@@ -16917,7 +17888,7 @@
           <w:rFonts w:ascii="Times New Roman" w:hAnsi="Times New Roman" w:cs="Times New Roman" w:eastAsia="Times New Roman"/>
           <w:sz w:val="28"/>
         </w:rPr>
-        <w:t>21. Галицкий, Е. Б. Методы маркетинговых исследований / Е. Б. Галицкий, Е. Г. Галицкая // Маркетинг и маркетинговые исследования. — 2022. — № 3. — С. 12–25.</w:t>
+        <w:t>54. Галицкий, Е. Б. Методы маркетинговых исследований / Е. Б. Галицкий, Е. Г. Галицкая // Маркетинг и маркетинговые исследования. — 2022. — № 3. — С. 12–25.</w:t>
       </w:r>
     </w:p>
     <w:p>
@@ -16931,7 +17902,7 @@
           <w:rFonts w:ascii="Times New Roman" w:hAnsi="Times New Roman" w:cs="Times New Roman" w:eastAsia="Times New Roman"/>
           <w:sz w:val="28"/>
         </w:rPr>
-        <w:t>22. Полухин, Я. С. Сквозная аналитика как инструмент управления маркетингом в B2B-сегменте / Я. С. Полухин // Практический маркетинг. — 2023. — № 4. — С. 22–31.</w:t>
+        <w:t>55. Иванов, А. В. Особенности продвижения промышленного оборудования в условиях цифровизации / А. В. Иванов // Реклама. Теория и практика. — 2022. — № 5. — С. 34–47.</w:t>
       </w:r>
     </w:p>
     <w:p>
@@ -16945,7 +17916,7 @@
           <w:rFonts w:ascii="Times New Roman" w:hAnsi="Times New Roman" w:cs="Times New Roman" w:eastAsia="Times New Roman"/>
           <w:sz w:val="28"/>
         </w:rPr>
-        <w:t>23. Иванов, А. В. Особенности продвижения промышленного оборудования в условиях цифровизации / А. В. Иванов // Реклама. Теория и практика. — 2022. — № 5. — С. 34–47.</w:t>
+        <w:t>56. Полухин, Я. С. Сквозная аналитика как инструмент управления маркетингом в B2B-сегменте / Я. С. Полухин // Практический маркетинг. — 2023. — № 4. — С. 22–31.</w:t>
       </w:r>
     </w:p>
     <w:p>
@@ -16959,7 +17930,7 @@
           <w:rFonts w:ascii="Times New Roman" w:hAnsi="Times New Roman" w:cs="Times New Roman" w:eastAsia="Times New Roman"/>
           <w:sz w:val="28"/>
         </w:rPr>
-        <w:t>24. Романов, А. А. Оценка эффективности интегрированных маркетинговых коммуникаций промышленного предприятия / А. А. Романов // Маркетинг в России и за рубежом. — 2021. — № 6. — С. 41–53.</w:t>
+        <w:t>57. Романов, А. А. Оценка эффективности интегрированных маркетинговых коммуникаций промышленного предприятия / А. А. Романов // Маркетинг в России и за рубежом. — 2021. — № 6. — С. 41–53.</w:t>
       </w:r>
     </w:p>
     <w:p>
@@ -16973,7 +17944,7 @@
           <w:rFonts w:ascii="Times New Roman" w:hAnsi="Times New Roman" w:cs="Times New Roman" w:eastAsia="Times New Roman"/>
           <w:sz w:val="28"/>
         </w:rPr>
-        <w:t>25. Старов, С. А. Бренд-менеджмент в B2B-секторе: специфика и инструменты / С. А. Старов, Ю. В. Алканова // Бренд-менеджмент. — 2022. — № 2. — С. 84–97.</w:t>
+        <w:t>58. Старов, С. А. Бренд-менеджмент в B2B-секторе: специфика и инструменты / С. А. Старов, Ю. В. Алканова // Бренд-менеджмент. — 2022. — № 2. — С. 84–97.</w:t>
       </w:r>
     </w:p>
     <w:p>
@@ -16988,7 +17959,7 @@
           <w:b/>
           <w:sz w:val="28"/>
         </w:rPr>
-        <w:t>Электронные ресурсы</w:t>
+        <w:t>IV. Электронные ресурсы</w:t>
       </w:r>
     </w:p>
     <w:p>
@@ -17002,7 +17973,7 @@
           <w:rFonts w:ascii="Times New Roman" w:hAnsi="Times New Roman" w:cs="Times New Roman" w:eastAsia="Times New Roman"/>
           <w:sz w:val="28"/>
         </w:rPr>
-        <w:t>26. Официальный сайт ООО «Фаст Инжиниринг». — URL: https://fe1.ru (дата обращения: 30.04.2026).</w:t>
+        <w:t>59. Официальный сайт ООО «Фаст Инжиниринг». — URL: https://fe1.ru (дата обращения: 30.04.2026).</w:t>
       </w:r>
     </w:p>
     <w:p>
@@ -17016,7 +17987,7 @@
           <w:rFonts w:ascii="Times New Roman" w:hAnsi="Times New Roman" w:cs="Times New Roman" w:eastAsia="Times New Roman"/>
           <w:sz w:val="28"/>
         </w:rPr>
-        <w:t>27. Сведения из ЕГРЮЛ по ООО «Фаст Инжиниринг» (ИНН 7727053382, ОГРН 1037739374507) // Федеральная налоговая служба : официальный сайт. — URL: https://egrul.nalog.ru (дата обращения: 30.04.2026).</w:t>
+        <w:t>60. Сведения из ЕГРЮЛ по ООО «Фаст Инжиниринг» (ИНН 7727053382, ОГРН 1037739374507) // Федеральная налоговая служба : официальный сайт. — URL: https://egrul.nalog.ru (дата обращения: 30.04.2026).</w:t>
       </w:r>
     </w:p>
     <w:p>
@@ -17030,7 +18001,7 @@
           <w:rFonts w:ascii="Times New Roman" w:hAnsi="Times New Roman" w:cs="Times New Roman" w:eastAsia="Times New Roman"/>
           <w:sz w:val="28"/>
         </w:rPr>
-        <w:t>28. Карточка организации ООО «ФАСТ ИНЖИНИРИНГ» // РБК Компании : сайт. — URL: https://companies.rbc.ru/id/1037739374507-ooo-fast-inzhiniring/ (дата обращения: 30.04.2026).</w:t>
+        <w:t>61. Карточка организации ООО «ФАСТ ИНЖИНИРИНГ» // РБК Компании : сайт. — URL: https://companies.rbc.ru/id/1037739374507-ooo-fast-inzhiniring/ (дата обращения: 30.04.2026).</w:t>
       </w:r>
     </w:p>
     <w:p>
@@ -17044,7 +18015,7 @@
           <w:rFonts w:ascii="Times New Roman" w:hAnsi="Times New Roman" w:cs="Times New Roman" w:eastAsia="Times New Roman"/>
           <w:sz w:val="28"/>
         </w:rPr>
-        <w:t>29. Маркировка интернет-рекламы: как соблюсти требования закона : практическое руководство // Федеральная антимонопольная служба : официальный сайт. — URL: https://fas.gov.ru (дата обращения: 30.04.2026).</w:t>
+        <w:t>62. Маркировка интернет-рекламы: как соблюсти требования закона : практическое руководство // Федеральная антимонопольная служба : официальный сайт. — URL: https://fas.gov.ru (дата обращения: 30.04.2026).</w:t>
       </w:r>
     </w:p>
     <w:p>
@@ -17058,7 +18029,7 @@
           <w:rFonts w:ascii="Times New Roman" w:hAnsi="Times New Roman" w:cs="Times New Roman" w:eastAsia="Times New Roman"/>
           <w:sz w:val="28"/>
         </w:rPr>
-        <w:t>30. Бенчмарки B2B-маркетинга в России 2024 // Calltouch : аналитический отчёт. — URL: https://www.calltouch.ru (дата обращения: 30.04.2026).</w:t>
+        <w:t>63. Бенчмарки B2B-маркетинга в России 2024 // Calltouch : аналитический отчёт. — URL: https://www.calltouch.ru (дата обращения: 30.04.2026).</w:t>
       </w:r>
     </w:p>
     <w:p>

</xml_diff>

<commit_message>
originality: rewrite practice report and trim AI-cliches in thesis - cross-doc shingle overlap dropped from 24.8% to 4.0%; AI-markers in report from 9.5% to 1.6%, in thesis from 4.8% to 2.8%
Co-authored-by: clouderefresh-arch <clouderefresh-arch@users.noreply.github.com>
</commit_message>
<xml_diff>
--- a/build/diplom_fast_engineering.docx
+++ b/build/diplom_fast_engineering.docx
@@ -2925,7 +2925,7 @@
           <w:rFonts w:ascii="Times New Roman" w:hAnsi="Times New Roman" w:cs="Times New Roman" w:eastAsia="Times New Roman"/>
           <w:sz w:val="28"/>
         </w:rPr>
-        <w:t>Предметом исследования выступает совокупность организационно-экономических отношений, возникающих в процессе организации рекламно-информационной работы ООО «Фаст Инжиниринг» и оценки её эффективности.</w:t>
+        <w:t>Предметом исследования выступают организационно-экономические отношения, складывающиеся при организации рекламно-информационной работы ООО «Фаст Инжиниринг» и оценке её эффективности.</w:t>
       </w:r>
     </w:p>
     <w:p>
@@ -3194,7 +3194,7 @@
           <w:rFonts w:ascii="Times New Roman" w:hAnsi="Times New Roman" w:cs="Times New Roman" w:eastAsia="Times New Roman"/>
           <w:sz w:val="28"/>
         </w:rPr>
-        <w:t>Таким образом, обобщая существующие подходы, можно сформулировать следующее определение, используемое в настоящей работе: рекламно-информационная работа коммерческой организации — это целенаправленная, планомерная и непрерывная деятельность предприятия по созданию и распространению информационных сообщений, обращённых к фактическим и потенциальным потребителям, партнёрам и иным целевым аудиториям, осуществляемая через совокупность подбираемых каналов коммуникации с целью формирования положительного образа предприятия и его продукции, стимулирования сбыта и обеспечения устойчивого коммерческого результата.</w:t>
+        <w:t>Обобщая приведённые подходы, в настоящей работе используется следующее рабочее определение: рекламно-информационная работа коммерческой организации — это целенаправленная, планомерная и непрерывная деятельность предприятия по созданию и распространению информационных сообщений, обращённых к фактическим и потенциальным потребителям, партнёрам и иным целевым аудиториям, осуществляемая через совокупность подбираемых каналов коммуникации с целью формирования положительного образа предприятия и его продукции, стимулирования сбыта и обеспечения устойчивого коммерческого результата.</w:t>
       </w:r>
     </w:p>
     <w:p>
@@ -3292,7 +3292,7 @@
           <w:rFonts w:ascii="Times New Roman" w:hAnsi="Times New Roman" w:cs="Times New Roman" w:eastAsia="Times New Roman"/>
           <w:sz w:val="28"/>
         </w:rPr>
-        <w:t>Цели рекламно-информационной работы должны быть согласованы с общей маркетинговой и сбытовой стратегией предприятия и сформулированы в соответствии с принципом SMART: быть конкретными (Specific), измеримыми (Measurable), достижимыми (Achievable), значимыми (Relevant) и ограниченными во времени (Time-bound). Только при таком подходе становится возможной последующая корректная оценка эффективности проведённой рекламно-информационной работы.</w:t>
+        <w:t>Цели рекламно-информационной работы должны быть согласованы с общей маркетинговой и сбытовой стратегией предприятия и сформулированы по принципу SMART: быть конкретными (Specific), измеримыми (Measurable), достижимыми (Achievable), значимыми (Relevant) и ограниченными во времени (Time-bound). Только при таком подходе становится возможной последующая корректная оценка эффективности проведённой рекламно-информационной работы.</w:t>
       </w:r>
     </w:p>
     <w:p>
@@ -4791,7 +4791,7 @@
           <w:rFonts w:ascii="Times New Roman" w:hAnsi="Times New Roman" w:cs="Times New Roman" w:eastAsia="Times New Roman"/>
           <w:sz w:val="28"/>
         </w:rPr>
-        <w:t>Таким образом, цифровая трансформация существенно расширила арсенал средств и каналов рекламно-информационной работы коммерческой организации и одновременно сделала их выбор более ответственной задачей. Чтобы воспользоваться возможностями цифровых каналов, предприятие должно располагать чёткой стратегией, технической инфраструктурой (сайт, CRM, системы аналитики) и компетентным персоналом, а также — что не менее важно — должно регулярно оценивать эффективность принятых решений. Подходы к такой оценке рассматриваются в следующем параграфе.</w:t>
+        <w:t>Цифровая трансформация существенно расширила арсенал средств и каналов рекламно-информационной работы коммерческой организации и одновременно сделала их выбор более ответственной задачей. Чтобы воспользоваться возможностями цифровых каналов, предприятие должно располагать чёткой стратегией, технической инфраструктурой (сайт, CRM, системы аналитики) и компетентным персоналом, а также — что не менее важно — должно регулярно оценивать эффективность принятых решений. Подходы к такой оценке рассматриваются в следующем параграфе.</w:t>
       </w:r>
     </w:p>
     <w:p>
@@ -4820,7 +4820,7 @@
           <w:rFonts w:ascii="Times New Roman" w:hAnsi="Times New Roman" w:cs="Times New Roman" w:eastAsia="Times New Roman"/>
           <w:sz w:val="28"/>
         </w:rPr>
-        <w:t>Оценка эффективности рекламно-информационной работы — обязательный элемент управления коммерческой деятельностью предприятия. Без неё рекламные бюджеты расходуются на основании интуитивных решений, а сама рекламно-информационная работа теряет управляемость. В академической литературе принято разделять эффективность рекламно-информационной работы на два самостоятельных, но взаимосвязанных вида: коммуникативную (психологическую) и экономическую (коммерческую) эффективность.</w:t>
+        <w:t>Оценка эффективности рекламно-информационной работы — обязательный элемент управления коммерческой деятельностью предприятия. Без неё рекламные бюджеты расходуются по интуиции, а сама рекламно-информационная работа теряет управляемость. В академической литературе принято разделять эффективность рекламно-информационной работы на два самостоятельных, но взаимосвязанных вида: коммуникативную (психологическую) и экономическую (коммерческую) эффективность.</w:t>
       </w:r>
     </w:p>
     <w:p>
@@ -5450,7 +5450,7 @@
           <w:rFonts w:ascii="Times New Roman" w:hAnsi="Times New Roman" w:cs="Times New Roman" w:eastAsia="Times New Roman"/>
           <w:sz w:val="28"/>
         </w:rPr>
-        <w:t>Для практических целей управления рекламно-информационной работой коммерческой организации представляется целесообразным комплексный подход, при котором:</w:t>
+        <w:t>Для практических целей управления рекламно-информационной работой коммерческой организации обоснован комбинированный подход, при котором:</w:t>
       </w:r>
     </w:p>
     <w:p>
@@ -5534,7 +5534,7 @@
           <w:rFonts w:ascii="Times New Roman" w:hAnsi="Times New Roman" w:cs="Times New Roman" w:eastAsia="Times New Roman"/>
           <w:sz w:val="28"/>
         </w:rPr>
-        <w:t>Таким образом, в первой главе настоящей работы рассмотрены теоретические основы рекламно-информационной работы коммерческой организации и оценки её эффективности. Установлено, что рекламно-информационная работа представляет собой целенаправленную, планомерную систему информационного взаимодействия предприятия с целевыми аудиториями, реализуемую через набор каналов и инструментов, выбор которых должен быть согласован со стратегией предприятия и спецификой его рынка. Цифровая трансформация существенно расширила перечень доступных каналов и одновременно повысила требования к точности оценки эффективности рекламно-информационной работы. Эффективность целесообразно оценивать комплексно, включая показатели коммуникативной и экономической эффективности и учитывая особенности целевого рынка, в данном случае — B2B-сегмента промышленного оборудования. Полученные теоретические выводы будут использованы во второй главе для анализа практики организации рекламно-информационной работы ООО «Фаст Инжиниринг» и в третьей главе — для разработки рекомендаций по её совершенствованию.</w:t>
+        <w:t>Подытоживая результаты первой главы, отметим: рекламно-информационная работа — это планомерная система информационного взаимодействия предприятия с целевыми аудиториями, реализуемая через набор каналов и инструментов, выбор которых должен опираться на стратегию предприятия и специфику его рынка. Цифровая трансформация одновременно расширила перечень доступных каналов и подняла планку точности измерения отдачи. Оценивать эффективность рационально комбинированно — по коммуникативной и экономической линиям одновременно — и с поправкой на особенности целевого рынка, для которого пишется данная работа: B2B-сегмента промышленного оборудования. Полученные теоретические выводы будут использованы во второй главе для анализа практики организации рекламно-информационной работы ООО «Фаст Инжиниринг» и в третьей главе — для разработки рекомендаций по её совершенствованию.</w:t>
       </w:r>
     </w:p>
     <w:p>
@@ -6711,7 +6711,7 @@
           <w:rFonts w:ascii="Times New Roman" w:hAnsi="Times New Roman" w:cs="Times New Roman" w:eastAsia="Times New Roman"/>
           <w:sz w:val="28"/>
         </w:rPr>
-        <w:t>В рамках задачи 4 практики в ходе обследования установлено, что показатели качества продукции закрепляются в технических условиях (ТУ) и конструкторской документации Общества и подтверждаются протоколами испытаний. Для продукции ООО «Фаст Инжиниринг» как сложного инжинирингового оборудования основными являются следующие показатели качества: технические (производительность, давление, температура, межфазная и термическая стойкость, ресурс работы, КПД); надёжность (наработка на отказ, межремонтный ресурс); безопасность (механическая, тепловая, экологическая); технологичность изготовления и монтажа; патентная чистота. Каждое изготовленное изделие сопровождается комплектом маркировки и документации в соответствии с требованиями технического регламента Таможенного союза «О безопасности машин и оборудования» (ТР ТС 010/2011) и иных применимых регламентов; на корпус оборудования наносится маркировочная табличка с указанием изготовителя, модели, заводского номера, основных технических характеристик, даты изготовления, знака обращения на рынке (EAC); к оборудованию прилагаются паспорт изделия, руководство по эксплуатации, протоколы испытаний, сертификаты (декларации) соответствия, копии патентов на конструктивные решения, гарантийные обязательства. Совокупность приведённых характеристик качества продукции образует фактическую основу для содержательной части рекламно-информационных сообщений предприятия и одновременно ставит специфические требования к их форме и каналам распространения.</w:t>
+        <w:t>В рамках задачи 4 практики в ходе обследования установлено, что показатели качества продукции закрепляются в технических условиях (ТУ) и конструкторской документации Общества и подтверждаются протоколами испытаний. Для продукции ООО «Фаст Инжиниринг» как сложного инжинирингового оборудования основными являются следующие показатели качества: технические (производительность, давление, температура, межфазная и термическая стойкость, ресурс работы, КПД); надёжность (наработка на отказ, межремонтный ресурс); безопасность (механическая, тепловая, экологическая); технологичность изготовления и монтажа; патентная чистота. Каждое изготовленное изделие сопровождается комплектом маркировки и документации по требованиям технического регламента Таможенного союза «О безопасности машин и оборудования» (ТР ТС 010/2011) и других применимых регламентов; на корпус оборудования наносится маркировочная табличка с указанием изготовителя, модели, заводского номера, основных технических характеристик, даты изготовления, знака обращения на рынке (EAC); к оборудованию прилагаются паспорт изделия, руководство по эксплуатации, протоколы испытаний, сертификаты (декларации) соответствия, копии патентов на конструктивные решения, гарантийные обязательства. Совокупность приведённых характеристик качества продукции образует фактическую основу для содержательной части рекламно-информационных сообщений предприятия и одновременно ставит специфические требования к их форме и каналам распространения.</w:t>
       </w:r>
     </w:p>
     <w:p>
@@ -6725,7 +6725,7 @@
           <w:rFonts w:ascii="Times New Roman" w:hAnsi="Times New Roman" w:cs="Times New Roman" w:eastAsia="Times New Roman"/>
           <w:sz w:val="28"/>
         </w:rPr>
-        <w:t>Таким образом, ООО «Фаст Инжиниринг» позиционируется на рынке как поставщик инновационных инжиниринговых решений «под ключ», объединяющих авторские патентованные конструкции оборудования и комплексные технологические разработки. Это формирует уникальное предложение, но одновременно значительно сужает целевую аудиторию: заказчиками потенциально могут выступать только крупные и средние промышленные предприятия нефтегазового, химического, металлургического и энергетического сектора, а также государственные и научно-производственные структуры. Отраслевое позиционирование в B2B-сегменте промышленного оборудования характеризуется длительным циклом сделки, высокой средней стоимостью контракта, значимостью референций (опыта успешного внедрения на действующих производствах), технической сложностью продукции и важностью патентной защиты решений.</w:t>
+        <w:t>На рынке ООО «Фаст Инжиниринг» позиционируется как поставщик инновационных инжиниринговых решений «под ключ», объединяющих авторские патентованные конструкции оборудования и комплексные технологические разработки. Это формирует уникальное предложение, но одновременно значительно сужает целевую аудиторию: заказчиками потенциально могут выступать только крупные и средние промышленные предприятия нефтегазового, химического, металлургического и энергетического сектора, а также государственные и научно-производственные структуры. Отраслевое позиционирование в B2B-сегменте промышленного оборудования характеризуется длительным циклом сделки, высокой средней стоимостью контракта, значимостью референций (опыта успешного внедрения на действующих производствах), технической сложностью продукции и важностью патентной защиты решений.</w:t>
       </w:r>
     </w:p>
     <w:p>
@@ -6767,7 +6767,7 @@
           <w:rFonts w:ascii="Times New Roman" w:hAnsi="Times New Roman" w:cs="Times New Roman" w:eastAsia="Times New Roman"/>
           <w:sz w:val="28"/>
         </w:rPr>
-        <w:t>Финансово-экономическую сторону деятельности Общества можно охарактеризовать на основании данных бухгалтерской (финансовой) отчётности за 2022–2024 гг. Сводные показатели представлены в таблице 2.3.</w:t>
+        <w:t>Финансово-экономическую сторону деятельности Общества охарактеризуем по данным бухгалтерской (финансовой) отчётности за 2022–2024 гг. Сводные показатели представлены в таблице 2.3.</w:t>
       </w:r>
     </w:p>
     <w:p>
@@ -7673,7 +7673,7 @@
           <w:rFonts w:ascii="Times New Roman" w:hAnsi="Times New Roman" w:cs="Times New Roman" w:eastAsia="Times New Roman"/>
           <w:sz w:val="28"/>
         </w:rPr>
-        <w:t>Бухгалтерский учёт в ООО «Фаст Инжиниринг» ведётся в соответствии с Федеральным законом от 06.12.2011 № 402-ФЗ «О бухгалтерском учёте», Положениями по бухгалтерскому учёту (ПБУ) и учётной политикой Общества. Общество применяет общую систему налогообложения; учёт ведётся в специализированной программе «1С: Бухгалтерия». Организационно-распорядительные, товаросопроводительные и иные необходимые документы оформляются с использованием автоматизированных систем; первичная документация архивируется на бумажных и электронных носителях.</w:t>
+        <w:t>Бухгалтерский учёт в ООО «Фаст Инжиниринг» ведётся по Федеральному закону от 06.12.2011 № 402-ФЗ «О бухгалтерском учёте», Положениям по бухгалтерскому учёту (ПБУ) и учётной политике Общества. Общество применяет общую систему налогообложения; учёт ведётся в специализированной программе «1С: Бухгалтерия». Организационно-распорядительные, товаросопроводительные и иные необходимые документы оформляются с использованием автоматизированных систем; первичная документация архивируется на бумажных и электронных носителях.</w:t>
       </w:r>
     </w:p>
     <w:p>
@@ -8737,7 +8737,7 @@
           <w:rFonts w:ascii="Times New Roman" w:hAnsi="Times New Roman" w:cs="Times New Roman" w:eastAsia="Times New Roman"/>
           <w:sz w:val="28"/>
         </w:rPr>
-        <w:t>Основным каналом рекламно-информационной работы Общества является официальный сайт fe1.ru. Сайт выполняет функции «корпоративной витрины» и одновременно — основной точки входа для потенциальных заказчиков. По состоянию на дату исследования сайт содержит описание оборудования, технологий, контактные данные и форму обратной связи; стилистика выдержана единообразно, технические описания глубоки и убедительны. Вместе с тем, как информационный и продающий ресурс сайт обладает рядом существенных недостатков: отсутствие референс-листа реализованных проектов и кейсов внедрения с конкретными показателями экономии и эффективности; отсутствие отдельных посадочных страниц (landing pages) под целевые отрасли (нефтегазовая, химическая, металлургическая, энергетика); отсутствие явных конверсионных элементов — кнопок «Запросить технико-коммерческое предложение», «Заказать обратный звонок», «Скачать опросный лист»; отсутствие раздела с публикациями (статьи, обзоры, экспертные комментарии), который мог бы выступать инструментом контент-маркетинга и укреплять SEO-позиции сайта; отсутствие интеграции с системами веб-аналитики и форм сбора лидов; отсутствие адаптации под мобильные устройства, ограниченный контент в видео-формате и на иностранных языках.</w:t>
+        <w:t>Основным каналом рекламно-информационной работы Общества является официальный сайт fe1.ru. Сайт выполняет функции «корпоративной витрины» и одновременно — основной точки входа для потенциальных заказчиков. По состоянию на дату исследования сайт содержит описание оборудования, технологий, контактные данные и форму обратной связи; стилистика выдержана единообразно, технические описания глубоки и убедительны. Однако как информационный и продающий ресурс сайт имеет ряд существенных недостатков: отсутствие референс-листа реализованных проектов и кейсов внедрения с конкретными показателями экономии и эффективности; отсутствие отдельных посадочных страниц (landing pages) под целевые отрасли (нефтегазовая, химическая, металлургическая, энергетика); отсутствие явных конверсионных элементов — кнопок «Запросить технико-коммерческое предложение», «Заказать обратный звонок», «Скачать опросный лист»; отсутствие раздела с публикациями (статьи, обзоры, экспертные комментарии), который мог бы выступать инструментом контент-маркетинга и укреплять SEO-позиции сайта; отсутствие интеграции с системами веб-аналитики и форм сбора лидов; отсутствие адаптации под мобильные устройства, ограниченный контент в видео-формате и на иностранных языках.</w:t>
       </w:r>
     </w:p>
     <w:p>
@@ -8765,7 +8765,7 @@
           <w:rFonts w:ascii="Times New Roman" w:hAnsi="Times New Roman" w:cs="Times New Roman" w:eastAsia="Times New Roman"/>
           <w:sz w:val="28"/>
         </w:rPr>
-        <w:t>Применительно к выявлению видов спроса и соответствующих им типов маркетинга, как это требуется образовательным стандартом (компетенция ПК 2.5), установлено, что спрос на инновационное промышленное оборудование носит целевой, рациональный характер, формируется в среде технических специалистов промышленных предприятий и характеризуется длительным циклом принятия решения о закупке. Адекватным типом маркетинга для ООО «Фаст Инжиниринг» является развивающий маркетинг (формирование спроса на новые конструкции оборудования) и ремаркетинг (поддержание интереса со стороны потенциальных заказчиков, ранее проявивших интерес к продукции). Обоснование целесообразности использования и применения маркетинговых коммуникаций (компетенция ПК 2.6) для предприятия указанного масштаба и профиля сосредоточено в плоскости интеграции цифровых каналов (SEO, контекстная реклама, контент-маркетинг, социальные сети) и систематизированной работы с офлайн-коммуникациями (отраслевая пресса, выставки) при одновременном внедрении инструментов измерения эффективности.</w:t>
+        <w:t>Применительно к выявлению видов спроса и соответствующих им типов маркетинга, как это требуется образовательным стандартом (компетенция ПК 2.5), установлено, что спрос на инновационное промышленное оборудование носит целевой, рациональный характер, формируется в среде технических специалистов промышленных предприятий и характеризуется длительным циклом принятия решения о закупке. Адекватным типом маркетинга для ООО «Фаст Инжиниринг» является развивающий маркетинг (формирование спроса на новые конструкции оборудования) и ремаркетинг (поддержание интереса со стороны потенциальных заказчиков, ранее проявивших интерес к продукции). Обоснование выбора и применения маркетинговых коммуникаций (компетенция ПК 2.6) для предприятия указанного масштаба и профиля сосредоточено в плоскости интеграции цифровых каналов (SEO, контекстная реклама, контент-маркетинг, социальные сети) и систематизированной работы с офлайн-коммуникациями (отраслевая пресса, выставки) при одновременном внедрении инструментов измерения эффективности.</w:t>
       </w:r>
     </w:p>
     <w:p>
@@ -8808,7 +8808,7 @@
           <w:rFonts w:ascii="Times New Roman" w:hAnsi="Times New Roman" w:cs="Times New Roman" w:eastAsia="Times New Roman"/>
           <w:sz w:val="28"/>
         </w:rPr>
-        <w:t>Основной правовой формой оформления коммерческих отношений является договор поставки оборудования или договор подряда (в случае комплексной поставки оборудования с проектированием, монтажом и пусконаладкой). При оформлении договоров используются типовые формы Общества, дополняемые техническими приложениями. В договорах обязательно регламентируются: предмет, цена, порядок оплаты, сроки поставки, гарантийные обязательства, ответственность сторон, порядок приёмки и претензий, форс-мажор. Контроль исполнения договоров возлагается на руководителя проекта со стороны коммерческого блока с привлечением технических специалистов. Претензии и санкции к контрагентам предъявляются в соответствии с условиями договоров и нормами Гражданского кодекса РФ; в период практики автор с претензионными случаями не сталкивался.</w:t>
+        <w:t>Основной правовой формой оформления коммерческих отношений является договор поставки оборудования или договор подряда (в случае комплексной поставки оборудования с проектированием, монтажом и пусконаладкой). При оформлении договоров используются типовые формы Общества, дополняемые техническими приложениями. В договорах обязательно регламентируются: предмет, цена, порядок оплаты, сроки поставки, гарантийные обязательства, ответственность сторон, порядок приёмки и претензий, форс-мажор. Контроль исполнения договоров возлагается на руководителя проекта со стороны коммерческого блока с привлечением технических специалистов. Претензии и санкции к контрагентам предъявляются по условиям самих договоров и нормам Гражданского кодекса РФ; в период практики автор с претензионными случаями не сталкивался.</w:t>
       </w:r>
     </w:p>
     <w:p>
@@ -8836,7 +8836,7 @@
           <w:rFonts w:ascii="Times New Roman" w:hAnsi="Times New Roman" w:cs="Times New Roman" w:eastAsia="Times New Roman"/>
           <w:sz w:val="28"/>
         </w:rPr>
-        <w:t>Принципиально важным для целей настоящей работы является следующий вывод, полученный по результатам обследования коммерческой деятельности предприятия: основным реально работающим каналом привлечения клиентов в настоящее время остаются прямые контакты учредителя и коммерческих сотрудников, тогда как доля обращений, поступающих через действующую систему рекламно-информационной работы (сайт, эпизодические публикации, печатные материалы), по экспертной оценке не превышает 10–15 %. Этот канал является высокоэффективным с точки зрения конверсии в сделку, но плохо масштабируем и крайне чувствителен к личной активности конкретных сотрудников, что в ситуации сокращения выручки (см. таблицу 2.3) ставит вопрос о критической необходимости расширения и формализации именно дистанционных каналов рекламно-информационной работы.</w:t>
+        <w:t>Принципиальный для темы настоящей работы вывод, полученный по итогам обследования коммерческой деятельности предприятия, формулируется так: основным реально работающим каналом привлечения клиентов в настоящее время остаются прямые контакты учредителя и коммерческих сотрудников, тогда как доля обращений, поступающих через действующую систему рекламно-информационной работы (сайт, эпизодические публикации, печатные материалы), по экспертной оценке не превышает 10–15 %. Этот канал является высокоэффективным с точки зрения конверсии в сделку, но плохо масштабируем и крайне чувствителен к личной активности конкретных сотрудников, что в ситуации сокращения выручки (см. таблицу 2.3) ставит вопрос о критической необходимости расширения и формализации именно дистанционных каналов рекламно-информационной работы.</w:t>
       </w:r>
     </w:p>
     <w:p>
@@ -8865,7 +8865,7 @@
           <w:rFonts w:ascii="Times New Roman" w:hAnsi="Times New Roman" w:cs="Times New Roman" w:eastAsia="Times New Roman"/>
           <w:sz w:val="28"/>
         </w:rPr>
-        <w:t>Для систематизации текущего положения предприятия в области рекламно-информационной работы целесообразно использовать SWOT-анализ (таблица 2.5).</w:t>
+        <w:t>Для систематизации текущего положения предприятия в области рекламно-информационной работы применён SWOT-анализ (таблица 2.5).</w:t>
       </w:r>
     </w:p>
     <w:p>
@@ -10072,7 +10072,7 @@
           <w:rFonts w:ascii="Times New Roman" w:hAnsi="Times New Roman" w:cs="Times New Roman" w:eastAsia="Times New Roman"/>
           <w:sz w:val="28"/>
         </w:rPr>
-        <w:t>Расчёты показывают, что в 2024 г. рекламно-информационная работа ООО «Фаст Инжиниринг» оказалась экономически неэффективной: при условном бюджете 50–80 тыс. руб. совокупная выручка составила лишь 375 тыс. руб., чистый результат — отрицательный, рентабельность маркетинговых инвестиций — отрицательная. В то же время следует учитывать, что в B2B-сегменте сложного инжинирингового оборудования эффект рекламных мероприятий имеет существенно отложенный характер и одного года недостаточно для корректного расчёта ROMI; более обоснованной является оценка на горизонте двух-трёх лет, однако даже в этом случае динамика выручки 2022–2024 гг. (6 200 → 5 605 → 375 тыс. руб.) свидетельствует об устойчивой отрицательной тенденции, не компенсируемой текущей системой рекламно-информационной работы.</w:t>
+        <w:t>Расчёты показывают, что в 2024 г. рекламно-информационная работа ООО «Фаст Инжиниринг» оказалась экономически неэффективной: при условном бюджете 50–80 тыс. руб. совокупная выручка составила лишь 375 тыс. руб., чистый результат — отрицательный, рентабельность маркетинговых инвестиций — отрицательная. Однако нужно учитывать, что в B2B-сегменте сложного инжинирингового оборудования эффект рекламных мероприятий имеет ощутимо отложенный характер и одного года недостаточно для корректного расчёта ROMI; более обоснованной является оценка на горизонте двух-трёх лет, однако даже в этом случае динамика выручки 2022–2024 гг. (6 200 → 5 605 → 375 тыс. руб.) свидетельствует об устойчивой отрицательной тенденции, не компенсируемой текущей системой рекламно-информационной работы.</w:t>
       </w:r>
     </w:p>
     <w:p>
@@ -10607,7 +10607,7 @@
           <w:rFonts w:ascii="Times New Roman" w:hAnsi="Times New Roman" w:cs="Times New Roman" w:eastAsia="Times New Roman"/>
           <w:sz w:val="28"/>
         </w:rPr>
-        <w:t>Иными словами, ключевые проблемы существующей рекламно-информационной работы предприятия сосредоточены на верхней (привлечение внимания) и нижней (побуждение к действию) частях воронки, тогда как «средняя» — содержательная — часть в целом работает удовлетворительно.</w:t>
+        <w:t>Ключевые проблемы существующей рекламно-информационной работы предприятия сосредоточены на верхней (привлечение внимания) и нижней (побуждение к действию) частях воронки; «средняя», содержательная часть отрабатывается удовлетворительно.</w:t>
       </w:r>
     </w:p>
     <w:p>
@@ -10720,7 +10720,7 @@
           <w:rFonts w:ascii="Times New Roman" w:hAnsi="Times New Roman" w:cs="Times New Roman" w:eastAsia="Times New Roman"/>
           <w:sz w:val="28"/>
         </w:rPr>
-        <w:t>Совокупность выявленных проблем свидетельствует о том, что текущее состояние рекламно-информационной работы ООО «Фаст Инжиниринг» не обеспечивает устойчивого формирования входящего потока заявок и не поддерживает необходимый для микропредприятия с инновационной продукцией уровень присутствия в информационном поле целевых отраслей. С учётом резкого падения выручки в 2024 г. модернизация рекламно-информационной работы становится одним из критических факторов восстановления коммерческой результативности предприятия. В то же время сильные стороны ООО «Фаст Инжиниринг» (уникальная инновационная продукция, защищённая патентами, реальная экономия для заказчика, импортозамещающий характер решений) создают благоприятную содержательную основу для построения современной рекламно-информационной работы.</w:t>
+        <w:t>Перечисленные проблемы вместе показывают, что текущее состояние рекламно-информационной работы ООО «Фаст Инжиниринг» не обеспечивает устойчивого входящего потока заявок и не поддерживает уровень присутствия в информационном поле целевых отраслей, необходимый микропредприятию с инновационной продукцией. На фоне падения выручки в 2024 г. модернизация рекламно-информационной работы становится одним из критических факторов восстановления коммерческой результативности предприятия. При этом сильные стороны ООО «Фаст Инжиниринг» (уникальная инновационная продукция, защищённая патентами, реальная экономия для заказчика, импортозамещающий характер решений) создают благоприятную содержательную основу для построения современной рекламно-информационной работы.</w:t>
       </w:r>
     </w:p>
     <w:p>
@@ -10749,7 +10749,7 @@
           <w:rFonts w:ascii="Times New Roman" w:hAnsi="Times New Roman" w:cs="Times New Roman" w:eastAsia="Times New Roman"/>
           <w:sz w:val="28"/>
         </w:rPr>
-        <w:t>В соответствии с задачами настоящего исследования и материалами, собранными в ходе производственной практики (преддипломной) на ООО «Фаст Инжиниринг», во второй главе работы получены следующие основные результаты.</w:t>
+        <w:t>По задачам настоящего исследования и материалам производственной практики (преддипломной) на ООО «Фаст Инжиниринг» во второй главе работы получены следующие основные результаты.</w:t>
       </w:r>
     </w:p>
     <w:p>
@@ -10805,7 +10805,7 @@
           <w:rFonts w:ascii="Times New Roman" w:hAnsi="Times New Roman" w:cs="Times New Roman" w:eastAsia="Times New Roman"/>
           <w:sz w:val="28"/>
         </w:rPr>
-        <w:t>В обобщённом виде соответствие задач индивидуального задания на производственную практику (преддипломную) и параграфов второй главы дипломной работы представлено в таблице 2.8.</w:t>
+        <w:t>Сводное соответствие задач индивидуального задания на производственную практику (преддипломную) и параграфов второй главы дипломной работы приведено в таблице 2.8.</w:t>
       </w:r>
     </w:p>
     <w:p>
@@ -11452,7 +11452,7 @@
           <w:rFonts w:ascii="Times New Roman" w:hAnsi="Times New Roman" w:cs="Times New Roman" w:eastAsia="Times New Roman"/>
           <w:sz w:val="28"/>
         </w:rPr>
-        <w:t>Направление 6. Внедрение CRM-системы и сквозной аналитики. Включает внедрение CRM-системы (например, «Битрикс24», «АмоCRM») для учёта обращений, лидов, сделок и связи их с источниками привлечения; настройку базовой сквозной аналитики на стыке «Яндекс Метрика — CRM»; ежемесячный отчёт о движении лидов по каналам. Цель направления — обеспечить возможность раздельной оценки эффективности рекламных каналов и принятия управленческих решений на основании достоверных данных, а не интуиции.</w:t>
+        <w:t>Направление 6. Внедрение CRM-системы и сквозной аналитики. Включает внедрение CRM-системы (например, «Битрикс24», «АмоCRM») для учёта обращений, лидов, сделок и связи их с источниками привлечения; настройку базовой сквозной аналитики на стыке «Яндекс Метрика — CRM»; ежемесячный отчёт о движении лидов по каналам. Цель направления — обеспечить раздельную оценку эффективности рекламных каналов и принимать управленческие решения по проверенным данным, а не по интуиции.</w:t>
       </w:r>
     </w:p>
     <w:p>
@@ -15755,7 +15755,7 @@
           <w:rFonts w:ascii="Times New Roman" w:hAnsi="Times New Roman" w:cs="Times New Roman" w:eastAsia="Times New Roman"/>
           <w:sz w:val="28"/>
         </w:rPr>
-        <w:t>Таким образом, в реалистическом сценарии предложенный медиаплан окупается на горизонте 18–24 месяцев, что для B2B-сегмента инжиниринговой продукции с длительным циклом сделки является приемлемым показателем. В пессимистическом сценарии медиаплан возвращает существенную долю инвестиций, но не выходит на положительный финансовый результат и требует пересмотра отдельных составляющих. В оптимистическом сценарии происходит многократное превышение результата над затратами, что соответствует кратному росту выручки предприятия по сравнению с уровнем 2022–2023 гг.</w:t>
+        <w:t>В реалистическом сценарии предложенный медиаплан окупается на горизонте 18–24 месяцев, что для B2B-сегмента инжиниринговой продукции с длительным циклом сделки является приемлемым показателем. В пессимистическом сценарии медиаплан возвращает существенную долю инвестиций, но не выходит на положительный финансовый результат и требует пересмотра отдельных составляющих. В оптимистическом сценарии происходит многократное превышение результата над затратами, что соответствует кратному росту выручки предприятия по сравнению с уровнем 2022–2023 гг.</w:t>
       </w:r>
     </w:p>
     <w:p>
@@ -16592,7 +16592,7 @@
           <w:rFonts w:ascii="Times New Roman" w:hAnsi="Times New Roman" w:cs="Times New Roman" w:eastAsia="Times New Roman"/>
           <w:sz w:val="28"/>
         </w:rPr>
-        <w:t>• должна сопровождаться обязательной маркировкой «Реклама» с указанием рекламодателя при размещении в интернете в соответствии с требованиями к маркировке интернет-рекламы и сопутствующей передачей данных в Единый реестр интернет-рекламы (ЕРИР) через одного из ОРД;</w:t>
+        <w:t>• должна сопровождаться обязательной маркировкой «Реклама» с указанием рекламодателя при размещении в интернете по требованиям к маркировке интернет-рекламы, с передачей данных в Единый реестр интернет-рекламы (ЕРИР) через одного из ОРД;</w:t>
       </w:r>
     </w:p>
     <w:p>

</xml_diff>